<commit_message>
Update forum programme to final version
Full speaker line-ups per the latest programme docx: opening ceremony now
lists 8 speakers, each panel lists 4 speakers with their talk topics, and
the awarding of sponsors/partners and supporters is shown. Moderators for
all three panels added (incl. Ziya Hacılı for panel 3).

Assets bumped to style v18 / i18n v6.

Co-Authored-By: Claude Opus 4.8 <noreply@anthropic.com>
</commit_message>
<xml_diff>
--- a/site/assets/docs/agro-forum-3-program.docx
+++ b/site/assets/docs/agro-forum-3-program.docx
@@ -1,10 +1,10 @@
 
 <file path=word/document.xml><?xml version="1.0" encoding="utf-8"?>
-<w:document xmlns:wpc="http://schemas.microsoft.com/office/word/2010/wordprocessingCanvas" xmlns:cx="http://schemas.microsoft.com/office/drawing/2014/chartex" xmlns:cx1="http://schemas.microsoft.com/office/drawing/2015/9/8/chartex" xmlns:cx2="http://schemas.microsoft.com/office/drawing/2015/10/21/chartex" xmlns:cx3="http://schemas.microsoft.com/office/drawing/2016/5/9/chartex" xmlns:cx4="http://schemas.microsoft.com/office/drawing/2016/5/10/chartex" xmlns:cx5="http://schemas.microsoft.com/office/drawing/2016/5/11/chartex" xmlns:cx6="http://schemas.microsoft.com/office/drawing/2016/5/12/chartex" xmlns:cx7="http://schemas.microsoft.com/office/drawing/2016/5/13/chartex" xmlns:cx8="http://schemas.microsoft.com/office/drawing/2016/5/14/chartex" xmlns:mc="http://schemas.openxmlformats.org/markup-compatibility/2006" xmlns:m="http://schemas.openxmlformats.org/officeDocument/2006/math" xmlns:aink="http://schemas.microsoft.com/office/drawing/2016/ink" xmlns:am3d="http://schemas.microsoft.com/office/drawing/2017/model3d" xmlns:oel="http://schemas.microsoft.com/office/2019/extlst" xmlns:r="http://schemas.openxmlformats.org/officeDocument/2006/relationships" xmlns:wp14="http://schemas.microsoft.com/office/word/2010/wordprocessingDrawing" xmlns:wp="http://schemas.openxmlformats.org/drawingml/2006/wordprocessingDrawing" xmlns:wpg="http://schemas.microsoft.com/office/word/2010/wordprocessingGroup" xmlns:wpi="http://schemas.microsoft.com/office/word/2010/wordprocessingInk" xmlns:wps="http://schemas.microsoft.com/office/word/2010/wordprocessingShape" xmlns:o="urn:schemas-microsoft-com:office:office" xmlns:v="urn:schemas-microsoft-com:vml" xmlns:w10="urn:schemas-microsoft-com:office:word" xmlns:w="http://schemas.openxmlformats.org/wordprocessingml/2006/main" xmlns:w14="http://schemas.microsoft.com/office/word/2010/wordml" xmlns:w15="http://schemas.microsoft.com/office/word/2012/wordml" xmlns:w16cex="http://schemas.microsoft.com/office/word/2018/wordml/cex" xmlns:w16cid="http://schemas.microsoft.com/office/word/2016/wordml/cid" xmlns:w16="http://schemas.microsoft.com/office/word/2018/wordml" xmlns:w16sdtdh="http://schemas.microsoft.com/office/word/2020/wordml/sdtdatahash" xmlns:w16sdtfl="http://schemas.microsoft.com/office/word/2024/wordml/sdtformatlock" xmlns:w16se="http://schemas.microsoft.com/office/word/2015/wordml/symex" xmlns:w16du="http://schemas.microsoft.com/office/word/2023/wordml/word16du" xmlns:wne="http://schemas.microsoft.com/office/word/2006/wordml" mc:Ignorable="w14 w15 w16se w16cid w16 w16cex w16sdtdh w16sdtfl w16du wp14">
+<w:document xmlns:wpc="http://schemas.microsoft.com/office/word/2010/wordprocessingCanvas" xmlns:cx="http://schemas.microsoft.com/office/drawing/2014/chartex" xmlns:mc="http://schemas.openxmlformats.org/markup-compatibility/2006" xmlns:o="urn:schemas-microsoft-com:office:office" xmlns:r="http://schemas.openxmlformats.org/officeDocument/2006/relationships" xmlns:m="http://schemas.openxmlformats.org/officeDocument/2006/math" xmlns:v="urn:schemas-microsoft-com:vml" xmlns:wp14="http://schemas.microsoft.com/office/word/2010/wordprocessingDrawing" xmlns:wp="http://schemas.openxmlformats.org/drawingml/2006/wordprocessingDrawing" xmlns:w10="urn:schemas-microsoft-com:office:word" xmlns:w="http://schemas.openxmlformats.org/wordprocessingml/2006/main" xmlns:w14="http://schemas.microsoft.com/office/word/2010/wordml" xmlns:w15="http://schemas.microsoft.com/office/word/2012/wordml" xmlns:w16se="http://schemas.microsoft.com/office/word/2015/wordml/symex" xmlns:wpg="http://schemas.microsoft.com/office/word/2010/wordprocessingGroup" xmlns:wpi="http://schemas.microsoft.com/office/word/2010/wordprocessingInk" xmlns:wne="http://schemas.microsoft.com/office/word/2006/wordml" xmlns:wps="http://schemas.microsoft.com/office/word/2010/wordprocessingShape" mc:Ignorable="w14 w15 w16se wp14">
   <w:body>
     <w:p>
       <w:pPr>
-        <w:pStyle w:val="KonuBal"/>
+        <w:pStyle w:val="a3"/>
         <w:spacing w:after="100"/>
         <w:jc w:val="center"/>
         <w:rPr>
@@ -83,7 +83,7 @@
     </w:p>
     <w:p>
       <w:pPr>
-        <w:pStyle w:val="KonuBal"/>
+        <w:pStyle w:val="a3"/>
         <w:spacing w:after="100"/>
         <w:jc w:val="center"/>
         <w:rPr>
@@ -102,10 +102,14 @@
           <w:sz w:val="22"/>
           <w:szCs w:val="22"/>
         </w:rPr>
-        <w:t xml:space="preserve">3-cü </w:t>
-      </w:r>
-      <w:proofErr w:type="spellStart"/>
-      <w:r>
+        <w:t xml:space="preserve">3-cü Beynəlxalq Aqrar Biznes Forum </w:t>
+      </w:r>
+    </w:p>
+    <w:p>
+      <w:pPr>
+        <w:pStyle w:val="a3"/>
+        <w:spacing w:after="100"/>
+        <w:jc w:val="center"/>
         <w:rPr>
           <w:rFonts w:ascii="Tahoma" w:hAnsi="Tahoma" w:cs="Tahoma"/>
           <w:b/>
@@ -113,10 +117,13 @@
           <w:sz w:val="22"/>
           <w:szCs w:val="22"/>
         </w:rPr>
-        <w:t>Beynəlxalq</w:t>
-      </w:r>
-      <w:proofErr w:type="spellEnd"/>
-      <w:r>
+      </w:pPr>
+    </w:p>
+    <w:p>
+      <w:pPr>
+        <w:pStyle w:val="a3"/>
+        <w:spacing w:after="100"/>
+        <w:jc w:val="center"/>
         <w:rPr>
           <w:rFonts w:ascii="Tahoma" w:hAnsi="Tahoma" w:cs="Tahoma"/>
           <w:b/>
@@ -124,9 +131,7 @@
           <w:sz w:val="22"/>
           <w:szCs w:val="22"/>
         </w:rPr>
-        <w:t xml:space="preserve"> </w:t>
-      </w:r>
-      <w:proofErr w:type="spellStart"/>
+      </w:pPr>
       <w:r>
         <w:rPr>
           <w:rFonts w:ascii="Tahoma" w:hAnsi="Tahoma" w:cs="Tahoma"/>
@@ -135,10 +140,14 @@
           <w:sz w:val="22"/>
           <w:szCs w:val="22"/>
         </w:rPr>
-        <w:t>Aqrar</w:t>
-      </w:r>
-      <w:proofErr w:type="spellEnd"/>
-      <w:r>
+        <w:t>9 oktyabr 2026</w:t>
+      </w:r>
+    </w:p>
+    <w:p>
+      <w:pPr>
+        <w:pStyle w:val="a3"/>
+        <w:spacing w:after="100"/>
+        <w:jc w:val="center"/>
         <w:rPr>
           <w:rFonts w:ascii="Tahoma" w:hAnsi="Tahoma" w:cs="Tahoma"/>
           <w:b/>
@@ -146,9 +155,7 @@
           <w:sz w:val="22"/>
           <w:szCs w:val="22"/>
         </w:rPr>
-        <w:t xml:space="preserve"> </w:t>
-      </w:r>
-      <w:proofErr w:type="spellStart"/>
+      </w:pPr>
       <w:r>
         <w:rPr>
           <w:rFonts w:ascii="Tahoma" w:hAnsi="Tahoma" w:cs="Tahoma"/>
@@ -157,10 +164,13 @@
           <w:sz w:val="22"/>
           <w:szCs w:val="22"/>
         </w:rPr>
-        <w:t>Biznes</w:t>
-      </w:r>
-      <w:proofErr w:type="spellEnd"/>
-      <w:r>
+        <w:t>TƏDBİRİN PROQRAMI</w:t>
+      </w:r>
+    </w:p>
+    <w:p>
+      <w:pPr>
+        <w:pStyle w:val="a3"/>
+        <w:spacing w:after="100"/>
         <w:rPr>
           <w:rFonts w:ascii="Tahoma" w:hAnsi="Tahoma" w:cs="Tahoma"/>
           <w:b/>
@@ -168,109 +178,11 @@
           <w:sz w:val="22"/>
           <w:szCs w:val="22"/>
         </w:rPr>
-        <w:t xml:space="preserve"> Forum </w:t>
-      </w:r>
+      </w:pPr>
     </w:p>
     <w:p>
       <w:pPr>
-        <w:pStyle w:val="KonuBal"/>
-        <w:spacing w:after="100"/>
-        <w:jc w:val="center"/>
-        <w:rPr>
-          <w:rFonts w:ascii="Tahoma" w:hAnsi="Tahoma" w:cs="Tahoma"/>
-          <w:b/>
-          <w:bCs/>
-          <w:sz w:val="22"/>
-          <w:szCs w:val="22"/>
-        </w:rPr>
-      </w:pPr>
-    </w:p>
-    <w:p>
-      <w:pPr>
-        <w:pStyle w:val="KonuBal"/>
-        <w:spacing w:after="100"/>
-        <w:jc w:val="center"/>
-        <w:rPr>
-          <w:rFonts w:ascii="Tahoma" w:hAnsi="Tahoma" w:cs="Tahoma"/>
-          <w:b/>
-          <w:bCs/>
-          <w:sz w:val="22"/>
-          <w:szCs w:val="22"/>
-        </w:rPr>
-      </w:pPr>
-      <w:r>
-        <w:rPr>
-          <w:rFonts w:ascii="Tahoma" w:hAnsi="Tahoma" w:cs="Tahoma"/>
-          <w:b/>
-          <w:bCs/>
-          <w:sz w:val="22"/>
-          <w:szCs w:val="22"/>
-        </w:rPr>
-        <w:t xml:space="preserve">9 </w:t>
-      </w:r>
-      <w:proofErr w:type="spellStart"/>
-      <w:r>
-        <w:rPr>
-          <w:rFonts w:ascii="Tahoma" w:hAnsi="Tahoma" w:cs="Tahoma"/>
-          <w:b/>
-          <w:bCs/>
-          <w:sz w:val="22"/>
-          <w:szCs w:val="22"/>
-        </w:rPr>
-        <w:t>oktyabr</w:t>
-      </w:r>
-      <w:proofErr w:type="spellEnd"/>
-      <w:r>
-        <w:rPr>
-          <w:rFonts w:ascii="Tahoma" w:hAnsi="Tahoma" w:cs="Tahoma"/>
-          <w:b/>
-          <w:bCs/>
-          <w:sz w:val="22"/>
-          <w:szCs w:val="22"/>
-        </w:rPr>
-        <w:t xml:space="preserve"> 2026</w:t>
-      </w:r>
-    </w:p>
-    <w:p>
-      <w:pPr>
-        <w:pStyle w:val="KonuBal"/>
-        <w:spacing w:after="100"/>
-        <w:jc w:val="center"/>
-        <w:rPr>
-          <w:rFonts w:ascii="Tahoma" w:hAnsi="Tahoma" w:cs="Tahoma"/>
-          <w:b/>
-          <w:bCs/>
-          <w:sz w:val="22"/>
-          <w:szCs w:val="22"/>
-        </w:rPr>
-      </w:pPr>
-      <w:r>
-        <w:rPr>
-          <w:rFonts w:ascii="Tahoma" w:hAnsi="Tahoma" w:cs="Tahoma"/>
-          <w:b/>
-          <w:bCs/>
-          <w:sz w:val="22"/>
-          <w:szCs w:val="22"/>
-        </w:rPr>
-        <w:t>TƏDBİRİN PROQRAMI</w:t>
-      </w:r>
-    </w:p>
-    <w:p>
-      <w:pPr>
-        <w:pStyle w:val="KonuBal"/>
-        <w:spacing w:after="100"/>
-        <w:rPr>
-          <w:rFonts w:ascii="Tahoma" w:hAnsi="Tahoma" w:cs="Tahoma"/>
-          <w:b/>
-          <w:bCs/>
-          <w:sz w:val="22"/>
-          <w:szCs w:val="22"/>
-        </w:rPr>
-      </w:pPr>
-    </w:p>
-    <w:p>
-      <w:pPr>
-        <w:pStyle w:val="KonuBal"/>
+        <w:pStyle w:val="a3"/>
         <w:numPr>
           <w:ilvl w:val="0"/>
           <w:numId w:val="6"/>
@@ -295,9 +207,8 @@
           <w:sz w:val="22"/>
           <w:szCs w:val="22"/>
         </w:rPr>
-        <w:t xml:space="preserve">09`00-10`00 – </w:t>
-      </w:r>
-      <w:proofErr w:type="spellStart"/>
+        <w:t>09`00-10`00 – Qeydiyyat, qonaqların məkana gəlişi</w:t>
+      </w:r>
       <w:r>
         <w:rPr>
           <w:rFonts w:ascii="Tahoma" w:hAnsi="Tahoma" w:cs="Tahoma"/>
@@ -307,133 +218,12 @@
           <w:sz w:val="22"/>
           <w:szCs w:val="22"/>
         </w:rPr>
-        <w:t>Qeydiyyat</w:t>
-      </w:r>
-      <w:proofErr w:type="spellEnd"/>
-      <w:r>
-        <w:rPr>
-          <w:rFonts w:ascii="Tahoma" w:hAnsi="Tahoma" w:cs="Tahoma"/>
-          <w:b/>
-          <w:bCs/>
-          <w:color w:val="538135" w:themeColor="accent6" w:themeShade="BF"/>
-          <w:sz w:val="22"/>
-          <w:szCs w:val="22"/>
-        </w:rPr>
-        <w:t xml:space="preserve">, </w:t>
-      </w:r>
-      <w:proofErr w:type="spellStart"/>
-      <w:r>
-        <w:rPr>
-          <w:rFonts w:ascii="Tahoma" w:hAnsi="Tahoma" w:cs="Tahoma"/>
-          <w:b/>
-          <w:bCs/>
-          <w:color w:val="538135" w:themeColor="accent6" w:themeShade="BF"/>
-          <w:sz w:val="22"/>
-          <w:szCs w:val="22"/>
-        </w:rPr>
-        <w:t>qonaqların</w:t>
-      </w:r>
-      <w:proofErr w:type="spellEnd"/>
-      <w:r>
-        <w:rPr>
-          <w:rFonts w:ascii="Tahoma" w:hAnsi="Tahoma" w:cs="Tahoma"/>
-          <w:b/>
-          <w:bCs/>
-          <w:color w:val="538135" w:themeColor="accent6" w:themeShade="BF"/>
-          <w:sz w:val="22"/>
-          <w:szCs w:val="22"/>
-        </w:rPr>
-        <w:t xml:space="preserve"> </w:t>
-      </w:r>
-      <w:proofErr w:type="spellStart"/>
-      <w:r>
-        <w:rPr>
-          <w:rFonts w:ascii="Tahoma" w:hAnsi="Tahoma" w:cs="Tahoma"/>
-          <w:b/>
-          <w:bCs/>
-          <w:color w:val="538135" w:themeColor="accent6" w:themeShade="BF"/>
-          <w:sz w:val="22"/>
-          <w:szCs w:val="22"/>
-        </w:rPr>
-        <w:t>məkana</w:t>
-      </w:r>
-      <w:proofErr w:type="spellEnd"/>
-      <w:r>
-        <w:rPr>
-          <w:rFonts w:ascii="Tahoma" w:hAnsi="Tahoma" w:cs="Tahoma"/>
-          <w:b/>
-          <w:bCs/>
-          <w:color w:val="538135" w:themeColor="accent6" w:themeShade="BF"/>
-          <w:sz w:val="22"/>
-          <w:szCs w:val="22"/>
-        </w:rPr>
-        <w:t xml:space="preserve"> </w:t>
-      </w:r>
-      <w:proofErr w:type="spellStart"/>
-      <w:r>
-        <w:rPr>
-          <w:rFonts w:ascii="Tahoma" w:hAnsi="Tahoma" w:cs="Tahoma"/>
-          <w:b/>
-          <w:bCs/>
-          <w:color w:val="538135" w:themeColor="accent6" w:themeShade="BF"/>
-          <w:sz w:val="22"/>
-          <w:szCs w:val="22"/>
-        </w:rPr>
-        <w:t>gəlişi</w:t>
-      </w:r>
-      <w:proofErr w:type="spellEnd"/>
-      <w:r>
-        <w:rPr>
-          <w:rFonts w:ascii="Tahoma" w:hAnsi="Tahoma" w:cs="Tahoma"/>
-          <w:b/>
-          <w:bCs/>
-          <w:color w:val="538135" w:themeColor="accent6" w:themeShade="BF"/>
-          <w:sz w:val="22"/>
-          <w:szCs w:val="22"/>
-        </w:rPr>
-        <w:t xml:space="preserve">, </w:t>
-      </w:r>
-      <w:proofErr w:type="spellStart"/>
-      <w:r>
-        <w:rPr>
-          <w:rFonts w:ascii="Tahoma" w:hAnsi="Tahoma" w:cs="Tahoma"/>
-          <w:b/>
-          <w:bCs/>
-          <w:color w:val="538135" w:themeColor="accent6" w:themeShade="BF"/>
-          <w:sz w:val="22"/>
-          <w:szCs w:val="22"/>
-        </w:rPr>
-        <w:t>çay-kofe</w:t>
-      </w:r>
-      <w:proofErr w:type="spellEnd"/>
-      <w:r>
-        <w:rPr>
-          <w:rFonts w:ascii="Tahoma" w:hAnsi="Tahoma" w:cs="Tahoma"/>
-          <w:b/>
-          <w:bCs/>
-          <w:color w:val="538135" w:themeColor="accent6" w:themeShade="BF"/>
-          <w:sz w:val="22"/>
-          <w:szCs w:val="22"/>
-        </w:rPr>
-        <w:t xml:space="preserve"> </w:t>
-      </w:r>
-      <w:proofErr w:type="spellStart"/>
-      <w:r>
-        <w:rPr>
-          <w:rFonts w:ascii="Tahoma" w:hAnsi="Tahoma" w:cs="Tahoma"/>
-          <w:b/>
-          <w:bCs/>
-          <w:color w:val="538135" w:themeColor="accent6" w:themeShade="BF"/>
-          <w:sz w:val="22"/>
-          <w:szCs w:val="22"/>
-        </w:rPr>
-        <w:t>ikramı</w:t>
-      </w:r>
-      <w:proofErr w:type="spellEnd"/>
+        <w:t>, çay-kofe ikramı</w:t>
+      </w:r>
     </w:p>
     <w:p>
       <w:pPr>
-        <w:pStyle w:val="KonuBal"/>
+        <w:pStyle w:val="a3"/>
         <w:numPr>
           <w:ilvl w:val="0"/>
           <w:numId w:val="6"/>
@@ -458,9 +248,8 @@
           <w:sz w:val="22"/>
           <w:szCs w:val="22"/>
         </w:rPr>
-        <w:t xml:space="preserve">10`00-11`00- </w:t>
-      </w:r>
-      <w:proofErr w:type="spellStart"/>
+        <w:t>10`00-11`00</w:t>
+      </w:r>
       <w:r>
         <w:rPr>
           <w:rFonts w:ascii="Tahoma" w:hAnsi="Tahoma" w:cs="Tahoma"/>
@@ -470,9 +259,8 @@
           <w:sz w:val="22"/>
           <w:szCs w:val="22"/>
         </w:rPr>
-        <w:t>Rəsmi</w:t>
-      </w:r>
-      <w:proofErr w:type="spellEnd"/>
+        <w:t xml:space="preserve"> </w:t>
+      </w:r>
       <w:r>
         <w:rPr>
           <w:rFonts w:ascii="Tahoma" w:hAnsi="Tahoma" w:cs="Tahoma"/>
@@ -482,60 +270,12 @@
           <w:sz w:val="22"/>
           <w:szCs w:val="22"/>
         </w:rPr>
-        <w:t xml:space="preserve"> </w:t>
-      </w:r>
-      <w:proofErr w:type="spellStart"/>
-      <w:r>
-        <w:rPr>
-          <w:rFonts w:ascii="Tahoma" w:hAnsi="Tahoma" w:cs="Tahoma"/>
-          <w:b/>
-          <w:bCs/>
-          <w:color w:val="538135" w:themeColor="accent6" w:themeShade="BF"/>
-          <w:sz w:val="22"/>
-          <w:szCs w:val="22"/>
-        </w:rPr>
-        <w:t>açılış</w:t>
-      </w:r>
-      <w:proofErr w:type="spellEnd"/>
-      <w:r>
-        <w:rPr>
-          <w:rFonts w:ascii="Tahoma" w:hAnsi="Tahoma" w:cs="Tahoma"/>
-          <w:b/>
-          <w:bCs/>
-          <w:color w:val="538135" w:themeColor="accent6" w:themeShade="BF"/>
-          <w:sz w:val="22"/>
-          <w:szCs w:val="22"/>
-        </w:rPr>
-        <w:t xml:space="preserve"> </w:t>
-      </w:r>
-      <w:proofErr w:type="spellStart"/>
-      <w:r>
-        <w:rPr>
-          <w:rFonts w:ascii="Tahoma" w:hAnsi="Tahoma" w:cs="Tahoma"/>
-          <w:b/>
-          <w:bCs/>
-          <w:color w:val="538135" w:themeColor="accent6" w:themeShade="BF"/>
-          <w:sz w:val="22"/>
-          <w:szCs w:val="22"/>
-        </w:rPr>
-        <w:t>mərasimi</w:t>
-      </w:r>
-      <w:proofErr w:type="spellEnd"/>
-      <w:r>
-        <w:rPr>
-          <w:rFonts w:ascii="Tahoma" w:hAnsi="Tahoma" w:cs="Tahoma"/>
-          <w:b/>
-          <w:bCs/>
-          <w:color w:val="538135" w:themeColor="accent6" w:themeShade="BF"/>
-          <w:sz w:val="22"/>
-          <w:szCs w:val="22"/>
-        </w:rPr>
-        <w:t xml:space="preserve"> </w:t>
+        <w:t xml:space="preserve">- Rəsmi açılış mərasimi </w:t>
       </w:r>
     </w:p>
     <w:p>
       <w:pPr>
-        <w:pStyle w:val="KonuBal"/>
+        <w:pStyle w:val="a3"/>
         <w:spacing w:after="100"/>
         <w:ind w:left="426"/>
         <w:rPr>
@@ -544,41 +284,13 @@
           <w:szCs w:val="22"/>
         </w:rPr>
       </w:pPr>
-      <w:proofErr w:type="spellStart"/>
-      <w:r>
-        <w:rPr>
-          <w:rFonts w:ascii="Tahoma" w:hAnsi="Tahoma" w:cs="Tahoma"/>
-          <w:sz w:val="22"/>
-          <w:szCs w:val="22"/>
-        </w:rPr>
-        <w:t>Açılış</w:t>
-      </w:r>
-      <w:proofErr w:type="spellEnd"/>
-      <w:r>
-        <w:rPr>
-          <w:rFonts w:ascii="Tahoma" w:hAnsi="Tahoma" w:cs="Tahoma"/>
-          <w:sz w:val="22"/>
-          <w:szCs w:val="22"/>
-        </w:rPr>
-        <w:t xml:space="preserve"> </w:t>
-      </w:r>
-      <w:proofErr w:type="spellStart"/>
-      <w:r>
-        <w:rPr>
-          <w:rFonts w:ascii="Tahoma" w:hAnsi="Tahoma" w:cs="Tahoma"/>
-          <w:sz w:val="22"/>
-          <w:szCs w:val="22"/>
-        </w:rPr>
-        <w:t>nitqi</w:t>
-      </w:r>
-      <w:proofErr w:type="spellEnd"/>
-      <w:r>
-        <w:rPr>
-          <w:rFonts w:ascii="Tahoma" w:hAnsi="Tahoma" w:cs="Tahoma"/>
-          <w:sz w:val="22"/>
-          <w:szCs w:val="22"/>
-        </w:rPr>
-        <w:t xml:space="preserve">    </w:t>
+      <w:r>
+        <w:rPr>
+          <w:rFonts w:ascii="Tahoma" w:hAnsi="Tahoma" w:cs="Tahoma"/>
+          <w:sz w:val="22"/>
+          <w:szCs w:val="22"/>
+        </w:rPr>
+        <w:t xml:space="preserve">Açılış nitqi    </w:t>
       </w:r>
       <w:r>
         <w:rPr>
@@ -588,10 +300,14 @@
           <w:sz w:val="22"/>
           <w:szCs w:val="22"/>
         </w:rPr>
-        <w:t xml:space="preserve">Nigar </w:t>
-      </w:r>
-      <w:proofErr w:type="spellStart"/>
-      <w:r>
+        <w:t>Nigar Ələsgərova - Layihə rəhbəri, Biznes TV`nin Baş direktoru</w:t>
+      </w:r>
+    </w:p>
+    <w:p>
+      <w:pPr>
+        <w:pStyle w:val="a3"/>
+        <w:spacing w:after="100"/>
+        <w:ind w:left="426"/>
         <w:rPr>
           <w:rFonts w:ascii="Tahoma" w:hAnsi="Tahoma" w:cs="Tahoma"/>
           <w:i/>
@@ -599,9 +315,15 @@
           <w:sz w:val="22"/>
           <w:szCs w:val="22"/>
         </w:rPr>
-        <w:t>Ələsgərova</w:t>
-      </w:r>
-      <w:proofErr w:type="spellEnd"/>
+      </w:pPr>
+      <w:r>
+        <w:rPr>
+          <w:rFonts w:ascii="Tahoma" w:hAnsi="Tahoma" w:cs="Tahoma"/>
+          <w:sz w:val="22"/>
+          <w:szCs w:val="22"/>
+        </w:rPr>
+        <w:t xml:space="preserve">Çıxış 1         </w:t>
+      </w:r>
       <w:r>
         <w:rPr>
           <w:rFonts w:ascii="Tahoma" w:hAnsi="Tahoma" w:cs="Tahoma"/>
@@ -610,9 +332,8 @@
           <w:sz w:val="22"/>
           <w:szCs w:val="22"/>
         </w:rPr>
-        <w:t xml:space="preserve"> - </w:t>
-      </w:r>
-      <w:proofErr w:type="spellStart"/>
+        <w:t>Mürsəl Rüst</w:t>
+      </w:r>
       <w:r>
         <w:rPr>
           <w:rFonts w:ascii="Tahoma" w:hAnsi="Tahoma" w:cs="Tahoma"/>
@@ -621,10 +342,14 @@
           <w:sz w:val="22"/>
           <w:szCs w:val="22"/>
         </w:rPr>
-        <w:t>Layihə</w:t>
-      </w:r>
-      <w:proofErr w:type="spellEnd"/>
-      <w:r>
+        <w:t>əmov - ATİB İdarə Heyətinin sədri</w:t>
+      </w:r>
+    </w:p>
+    <w:p>
+      <w:pPr>
+        <w:pStyle w:val="a3"/>
+        <w:spacing w:after="100"/>
+        <w:ind w:left="426"/>
         <w:rPr>
           <w:rFonts w:ascii="Tahoma" w:hAnsi="Tahoma" w:cs="Tahoma"/>
           <w:i/>
@@ -632,9 +357,7 @@
           <w:sz w:val="22"/>
           <w:szCs w:val="22"/>
         </w:rPr>
-        <w:t xml:space="preserve"> </w:t>
-      </w:r>
-      <w:proofErr w:type="spellStart"/>
+      </w:pPr>
       <w:r>
         <w:rPr>
           <w:rFonts w:ascii="Tahoma" w:hAnsi="Tahoma" w:cs="Tahoma"/>
@@ -643,9 +366,8 @@
           <w:sz w:val="22"/>
           <w:szCs w:val="22"/>
         </w:rPr>
-        <w:t>rəhbəri</w:t>
-      </w:r>
-      <w:proofErr w:type="spellEnd"/>
+        <w:t xml:space="preserve">Çıxış 2         </w:t>
+      </w:r>
       <w:r>
         <w:rPr>
           <w:rFonts w:ascii="Tahoma" w:hAnsi="Tahoma" w:cs="Tahoma"/>
@@ -654,10 +376,13 @@
           <w:sz w:val="22"/>
           <w:szCs w:val="22"/>
         </w:rPr>
-        <w:t xml:space="preserve">, </w:t>
-      </w:r>
-      <w:proofErr w:type="spellStart"/>
-      <w:r>
+        <w:t>Prof.Dr.Birol Akgün  - Türkiyənin Azərbaycanda Fövqaladə və Səlahiyyətli səfiri</w:t>
+      </w:r>
+    </w:p>
+    <w:p>
+      <w:pPr>
+        <w:pStyle w:val="a3"/>
+        <w:spacing w:after="100"/>
         <w:rPr>
           <w:rFonts w:ascii="Tahoma" w:hAnsi="Tahoma" w:cs="Tahoma"/>
           <w:i/>
@@ -665,9 +390,7 @@
           <w:sz w:val="22"/>
           <w:szCs w:val="22"/>
         </w:rPr>
-        <w:t>Biznes</w:t>
-      </w:r>
-      <w:proofErr w:type="spellEnd"/>
+      </w:pPr>
       <w:r>
         <w:rPr>
           <w:rFonts w:ascii="Tahoma" w:hAnsi="Tahoma" w:cs="Tahoma"/>
@@ -676,9 +399,17 @@
           <w:sz w:val="22"/>
           <w:szCs w:val="22"/>
         </w:rPr>
-        <w:t xml:space="preserve"> </w:t>
-      </w:r>
-      <w:proofErr w:type="spellStart"/>
+        <w:t xml:space="preserve">      Çıxış 3         </w:t>
+      </w:r>
+      <w:r>
+        <w:rPr>
+          <w:rFonts w:ascii="Tahoma" w:hAnsi="Tahoma" w:cs="Tahoma"/>
+          <w:i/>
+          <w:sz w:val="22"/>
+          <w:szCs w:val="22"/>
+        </w:rPr>
+        <w:t xml:space="preserve">Yalçın Camalov - </w:t>
+      </w:r>
       <w:r>
         <w:rPr>
           <w:rFonts w:ascii="Tahoma" w:hAnsi="Tahoma" w:cs="Tahoma"/>
@@ -687,9 +418,8 @@
           <w:sz w:val="22"/>
           <w:szCs w:val="22"/>
         </w:rPr>
-        <w:t>TV`nin</w:t>
-      </w:r>
-      <w:proofErr w:type="spellEnd"/>
+        <w:t>Aqrar Kred</w:t>
+      </w:r>
       <w:r>
         <w:rPr>
           <w:rFonts w:ascii="Tahoma" w:hAnsi="Tahoma" w:cs="Tahoma"/>
@@ -698,9 +428,17 @@
           <w:sz w:val="22"/>
           <w:szCs w:val="22"/>
         </w:rPr>
-        <w:t xml:space="preserve"> Baş </w:t>
-      </w:r>
-      <w:proofErr w:type="spellStart"/>
+        <w:t>it və İnkişaf Agentliyinin sədri</w:t>
+      </w:r>
+    </w:p>
+    <w:p>
+      <w:pPr>
+        <w:rPr>
+          <w:rFonts w:ascii="Tahoma" w:hAnsi="Tahoma" w:cs="Tahoma"/>
+          <w:sz w:val="22"/>
+          <w:szCs w:val="22"/>
+        </w:rPr>
+      </w:pPr>
       <w:r>
         <w:rPr>
           <w:rFonts w:ascii="Tahoma" w:hAnsi="Tahoma" w:cs="Tahoma"/>
@@ -709,13 +447,279 @@
           <w:sz w:val="22"/>
           <w:szCs w:val="22"/>
         </w:rPr>
-        <w:t>direktoru</w:t>
-      </w:r>
-      <w:proofErr w:type="spellEnd"/>
+        <w:t xml:space="preserve">      </w:t>
+      </w:r>
+      <w:r>
+        <w:rPr>
+          <w:rFonts w:ascii="Tahoma" w:hAnsi="Tahoma" w:cs="Tahoma"/>
+          <w:i/>
+          <w:iCs/>
+          <w:sz w:val="22"/>
+          <w:szCs w:val="22"/>
+        </w:rPr>
+        <w:t>Çıxış 4</w:t>
+      </w:r>
+      <w:r>
+        <w:rPr>
+          <w:rFonts w:ascii="Tahoma" w:hAnsi="Tahoma" w:cs="Tahoma"/>
+          <w:i/>
+          <w:iCs/>
+          <w:sz w:val="22"/>
+          <w:szCs w:val="22"/>
+        </w:rPr>
+        <w:t xml:space="preserve">        Anar Cəfərov -  </w:t>
+      </w:r>
+      <w:r>
+        <w:rPr>
+          <w:rFonts w:ascii="Tahoma" w:hAnsi="Tahoma" w:cs="Tahoma"/>
+          <w:sz w:val="22"/>
+          <w:szCs w:val="22"/>
+        </w:rPr>
+        <w:t>Aqrar İnnovasiya Mərkəzi</w:t>
+      </w:r>
+      <w:r>
+        <w:rPr>
+          <w:rFonts w:ascii="Tahoma" w:hAnsi="Tahoma" w:cs="Tahoma"/>
+          <w:sz w:val="22"/>
+          <w:szCs w:val="22"/>
+        </w:rPr>
+        <w:t>nin</w:t>
+      </w:r>
+      <w:r>
+        <w:rPr>
+          <w:rFonts w:ascii="Tahoma" w:hAnsi="Tahoma" w:cs="Tahoma"/>
+          <w:sz w:val="22"/>
+          <w:szCs w:val="22"/>
+        </w:rPr>
+        <w:t xml:space="preserve"> rəhbəri</w:t>
+      </w:r>
     </w:p>
     <w:p>
       <w:pPr>
-        <w:pStyle w:val="KonuBal"/>
+        <w:pStyle w:val="a3"/>
+        <w:spacing w:after="100"/>
+        <w:rPr>
+          <w:rFonts w:ascii="Tahoma" w:hAnsi="Tahoma" w:cs="Tahoma"/>
+          <w:sz w:val="22"/>
+          <w:szCs w:val="22"/>
+        </w:rPr>
+      </w:pPr>
+      <w:r>
+        <w:rPr>
+          <w:rFonts w:ascii="Tahoma" w:hAnsi="Tahoma" w:cs="Tahoma"/>
+          <w:i/>
+          <w:iCs/>
+          <w:sz w:val="22"/>
+          <w:szCs w:val="22"/>
+        </w:rPr>
+        <w:t xml:space="preserve">      </w:t>
+      </w:r>
+      <w:r>
+        <w:rPr>
+          <w:rFonts w:ascii="Tahoma" w:hAnsi="Tahoma" w:cs="Tahoma"/>
+          <w:sz w:val="22"/>
+          <w:szCs w:val="22"/>
+        </w:rPr>
+        <w:t>Çıxış 5</w:t>
+      </w:r>
+      <w:r>
+        <w:rPr>
+          <w:rFonts w:ascii="Tahoma" w:hAnsi="Tahoma" w:cs="Tahoma"/>
+          <w:sz w:val="22"/>
+          <w:szCs w:val="22"/>
+        </w:rPr>
+        <w:t xml:space="preserve">        </w:t>
+      </w:r>
+      <w:r>
+        <w:rPr>
+          <w:rFonts w:ascii="Tahoma" w:hAnsi="Tahoma" w:cs="Tahoma"/>
+          <w:i/>
+          <w:iCs/>
+          <w:sz w:val="22"/>
+          <w:szCs w:val="22"/>
+        </w:rPr>
+        <w:t>Doğan Başaran – Türk Dünyası Tarım Birliyi-nin sədri</w:t>
+      </w:r>
+    </w:p>
+    <w:p>
+      <w:pPr>
+        <w:pStyle w:val="a3"/>
+        <w:spacing w:after="100"/>
+        <w:rPr>
+          <w:rFonts w:ascii="Tahoma" w:hAnsi="Tahoma" w:cs="Tahoma"/>
+          <w:i/>
+          <w:iCs/>
+          <w:sz w:val="22"/>
+          <w:szCs w:val="22"/>
+        </w:rPr>
+      </w:pPr>
+      <w:r>
+        <w:rPr>
+          <w:rFonts w:ascii="Tahoma" w:hAnsi="Tahoma" w:cs="Tahoma"/>
+          <w:i/>
+          <w:iCs/>
+          <w:sz w:val="22"/>
+          <w:szCs w:val="22"/>
+        </w:rPr>
+        <w:t xml:space="preserve">     Çıxış 6</w:t>
+      </w:r>
+      <w:r>
+        <w:rPr>
+          <w:rFonts w:ascii="Tahoma" w:hAnsi="Tahoma" w:cs="Tahoma"/>
+          <w:i/>
+          <w:iCs/>
+          <w:sz w:val="22"/>
+          <w:szCs w:val="22"/>
+        </w:rPr>
+        <w:t xml:space="preserve">       </w:t>
+      </w:r>
+      <w:r>
+        <w:rPr>
+          <w:rFonts w:ascii="Tahoma" w:hAnsi="Tahoma" w:cs="Tahoma"/>
+          <w:i/>
+          <w:iCs/>
+          <w:sz w:val="22"/>
+          <w:szCs w:val="22"/>
+        </w:rPr>
+        <w:t>Dr.</w:t>
+      </w:r>
+      <w:r>
+        <w:rPr>
+          <w:rFonts w:ascii="Tahoma" w:hAnsi="Tahoma" w:cs="Tahoma"/>
+          <w:i/>
+          <w:iCs/>
+          <w:sz w:val="22"/>
+          <w:szCs w:val="22"/>
+        </w:rPr>
+        <w:t xml:space="preserve">Selçuk Demir – “Ziraat Bank Azərbaycan” </w:t>
+      </w:r>
+      <w:r>
+        <w:rPr>
+          <w:rFonts w:ascii="Tahoma" w:hAnsi="Tahoma" w:cs="Tahoma"/>
+          <w:i/>
+          <w:iCs/>
+          <w:sz w:val="22"/>
+          <w:szCs w:val="22"/>
+        </w:rPr>
+        <w:t xml:space="preserve">ASC-nin </w:t>
+      </w:r>
+      <w:r>
+        <w:rPr>
+          <w:rFonts w:ascii="Tahoma" w:hAnsi="Tahoma" w:cs="Tahoma"/>
+          <w:i/>
+          <w:iCs/>
+          <w:sz w:val="22"/>
+          <w:szCs w:val="22"/>
+        </w:rPr>
+        <w:t>İdarə heyətinin sədri</w:t>
+      </w:r>
+    </w:p>
+    <w:p>
+      <w:pPr>
+        <w:pStyle w:val="a3"/>
+        <w:spacing w:after="100"/>
+        <w:rPr>
+          <w:rFonts w:ascii="Tahoma" w:hAnsi="Tahoma" w:cs="Tahoma"/>
+          <w:i/>
+          <w:iCs/>
+          <w:sz w:val="22"/>
+          <w:szCs w:val="22"/>
+        </w:rPr>
+      </w:pPr>
+      <w:r>
+        <w:rPr>
+          <w:rFonts w:ascii="Tahoma" w:hAnsi="Tahoma" w:cs="Tahoma"/>
+          <w:i/>
+          <w:iCs/>
+          <w:sz w:val="22"/>
+          <w:szCs w:val="22"/>
+        </w:rPr>
+        <w:t xml:space="preserve">    Çıxış 7</w:t>
+      </w:r>
+      <w:r>
+        <w:rPr>
+          <w:rFonts w:ascii="Tahoma" w:hAnsi="Tahoma" w:cs="Tahoma"/>
+          <w:i/>
+          <w:iCs/>
+          <w:sz w:val="22"/>
+          <w:szCs w:val="22"/>
+        </w:rPr>
+        <w:t xml:space="preserve">       Zaur </w:t>
+      </w:r>
+      <w:r>
+        <w:rPr>
+          <w:rFonts w:ascii="Tahoma" w:hAnsi="Tahoma" w:cs="Tahoma"/>
+          <w:i/>
+          <w:iCs/>
+          <w:sz w:val="22"/>
+          <w:szCs w:val="22"/>
+        </w:rPr>
+        <w:t>Kər</w:t>
+      </w:r>
+      <w:r>
+        <w:rPr>
+          <w:rFonts w:ascii="Tahoma" w:hAnsi="Tahoma" w:cs="Tahoma"/>
+          <w:i/>
+          <w:iCs/>
+          <w:sz w:val="22"/>
+          <w:szCs w:val="22"/>
+        </w:rPr>
+        <w:t>imov  -</w:t>
+      </w:r>
+      <w:r>
+        <w:rPr>
+          <w:rFonts w:ascii="Tahoma" w:hAnsi="Tahoma" w:cs="Tahoma"/>
+          <w:i/>
+          <w:iCs/>
+          <w:sz w:val="22"/>
+          <w:szCs w:val="22"/>
+        </w:rPr>
+        <w:t xml:space="preserve"> </w:t>
+      </w:r>
+      <w:r>
+        <w:rPr>
+          <w:rFonts w:ascii="Tahoma" w:hAnsi="Tahoma" w:cs="Tahoma"/>
+          <w:i/>
+          <w:iCs/>
+          <w:sz w:val="22"/>
+          <w:szCs w:val="22"/>
+        </w:rPr>
+        <w:t xml:space="preserve"> AmCham</w:t>
+      </w:r>
+      <w:r>
+        <w:rPr>
+          <w:rFonts w:ascii="Tahoma" w:hAnsi="Tahoma" w:cs="Tahoma"/>
+          <w:i/>
+          <w:iCs/>
+          <w:sz w:val="22"/>
+          <w:szCs w:val="22"/>
+        </w:rPr>
+        <w:t xml:space="preserve"> Azerbaijan-ın</w:t>
+      </w:r>
+      <w:r>
+        <w:rPr>
+          <w:rFonts w:ascii="Tahoma" w:hAnsi="Tahoma" w:cs="Tahoma"/>
+          <w:i/>
+          <w:iCs/>
+          <w:sz w:val="22"/>
+          <w:szCs w:val="22"/>
+        </w:rPr>
+        <w:t xml:space="preserve"> İcraçı direktor</w:t>
+      </w:r>
+      <w:r>
+        <w:rPr>
+          <w:rFonts w:ascii="Tahoma" w:hAnsi="Tahoma" w:cs="Tahoma"/>
+          <w:i/>
+          <w:iCs/>
+          <w:sz w:val="22"/>
+          <w:szCs w:val="22"/>
+        </w:rPr>
+        <w:t>u</w:t>
+      </w:r>
+    </w:p>
+    <w:p>
+      <w:pPr>
+        <w:pStyle w:val="a3"/>
         <w:spacing w:after="100"/>
         <w:ind w:left="426"/>
         <w:rPr>
@@ -726,26 +730,12 @@
           <w:szCs w:val="22"/>
         </w:rPr>
       </w:pPr>
-      <w:proofErr w:type="spellStart"/>
-      <w:r>
-        <w:rPr>
-          <w:rFonts w:ascii="Tahoma" w:hAnsi="Tahoma" w:cs="Tahoma"/>
-          <w:sz w:val="22"/>
-          <w:szCs w:val="22"/>
-        </w:rPr>
-        <w:t>Çıxış</w:t>
-      </w:r>
-      <w:proofErr w:type="spellEnd"/>
-      <w:r>
-        <w:rPr>
-          <w:rFonts w:ascii="Tahoma" w:hAnsi="Tahoma" w:cs="Tahoma"/>
-          <w:sz w:val="22"/>
-          <w:szCs w:val="22"/>
-        </w:rPr>
-        <w:t xml:space="preserve"> 1         </w:t>
-      </w:r>
-      <w:proofErr w:type="spellStart"/>
-      <w:r>
+    </w:p>
+    <w:p>
+      <w:pPr>
+        <w:pStyle w:val="a3"/>
+        <w:spacing w:after="100"/>
+        <w:ind w:left="426"/>
         <w:rPr>
           <w:rFonts w:ascii="Tahoma" w:hAnsi="Tahoma" w:cs="Tahoma"/>
           <w:i/>
@@ -753,9 +743,7 @@
           <w:sz w:val="22"/>
           <w:szCs w:val="22"/>
         </w:rPr>
-        <w:t>Mürsəl</w:t>
-      </w:r>
-      <w:proofErr w:type="spellEnd"/>
+      </w:pPr>
       <w:r>
         <w:rPr>
           <w:rFonts w:ascii="Tahoma" w:hAnsi="Tahoma" w:cs="Tahoma"/>
@@ -764,9 +752,8 @@
           <w:sz w:val="22"/>
           <w:szCs w:val="22"/>
         </w:rPr>
-        <w:t xml:space="preserve"> </w:t>
-      </w:r>
-      <w:proofErr w:type="spellStart"/>
+        <w:t>Sponsor və tərəfdaşların mükafa</w:t>
+      </w:r>
       <w:r>
         <w:rPr>
           <w:rFonts w:ascii="Tahoma" w:hAnsi="Tahoma" w:cs="Tahoma"/>
@@ -775,527 +762,12 @@
           <w:sz w:val="22"/>
           <w:szCs w:val="22"/>
         </w:rPr>
-        <w:t>Rüstəmov</w:t>
-      </w:r>
-      <w:proofErr w:type="spellEnd"/>
-      <w:r>
-        <w:rPr>
-          <w:rFonts w:ascii="Tahoma" w:hAnsi="Tahoma" w:cs="Tahoma"/>
-          <w:i/>
-          <w:iCs/>
-          <w:sz w:val="22"/>
-          <w:szCs w:val="22"/>
-        </w:rPr>
-        <w:t xml:space="preserve"> - ATİB </w:t>
-      </w:r>
-      <w:proofErr w:type="spellStart"/>
-      <w:r>
-        <w:rPr>
-          <w:rFonts w:ascii="Tahoma" w:hAnsi="Tahoma" w:cs="Tahoma"/>
-          <w:i/>
-          <w:iCs/>
-          <w:sz w:val="22"/>
-          <w:szCs w:val="22"/>
-        </w:rPr>
-        <w:t>İdarə</w:t>
-      </w:r>
-      <w:proofErr w:type="spellEnd"/>
-      <w:r>
-        <w:rPr>
-          <w:rFonts w:ascii="Tahoma" w:hAnsi="Tahoma" w:cs="Tahoma"/>
-          <w:i/>
-          <w:iCs/>
-          <w:sz w:val="22"/>
-          <w:szCs w:val="22"/>
-        </w:rPr>
-        <w:t xml:space="preserve"> </w:t>
-      </w:r>
-      <w:proofErr w:type="spellStart"/>
-      <w:r>
-        <w:rPr>
-          <w:rFonts w:ascii="Tahoma" w:hAnsi="Tahoma" w:cs="Tahoma"/>
-          <w:i/>
-          <w:iCs/>
-          <w:sz w:val="22"/>
-          <w:szCs w:val="22"/>
-        </w:rPr>
-        <w:t>Heyətinin</w:t>
-      </w:r>
-      <w:proofErr w:type="spellEnd"/>
-      <w:r>
-        <w:rPr>
-          <w:rFonts w:ascii="Tahoma" w:hAnsi="Tahoma" w:cs="Tahoma"/>
-          <w:i/>
-          <w:iCs/>
-          <w:sz w:val="22"/>
-          <w:szCs w:val="22"/>
-        </w:rPr>
-        <w:t xml:space="preserve"> </w:t>
-      </w:r>
-      <w:proofErr w:type="spellStart"/>
-      <w:r>
-        <w:rPr>
-          <w:rFonts w:ascii="Tahoma" w:hAnsi="Tahoma" w:cs="Tahoma"/>
-          <w:i/>
-          <w:iCs/>
-          <w:sz w:val="22"/>
-          <w:szCs w:val="22"/>
-        </w:rPr>
-        <w:t>üzvü</w:t>
-      </w:r>
-      <w:proofErr w:type="spellEnd"/>
+        <w:t xml:space="preserve">tlandırılması. </w:t>
+      </w:r>
     </w:p>
     <w:p>
       <w:pPr>
-        <w:pStyle w:val="KonuBal"/>
-        <w:spacing w:after="100"/>
-        <w:ind w:left="426"/>
-        <w:rPr>
-          <w:rFonts w:ascii="Tahoma" w:hAnsi="Tahoma" w:cs="Tahoma"/>
-          <w:sz w:val="22"/>
-          <w:szCs w:val="22"/>
-        </w:rPr>
-      </w:pPr>
-      <w:proofErr w:type="spellStart"/>
-      <w:r>
-        <w:rPr>
-          <w:rFonts w:ascii="Tahoma" w:hAnsi="Tahoma" w:cs="Tahoma"/>
-          <w:sz w:val="22"/>
-          <w:szCs w:val="22"/>
-        </w:rPr>
-        <w:t>Çıxış</w:t>
-      </w:r>
-      <w:proofErr w:type="spellEnd"/>
-      <w:r>
-        <w:rPr>
-          <w:rFonts w:ascii="Tahoma" w:hAnsi="Tahoma" w:cs="Tahoma"/>
-          <w:sz w:val="22"/>
-          <w:szCs w:val="22"/>
-        </w:rPr>
-        <w:t xml:space="preserve"> </w:t>
-      </w:r>
-      <w:r>
-        <w:rPr>
-          <w:rFonts w:ascii="Tahoma" w:hAnsi="Tahoma" w:cs="Tahoma"/>
-          <w:sz w:val="22"/>
-          <w:szCs w:val="22"/>
-        </w:rPr>
-        <w:t>2</w:t>
-      </w:r>
-      <w:r>
-        <w:rPr>
-          <w:rFonts w:ascii="Tahoma" w:hAnsi="Tahoma" w:cs="Tahoma"/>
-          <w:sz w:val="22"/>
-          <w:szCs w:val="22"/>
-        </w:rPr>
-        <w:t xml:space="preserve">              </w:t>
-      </w:r>
-      <w:r>
-        <w:rPr>
-          <w:rFonts w:ascii="Tahoma" w:hAnsi="Tahoma" w:cs="Tahoma"/>
-          <w:sz w:val="22"/>
-          <w:szCs w:val="22"/>
-        </w:rPr>
-        <w:t xml:space="preserve">                    </w:t>
-      </w:r>
-      <w:r>
-        <w:rPr>
-          <w:rFonts w:ascii="Tahoma" w:hAnsi="Tahoma" w:cs="Tahoma"/>
-          <w:i/>
-          <w:iCs/>
-          <w:sz w:val="22"/>
-          <w:szCs w:val="22"/>
-        </w:rPr>
-        <w:t xml:space="preserve">- AR </w:t>
-      </w:r>
-      <w:proofErr w:type="spellStart"/>
-      <w:r>
-        <w:rPr>
-          <w:rFonts w:ascii="Tahoma" w:hAnsi="Tahoma" w:cs="Tahoma"/>
-          <w:i/>
-          <w:iCs/>
-          <w:sz w:val="22"/>
-          <w:szCs w:val="22"/>
-        </w:rPr>
-        <w:t>Kənd</w:t>
-      </w:r>
-      <w:proofErr w:type="spellEnd"/>
-      <w:r>
-        <w:rPr>
-          <w:rFonts w:ascii="Tahoma" w:hAnsi="Tahoma" w:cs="Tahoma"/>
-          <w:i/>
-          <w:iCs/>
-          <w:sz w:val="22"/>
-          <w:szCs w:val="22"/>
-        </w:rPr>
-        <w:t xml:space="preserve"> </w:t>
-      </w:r>
-      <w:proofErr w:type="spellStart"/>
-      <w:r>
-        <w:rPr>
-          <w:rFonts w:ascii="Tahoma" w:hAnsi="Tahoma" w:cs="Tahoma"/>
-          <w:i/>
-          <w:iCs/>
-          <w:sz w:val="22"/>
-          <w:szCs w:val="22"/>
-        </w:rPr>
-        <w:t>Təsərrüfatı</w:t>
-      </w:r>
-      <w:proofErr w:type="spellEnd"/>
-      <w:r>
-        <w:rPr>
-          <w:rFonts w:ascii="Tahoma" w:hAnsi="Tahoma" w:cs="Tahoma"/>
-          <w:i/>
-          <w:iCs/>
-          <w:sz w:val="22"/>
-          <w:szCs w:val="22"/>
-        </w:rPr>
-        <w:t xml:space="preserve"> </w:t>
-      </w:r>
-      <w:proofErr w:type="spellStart"/>
-      <w:r>
-        <w:rPr>
-          <w:rFonts w:ascii="Tahoma" w:hAnsi="Tahoma" w:cs="Tahoma"/>
-          <w:i/>
-          <w:iCs/>
-          <w:sz w:val="22"/>
-          <w:szCs w:val="22"/>
-        </w:rPr>
-        <w:t>Nazirliyi</w:t>
-      </w:r>
-      <w:proofErr w:type="spellEnd"/>
-      <w:r>
-        <w:rPr>
-          <w:rFonts w:ascii="Tahoma" w:hAnsi="Tahoma" w:cs="Tahoma"/>
-          <w:sz w:val="22"/>
-          <w:szCs w:val="22"/>
-        </w:rPr>
-        <w:t xml:space="preserve"> </w:t>
-      </w:r>
-    </w:p>
-    <w:p>
-      <w:pPr>
-        <w:pStyle w:val="KonuBal"/>
-        <w:spacing w:after="100"/>
-        <w:ind w:left="426"/>
-        <w:rPr>
-          <w:rFonts w:ascii="Tahoma" w:hAnsi="Tahoma" w:cs="Tahoma"/>
-          <w:i/>
-          <w:iCs/>
-          <w:sz w:val="22"/>
-          <w:szCs w:val="22"/>
-        </w:rPr>
-      </w:pPr>
-      <w:proofErr w:type="spellStart"/>
-      <w:r>
-        <w:rPr>
-          <w:rFonts w:ascii="Tahoma" w:hAnsi="Tahoma" w:cs="Tahoma"/>
-          <w:sz w:val="22"/>
-          <w:szCs w:val="22"/>
-        </w:rPr>
-        <w:t>Çıxış</w:t>
-      </w:r>
-      <w:proofErr w:type="spellEnd"/>
-      <w:r>
-        <w:rPr>
-          <w:rFonts w:ascii="Tahoma" w:hAnsi="Tahoma" w:cs="Tahoma"/>
-          <w:sz w:val="22"/>
-          <w:szCs w:val="22"/>
-        </w:rPr>
-        <w:t xml:space="preserve"> </w:t>
-      </w:r>
-      <w:r>
-        <w:rPr>
-          <w:rFonts w:ascii="Tahoma" w:hAnsi="Tahoma" w:cs="Tahoma"/>
-          <w:sz w:val="22"/>
-          <w:szCs w:val="22"/>
-        </w:rPr>
-        <w:t>3</w:t>
-      </w:r>
-      <w:r>
-        <w:rPr>
-          <w:rFonts w:ascii="Tahoma" w:hAnsi="Tahoma" w:cs="Tahoma"/>
-          <w:sz w:val="22"/>
-          <w:szCs w:val="22"/>
-        </w:rPr>
-        <w:t xml:space="preserve">        </w:t>
-      </w:r>
-      <w:proofErr w:type="spellStart"/>
-      <w:proofErr w:type="gramStart"/>
-      <w:r>
-        <w:rPr>
-          <w:rFonts w:ascii="Tahoma" w:hAnsi="Tahoma" w:cs="Tahoma"/>
-          <w:i/>
-          <w:iCs/>
-          <w:sz w:val="22"/>
-          <w:szCs w:val="22"/>
-        </w:rPr>
-        <w:t>Prof.Dr.Birol</w:t>
-      </w:r>
-      <w:proofErr w:type="spellEnd"/>
-      <w:proofErr w:type="gramEnd"/>
-      <w:r>
-        <w:rPr>
-          <w:rFonts w:ascii="Tahoma" w:hAnsi="Tahoma" w:cs="Tahoma"/>
-          <w:i/>
-          <w:iCs/>
-          <w:sz w:val="22"/>
-          <w:szCs w:val="22"/>
-        </w:rPr>
-        <w:t xml:space="preserve"> </w:t>
-      </w:r>
-      <w:proofErr w:type="gramStart"/>
-      <w:r>
-        <w:rPr>
-          <w:rFonts w:ascii="Tahoma" w:hAnsi="Tahoma" w:cs="Tahoma"/>
-          <w:i/>
-          <w:iCs/>
-          <w:sz w:val="22"/>
-          <w:szCs w:val="22"/>
-        </w:rPr>
-        <w:t>Akgün  -</w:t>
-      </w:r>
-      <w:proofErr w:type="gramEnd"/>
-      <w:r>
-        <w:rPr>
-          <w:rFonts w:ascii="Tahoma" w:hAnsi="Tahoma" w:cs="Tahoma"/>
-          <w:i/>
-          <w:iCs/>
-          <w:sz w:val="22"/>
-          <w:szCs w:val="22"/>
-        </w:rPr>
-        <w:t xml:space="preserve"> </w:t>
-      </w:r>
-      <w:proofErr w:type="spellStart"/>
-      <w:r>
-        <w:rPr>
-          <w:rFonts w:ascii="Tahoma" w:hAnsi="Tahoma" w:cs="Tahoma"/>
-          <w:i/>
-          <w:iCs/>
-          <w:sz w:val="22"/>
-          <w:szCs w:val="22"/>
-        </w:rPr>
-        <w:t>Türkiyənin</w:t>
-      </w:r>
-      <w:proofErr w:type="spellEnd"/>
-      <w:r>
-        <w:rPr>
-          <w:rFonts w:ascii="Tahoma" w:hAnsi="Tahoma" w:cs="Tahoma"/>
-          <w:i/>
-          <w:iCs/>
-          <w:sz w:val="22"/>
-          <w:szCs w:val="22"/>
-        </w:rPr>
-        <w:t xml:space="preserve"> </w:t>
-      </w:r>
-      <w:proofErr w:type="spellStart"/>
-      <w:r>
-        <w:rPr>
-          <w:rFonts w:ascii="Tahoma" w:hAnsi="Tahoma" w:cs="Tahoma"/>
-          <w:i/>
-          <w:iCs/>
-          <w:sz w:val="22"/>
-          <w:szCs w:val="22"/>
-        </w:rPr>
-        <w:t>Azərbaycanda</w:t>
-      </w:r>
-      <w:proofErr w:type="spellEnd"/>
-      <w:r>
-        <w:rPr>
-          <w:rFonts w:ascii="Tahoma" w:hAnsi="Tahoma" w:cs="Tahoma"/>
-          <w:i/>
-          <w:iCs/>
-          <w:sz w:val="22"/>
-          <w:szCs w:val="22"/>
-        </w:rPr>
-        <w:t xml:space="preserve"> </w:t>
-      </w:r>
-      <w:proofErr w:type="spellStart"/>
-      <w:r>
-        <w:rPr>
-          <w:rFonts w:ascii="Tahoma" w:hAnsi="Tahoma" w:cs="Tahoma"/>
-          <w:i/>
-          <w:iCs/>
-          <w:sz w:val="22"/>
-          <w:szCs w:val="22"/>
-        </w:rPr>
-        <w:t>Fövqaladə</w:t>
-      </w:r>
-      <w:proofErr w:type="spellEnd"/>
-      <w:r>
-        <w:rPr>
-          <w:rFonts w:ascii="Tahoma" w:hAnsi="Tahoma" w:cs="Tahoma"/>
-          <w:i/>
-          <w:iCs/>
-          <w:sz w:val="22"/>
-          <w:szCs w:val="22"/>
-        </w:rPr>
-        <w:t xml:space="preserve"> </w:t>
-      </w:r>
-      <w:proofErr w:type="spellStart"/>
-      <w:r>
-        <w:rPr>
-          <w:rFonts w:ascii="Tahoma" w:hAnsi="Tahoma" w:cs="Tahoma"/>
-          <w:i/>
-          <w:iCs/>
-          <w:sz w:val="22"/>
-          <w:szCs w:val="22"/>
-        </w:rPr>
-        <w:t>və</w:t>
-      </w:r>
-      <w:proofErr w:type="spellEnd"/>
-      <w:r>
-        <w:rPr>
-          <w:rFonts w:ascii="Tahoma" w:hAnsi="Tahoma" w:cs="Tahoma"/>
-          <w:i/>
-          <w:iCs/>
-          <w:sz w:val="22"/>
-          <w:szCs w:val="22"/>
-        </w:rPr>
-        <w:t xml:space="preserve"> </w:t>
-      </w:r>
-      <w:proofErr w:type="spellStart"/>
-      <w:r>
-        <w:rPr>
-          <w:rFonts w:ascii="Tahoma" w:hAnsi="Tahoma" w:cs="Tahoma"/>
-          <w:i/>
-          <w:iCs/>
-          <w:sz w:val="22"/>
-          <w:szCs w:val="22"/>
-        </w:rPr>
-        <w:t>Səlahiyyətli</w:t>
-      </w:r>
-      <w:proofErr w:type="spellEnd"/>
-      <w:r>
-        <w:rPr>
-          <w:rFonts w:ascii="Tahoma" w:hAnsi="Tahoma" w:cs="Tahoma"/>
-          <w:i/>
-          <w:iCs/>
-          <w:sz w:val="22"/>
-          <w:szCs w:val="22"/>
-        </w:rPr>
-        <w:t xml:space="preserve"> </w:t>
-      </w:r>
-      <w:proofErr w:type="spellStart"/>
-      <w:r>
-        <w:rPr>
-          <w:rFonts w:ascii="Tahoma" w:hAnsi="Tahoma" w:cs="Tahoma"/>
-          <w:i/>
-          <w:iCs/>
-          <w:sz w:val="22"/>
-          <w:szCs w:val="22"/>
-        </w:rPr>
-        <w:t>səfiri</w:t>
-      </w:r>
-      <w:proofErr w:type="spellEnd"/>
-    </w:p>
-    <w:p>
-      <w:pPr>
-        <w:pStyle w:val="KonuBal"/>
-        <w:spacing w:after="100"/>
-        <w:ind w:left="426"/>
-        <w:rPr>
-          <w:rFonts w:ascii="Tahoma" w:hAnsi="Tahoma" w:cs="Tahoma"/>
-          <w:i/>
-          <w:iCs/>
-          <w:sz w:val="22"/>
-          <w:szCs w:val="22"/>
-        </w:rPr>
-      </w:pPr>
-    </w:p>
-    <w:p>
-      <w:pPr>
-        <w:pStyle w:val="KonuBal"/>
-        <w:spacing w:after="100"/>
-        <w:ind w:left="426"/>
-        <w:rPr>
-          <w:rFonts w:ascii="Tahoma" w:hAnsi="Tahoma" w:cs="Tahoma"/>
-          <w:i/>
-          <w:iCs/>
-          <w:sz w:val="22"/>
-          <w:szCs w:val="22"/>
-        </w:rPr>
-      </w:pPr>
-      <w:r>
-        <w:rPr>
-          <w:rFonts w:ascii="Tahoma" w:hAnsi="Tahoma" w:cs="Tahoma"/>
-          <w:i/>
-          <w:iCs/>
-          <w:sz w:val="22"/>
-          <w:szCs w:val="22"/>
-        </w:rPr>
-        <w:t xml:space="preserve">Sponsor </w:t>
-      </w:r>
-      <w:proofErr w:type="spellStart"/>
-      <w:r>
-        <w:rPr>
-          <w:rFonts w:ascii="Tahoma" w:hAnsi="Tahoma" w:cs="Tahoma"/>
-          <w:i/>
-          <w:iCs/>
-          <w:sz w:val="22"/>
-          <w:szCs w:val="22"/>
-        </w:rPr>
-        <w:t>və</w:t>
-      </w:r>
-      <w:proofErr w:type="spellEnd"/>
-      <w:r>
-        <w:rPr>
-          <w:rFonts w:ascii="Tahoma" w:hAnsi="Tahoma" w:cs="Tahoma"/>
-          <w:i/>
-          <w:iCs/>
-          <w:sz w:val="22"/>
-          <w:szCs w:val="22"/>
-        </w:rPr>
-        <w:t xml:space="preserve"> </w:t>
-      </w:r>
-      <w:proofErr w:type="spellStart"/>
-      <w:r>
-        <w:rPr>
-          <w:rFonts w:ascii="Tahoma" w:hAnsi="Tahoma" w:cs="Tahoma"/>
-          <w:i/>
-          <w:iCs/>
-          <w:sz w:val="22"/>
-          <w:szCs w:val="22"/>
-        </w:rPr>
-        <w:t>tərəfdaşların</w:t>
-      </w:r>
-      <w:proofErr w:type="spellEnd"/>
-      <w:r>
-        <w:rPr>
-          <w:rFonts w:ascii="Tahoma" w:hAnsi="Tahoma" w:cs="Tahoma"/>
-          <w:i/>
-          <w:iCs/>
-          <w:sz w:val="22"/>
-          <w:szCs w:val="22"/>
-        </w:rPr>
-        <w:t xml:space="preserve"> </w:t>
-      </w:r>
-      <w:proofErr w:type="spellStart"/>
-      <w:r>
-        <w:rPr>
-          <w:rFonts w:ascii="Tahoma" w:hAnsi="Tahoma" w:cs="Tahoma"/>
-          <w:i/>
-          <w:iCs/>
-          <w:sz w:val="22"/>
-          <w:szCs w:val="22"/>
-        </w:rPr>
-        <w:t>müfakatlandırılması</w:t>
-      </w:r>
-      <w:proofErr w:type="spellEnd"/>
-      <w:r>
-        <w:rPr>
-          <w:rFonts w:ascii="Tahoma" w:hAnsi="Tahoma" w:cs="Tahoma"/>
-          <w:i/>
-          <w:iCs/>
-          <w:sz w:val="22"/>
-          <w:szCs w:val="22"/>
-        </w:rPr>
-        <w:t xml:space="preserve">. </w:t>
-      </w:r>
-    </w:p>
-    <w:p>
-      <w:pPr>
-        <w:pStyle w:val="Balk1"/>
+        <w:pStyle w:val="1"/>
         <w:spacing w:before="400" w:after="200"/>
         <w:rPr>
           <w:rFonts w:ascii="Tahoma" w:hAnsi="Tahoma" w:cs="Tahoma"/>
@@ -1355,7 +827,6 @@
                 <w:szCs w:val="22"/>
               </w:rPr>
             </w:pPr>
-            <w:proofErr w:type="spellStart"/>
             <w:r>
               <w:rPr>
                 <w:rFonts w:ascii="Tahoma" w:hAnsi="Tahoma" w:cs="Tahoma"/>
@@ -1364,40 +835,7 @@
                 <w:sz w:val="22"/>
                 <w:szCs w:val="22"/>
               </w:rPr>
-              <w:t>Panelin</w:t>
-            </w:r>
-            <w:proofErr w:type="spellEnd"/>
-            <w:r>
-              <w:rPr>
-                <w:rFonts w:ascii="Tahoma" w:hAnsi="Tahoma" w:cs="Tahoma"/>
-                <w:b/>
-                <w:bCs/>
-                <w:sz w:val="22"/>
-                <w:szCs w:val="22"/>
-              </w:rPr>
-              <w:t xml:space="preserve"> </w:t>
-            </w:r>
-            <w:proofErr w:type="spellStart"/>
-            <w:r>
-              <w:rPr>
-                <w:rFonts w:ascii="Tahoma" w:hAnsi="Tahoma" w:cs="Tahoma"/>
-                <w:b/>
-                <w:bCs/>
-                <w:sz w:val="22"/>
-                <w:szCs w:val="22"/>
-              </w:rPr>
-              <w:t>mövzusu</w:t>
-            </w:r>
-            <w:proofErr w:type="spellEnd"/>
-            <w:r>
-              <w:rPr>
-                <w:rFonts w:ascii="Tahoma" w:hAnsi="Tahoma" w:cs="Tahoma"/>
-                <w:b/>
-                <w:bCs/>
-                <w:sz w:val="22"/>
-                <w:szCs w:val="22"/>
-              </w:rPr>
-              <w:t>:</w:t>
+              <w:t>Panelin mövzusu:</w:t>
             </w:r>
           </w:p>
         </w:tc>
@@ -1427,142 +865,30 @@
               </w:rPr>
               <w:t>``</w:t>
             </w:r>
-            <w:proofErr w:type="spellStart"/>
-            <w:r>
-              <w:rPr>
-                <w:rFonts w:ascii="Tahoma" w:hAnsi="Tahoma" w:cs="Tahoma"/>
-                <w:sz w:val="22"/>
-                <w:szCs w:val="22"/>
-              </w:rPr>
-              <w:t>Aqrar</w:t>
-            </w:r>
-            <w:proofErr w:type="spellEnd"/>
-            <w:r>
-              <w:rPr>
-                <w:rFonts w:ascii="Tahoma" w:hAnsi="Tahoma" w:cs="Tahoma"/>
-                <w:sz w:val="22"/>
-                <w:szCs w:val="22"/>
-              </w:rPr>
-              <w:t xml:space="preserve"> </w:t>
-            </w:r>
-            <w:proofErr w:type="spellStart"/>
-            <w:r>
-              <w:rPr>
-                <w:rFonts w:ascii="Tahoma" w:hAnsi="Tahoma" w:cs="Tahoma"/>
-                <w:sz w:val="22"/>
-                <w:szCs w:val="22"/>
-              </w:rPr>
-              <w:t>sahədə</w:t>
-            </w:r>
-            <w:proofErr w:type="spellEnd"/>
-            <w:r>
-              <w:rPr>
-                <w:rFonts w:ascii="Tahoma" w:hAnsi="Tahoma" w:cs="Tahoma"/>
-                <w:sz w:val="22"/>
-                <w:szCs w:val="22"/>
-              </w:rPr>
-              <w:t xml:space="preserve"> </w:t>
-            </w:r>
-            <w:proofErr w:type="spellStart"/>
-            <w:r>
-              <w:rPr>
-                <w:rFonts w:ascii="Tahoma" w:hAnsi="Tahoma" w:cs="Tahoma"/>
-                <w:sz w:val="22"/>
-                <w:szCs w:val="22"/>
-              </w:rPr>
-              <w:t>dövlət</w:t>
-            </w:r>
-            <w:proofErr w:type="spellEnd"/>
-            <w:r>
-              <w:rPr>
-                <w:rFonts w:ascii="Tahoma" w:hAnsi="Tahoma" w:cs="Tahoma"/>
-                <w:sz w:val="22"/>
-                <w:szCs w:val="22"/>
-              </w:rPr>
-              <w:t xml:space="preserve"> </w:t>
-            </w:r>
-            <w:proofErr w:type="spellStart"/>
-            <w:r>
-              <w:rPr>
-                <w:rFonts w:ascii="Tahoma" w:hAnsi="Tahoma" w:cs="Tahoma"/>
-                <w:sz w:val="22"/>
-                <w:szCs w:val="22"/>
-              </w:rPr>
-              <w:t>dəstəyi</w:t>
-            </w:r>
-            <w:proofErr w:type="spellEnd"/>
-            <w:r>
-              <w:rPr>
-                <w:rFonts w:ascii="Tahoma" w:hAnsi="Tahoma" w:cs="Tahoma"/>
-                <w:sz w:val="22"/>
-                <w:szCs w:val="22"/>
-              </w:rPr>
-              <w:t xml:space="preserve"> </w:t>
-            </w:r>
-            <w:proofErr w:type="spellStart"/>
-            <w:r>
-              <w:rPr>
-                <w:rFonts w:ascii="Tahoma" w:hAnsi="Tahoma" w:cs="Tahoma"/>
-                <w:sz w:val="22"/>
-                <w:szCs w:val="22"/>
-              </w:rPr>
-              <w:t>və</w:t>
-            </w:r>
-            <w:proofErr w:type="spellEnd"/>
-            <w:r>
-              <w:rPr>
-                <w:rFonts w:ascii="Tahoma" w:hAnsi="Tahoma" w:cs="Tahoma"/>
-                <w:sz w:val="22"/>
-                <w:szCs w:val="22"/>
-              </w:rPr>
-              <w:t xml:space="preserve"> </w:t>
-            </w:r>
-            <w:proofErr w:type="spellStart"/>
-            <w:r>
-              <w:rPr>
-                <w:rFonts w:ascii="Tahoma" w:hAnsi="Tahoma" w:cs="Tahoma"/>
-                <w:sz w:val="22"/>
-                <w:szCs w:val="22"/>
-              </w:rPr>
-              <w:t>maliyyə</w:t>
-            </w:r>
-            <w:proofErr w:type="spellEnd"/>
-            <w:r>
-              <w:rPr>
-                <w:rFonts w:ascii="Tahoma" w:hAnsi="Tahoma" w:cs="Tahoma"/>
-                <w:sz w:val="22"/>
-                <w:szCs w:val="22"/>
-              </w:rPr>
-              <w:t xml:space="preserve"> </w:t>
-            </w:r>
-            <w:proofErr w:type="spellStart"/>
-            <w:r>
-              <w:rPr>
-                <w:rFonts w:ascii="Tahoma" w:hAnsi="Tahoma" w:cs="Tahoma"/>
-                <w:sz w:val="22"/>
-                <w:szCs w:val="22"/>
-              </w:rPr>
-              <w:t>imkanlarına</w:t>
-            </w:r>
-            <w:proofErr w:type="spellEnd"/>
-            <w:r>
-              <w:rPr>
-                <w:rFonts w:ascii="Tahoma" w:hAnsi="Tahoma" w:cs="Tahoma"/>
-                <w:sz w:val="22"/>
-                <w:szCs w:val="22"/>
-              </w:rPr>
-              <w:t xml:space="preserve"> </w:t>
-            </w:r>
-            <w:proofErr w:type="spellStart"/>
-            <w:r>
-              <w:rPr>
-                <w:rFonts w:ascii="Tahoma" w:hAnsi="Tahoma" w:cs="Tahoma"/>
-                <w:sz w:val="22"/>
-                <w:szCs w:val="22"/>
-              </w:rPr>
-              <w:t>çıxış</w:t>
-            </w:r>
-            <w:proofErr w:type="spellEnd"/>
+            <w:r>
+              <w:rPr>
+                <w:rFonts w:ascii="Tahoma" w:hAnsi="Tahoma" w:cs="Tahoma"/>
+                <w:sz w:val="22"/>
+                <w:szCs w:val="22"/>
+              </w:rPr>
+              <w:t>Aqrar sahədə dövlət dəstəyi və maliyyə</w:t>
+            </w:r>
+            <w:r>
+              <w:rPr>
+                <w:rFonts w:ascii="Tahoma" w:hAnsi="Tahoma" w:cs="Tahoma"/>
+                <w:sz w:val="22"/>
+                <w:szCs w:val="22"/>
+              </w:rPr>
+              <w:t xml:space="preserve"> imkanlarına</w:t>
+            </w:r>
+            <w:r>
+              <w:rPr>
+                <w:rFonts w:ascii="Tahoma" w:hAnsi="Tahoma" w:cs="Tahoma"/>
+                <w:sz w:val="22"/>
+                <w:szCs w:val="22"/>
+              </w:rPr>
+              <w:t xml:space="preserve"> çıxış</w:t>
+            </w:r>
             <w:r>
               <w:rPr>
                 <w:rFonts w:ascii="Tahoma" w:hAnsi="Tahoma" w:cs="Tahoma"/>
@@ -1638,97 +964,7 @@
                 <w:sz w:val="22"/>
                 <w:szCs w:val="22"/>
               </w:rPr>
-              <w:t xml:space="preserve">Hikmət Məmmədov – </w:t>
-            </w:r>
-            <w:proofErr w:type="spellStart"/>
-            <w:r>
-              <w:rPr>
-                <w:rFonts w:ascii="Tahoma" w:hAnsi="Tahoma" w:cs="Tahoma"/>
-                <w:sz w:val="22"/>
-                <w:szCs w:val="22"/>
-              </w:rPr>
-              <w:t>Biznes</w:t>
-            </w:r>
-            <w:proofErr w:type="spellEnd"/>
-            <w:r>
-              <w:rPr>
-                <w:rFonts w:ascii="Tahoma" w:hAnsi="Tahoma" w:cs="Tahoma"/>
-                <w:sz w:val="22"/>
-                <w:szCs w:val="22"/>
-              </w:rPr>
-              <w:t xml:space="preserve"> </w:t>
-            </w:r>
-            <w:proofErr w:type="spellStart"/>
-            <w:r>
-              <w:rPr>
-                <w:rFonts w:ascii="Tahoma" w:hAnsi="Tahoma" w:cs="Tahoma"/>
-                <w:sz w:val="22"/>
-                <w:szCs w:val="22"/>
-              </w:rPr>
-              <w:t>TV`nin</w:t>
-            </w:r>
-            <w:proofErr w:type="spellEnd"/>
-            <w:r>
-              <w:rPr>
-                <w:rFonts w:ascii="Tahoma" w:hAnsi="Tahoma" w:cs="Tahoma"/>
-                <w:sz w:val="22"/>
-                <w:szCs w:val="22"/>
-              </w:rPr>
-              <w:t xml:space="preserve"> </w:t>
-            </w:r>
-            <w:proofErr w:type="spellStart"/>
-            <w:r>
-              <w:rPr>
-                <w:rFonts w:ascii="Tahoma" w:hAnsi="Tahoma" w:cs="Tahoma"/>
-                <w:sz w:val="22"/>
-                <w:szCs w:val="22"/>
-              </w:rPr>
-              <w:t>İdarə</w:t>
-            </w:r>
-            <w:proofErr w:type="spellEnd"/>
-            <w:r>
-              <w:rPr>
-                <w:rFonts w:ascii="Tahoma" w:hAnsi="Tahoma" w:cs="Tahoma"/>
-                <w:sz w:val="22"/>
-                <w:szCs w:val="22"/>
-              </w:rPr>
-              <w:t xml:space="preserve"> </w:t>
-            </w:r>
-            <w:proofErr w:type="spellStart"/>
-            <w:r>
-              <w:rPr>
-                <w:rFonts w:ascii="Tahoma" w:hAnsi="Tahoma" w:cs="Tahoma"/>
-                <w:sz w:val="22"/>
-                <w:szCs w:val="22"/>
-              </w:rPr>
-              <w:t>Heyətinin</w:t>
-            </w:r>
-            <w:proofErr w:type="spellEnd"/>
-            <w:r>
-              <w:rPr>
-                <w:rFonts w:ascii="Tahoma" w:hAnsi="Tahoma" w:cs="Tahoma"/>
-                <w:sz w:val="22"/>
-                <w:szCs w:val="22"/>
-              </w:rPr>
-              <w:t xml:space="preserve"> </w:t>
-            </w:r>
-            <w:proofErr w:type="spellStart"/>
-            <w:r>
-              <w:rPr>
-                <w:rFonts w:ascii="Tahoma" w:hAnsi="Tahoma" w:cs="Tahoma"/>
-                <w:sz w:val="22"/>
-                <w:szCs w:val="22"/>
-              </w:rPr>
-              <w:t>sədri</w:t>
-            </w:r>
-            <w:proofErr w:type="spellEnd"/>
-            <w:r>
-              <w:rPr>
-                <w:rFonts w:ascii="Tahoma" w:hAnsi="Tahoma" w:cs="Tahoma"/>
-                <w:sz w:val="22"/>
-                <w:szCs w:val="22"/>
-              </w:rPr>
-              <w:t xml:space="preserve"> </w:t>
+              <w:t xml:space="preserve">Hikmət Məmmədov – Biznes TV`nin İdarə Heyətinin sədri </w:t>
             </w:r>
           </w:p>
         </w:tc>
@@ -1753,7 +989,6 @@
                 <w:szCs w:val="22"/>
               </w:rPr>
             </w:pPr>
-            <w:proofErr w:type="spellStart"/>
             <w:r>
               <w:rPr>
                 <w:rFonts w:ascii="Tahoma" w:hAnsi="Tahoma" w:cs="Tahoma"/>
@@ -1762,18 +997,7 @@
                 <w:sz w:val="22"/>
                 <w:szCs w:val="22"/>
               </w:rPr>
-              <w:t>Vaxt</w:t>
-            </w:r>
-            <w:proofErr w:type="spellEnd"/>
-            <w:r>
-              <w:rPr>
-                <w:rFonts w:ascii="Tahoma" w:hAnsi="Tahoma" w:cs="Tahoma"/>
-                <w:b/>
-                <w:bCs/>
-                <w:sz w:val="22"/>
-                <w:szCs w:val="22"/>
-              </w:rPr>
-              <w:t>:</w:t>
+              <w:t>Vaxt:</w:t>
             </w:r>
           </w:p>
         </w:tc>
@@ -1824,7 +1048,6 @@
           <w:szCs w:val="22"/>
         </w:rPr>
       </w:pPr>
-      <w:proofErr w:type="spellStart"/>
       <w:r>
         <w:rPr>
           <w:rFonts w:ascii="Tahoma" w:hAnsi="Tahoma" w:cs="Tahoma"/>
@@ -1833,18 +1056,7 @@
           <w:sz w:val="22"/>
           <w:szCs w:val="22"/>
         </w:rPr>
-        <w:t>Spikerlər</w:t>
-      </w:r>
-      <w:proofErr w:type="spellEnd"/>
-      <w:r>
-        <w:rPr>
-          <w:rFonts w:ascii="Tahoma" w:hAnsi="Tahoma" w:cs="Tahoma"/>
-          <w:b/>
-          <w:bCs/>
-          <w:sz w:val="22"/>
-          <w:szCs w:val="22"/>
-        </w:rPr>
-        <w:t>:</w:t>
+        <w:t>Spikerlər:</w:t>
       </w:r>
     </w:p>
     <w:tbl>
@@ -1938,21 +1150,8 @@
                 <w:sz w:val="22"/>
                 <w:szCs w:val="22"/>
               </w:rPr>
-              <w:t xml:space="preserve">Ad </w:t>
-            </w:r>
-            <w:proofErr w:type="spellStart"/>
-            <w:r>
-              <w:rPr>
-                <w:rFonts w:ascii="Tahoma" w:hAnsi="Tahoma" w:cs="Tahoma"/>
-                <w:b/>
-                <w:bCs/>
-                <w:color w:val="FFFFFF"/>
-                <w:sz w:val="22"/>
-                <w:szCs w:val="22"/>
-              </w:rPr>
-              <w:t>Soyad</w:t>
-            </w:r>
-            <w:proofErr w:type="spellEnd"/>
+              <w:t>Ad Soyad</w:t>
+            </w:r>
           </w:p>
         </w:tc>
         <w:tc>
@@ -1976,7 +1175,6 @@
                 <w:szCs w:val="22"/>
               </w:rPr>
             </w:pPr>
-            <w:proofErr w:type="spellStart"/>
             <w:r>
               <w:rPr>
                 <w:rFonts w:ascii="Tahoma" w:hAnsi="Tahoma" w:cs="Tahoma"/>
@@ -1986,33 +1184,8 @@
                 <w:sz w:val="22"/>
                 <w:szCs w:val="22"/>
               </w:rPr>
-              <w:t>Şirkət</w:t>
-            </w:r>
-            <w:proofErr w:type="spellEnd"/>
-            <w:r>
-              <w:rPr>
-                <w:rFonts w:ascii="Tahoma" w:hAnsi="Tahoma" w:cs="Tahoma"/>
-                <w:b/>
-                <w:bCs/>
-                <w:color w:val="FFFFFF"/>
-                <w:sz w:val="22"/>
-                <w:szCs w:val="22"/>
-              </w:rPr>
-              <w:t xml:space="preserve"> / </w:t>
-            </w:r>
-            <w:proofErr w:type="spellStart"/>
-            <w:r>
-              <w:rPr>
-                <w:rFonts w:ascii="Tahoma" w:hAnsi="Tahoma" w:cs="Tahoma"/>
-                <w:b/>
-                <w:bCs/>
-                <w:color w:val="FFFFFF"/>
-                <w:sz w:val="22"/>
-                <w:szCs w:val="22"/>
-              </w:rPr>
-              <w:t>Təşkilat</w:t>
-            </w:r>
-            <w:proofErr w:type="spellEnd"/>
+              <w:t>Şirkət / Təşkilat</w:t>
+            </w:r>
           </w:p>
         </w:tc>
         <w:tc>
@@ -2036,7 +1209,6 @@
                 <w:szCs w:val="22"/>
               </w:rPr>
             </w:pPr>
-            <w:proofErr w:type="spellStart"/>
             <w:r>
               <w:rPr>
                 <w:rFonts w:ascii="Tahoma" w:hAnsi="Tahoma" w:cs="Tahoma"/>
@@ -2046,33 +1218,8 @@
                 <w:sz w:val="22"/>
                 <w:szCs w:val="22"/>
               </w:rPr>
-              <w:t>Spikerin</w:t>
-            </w:r>
-            <w:proofErr w:type="spellEnd"/>
-            <w:r>
-              <w:rPr>
-                <w:rFonts w:ascii="Tahoma" w:hAnsi="Tahoma" w:cs="Tahoma"/>
-                <w:b/>
-                <w:bCs/>
-                <w:color w:val="FFFFFF"/>
-                <w:sz w:val="22"/>
-                <w:szCs w:val="22"/>
-              </w:rPr>
-              <w:t xml:space="preserve"> </w:t>
-            </w:r>
-            <w:proofErr w:type="spellStart"/>
-            <w:r>
-              <w:rPr>
-                <w:rFonts w:ascii="Tahoma" w:hAnsi="Tahoma" w:cs="Tahoma"/>
-                <w:b/>
-                <w:bCs/>
-                <w:color w:val="FFFFFF"/>
-                <w:sz w:val="22"/>
-                <w:szCs w:val="22"/>
-              </w:rPr>
-              <w:t>mövzusu</w:t>
-            </w:r>
-            <w:proofErr w:type="spellEnd"/>
+              <w:t>Spikerin mövzusu</w:t>
+            </w:r>
           </w:p>
         </w:tc>
       </w:tr>
@@ -2155,78 +1302,22 @@
                 <w:szCs w:val="22"/>
               </w:rPr>
             </w:pPr>
-            <w:proofErr w:type="spellStart"/>
-            <w:r>
-              <w:rPr>
-                <w:rFonts w:ascii="Tahoma" w:hAnsi="Tahoma" w:cs="Tahoma"/>
-                <w:sz w:val="22"/>
-                <w:szCs w:val="22"/>
-              </w:rPr>
-              <w:t>Aqrar</w:t>
-            </w:r>
-            <w:proofErr w:type="spellEnd"/>
-            <w:r>
-              <w:rPr>
-                <w:rFonts w:ascii="Tahoma" w:hAnsi="Tahoma" w:cs="Tahoma"/>
-                <w:sz w:val="22"/>
-                <w:szCs w:val="22"/>
-              </w:rPr>
-              <w:t xml:space="preserve"> </w:t>
-            </w:r>
-            <w:proofErr w:type="spellStart"/>
-            <w:r>
-              <w:rPr>
-                <w:rFonts w:ascii="Tahoma" w:hAnsi="Tahoma" w:cs="Tahoma"/>
-                <w:sz w:val="22"/>
-                <w:szCs w:val="22"/>
-              </w:rPr>
-              <w:t>İnnovasiya</w:t>
-            </w:r>
-            <w:proofErr w:type="spellEnd"/>
-            <w:r>
-              <w:rPr>
-                <w:rFonts w:ascii="Tahoma" w:hAnsi="Tahoma" w:cs="Tahoma"/>
-                <w:sz w:val="22"/>
-                <w:szCs w:val="22"/>
-              </w:rPr>
-              <w:t xml:space="preserve"> </w:t>
-            </w:r>
-            <w:proofErr w:type="spellStart"/>
-            <w:r>
-              <w:rPr>
-                <w:rFonts w:ascii="Tahoma" w:hAnsi="Tahoma" w:cs="Tahoma"/>
-                <w:sz w:val="22"/>
-                <w:szCs w:val="22"/>
-              </w:rPr>
-              <w:t>Mərkəzi</w:t>
-            </w:r>
-            <w:proofErr w:type="spellEnd"/>
-            <w:r>
-              <w:rPr>
-                <w:rFonts w:ascii="Tahoma" w:hAnsi="Tahoma" w:cs="Tahoma"/>
-                <w:sz w:val="22"/>
-                <w:szCs w:val="22"/>
-              </w:rPr>
-              <w:t xml:space="preserve"> </w:t>
-            </w:r>
-            <w:proofErr w:type="gramStart"/>
-            <w:r>
-              <w:rPr>
-                <w:rFonts w:ascii="Tahoma" w:hAnsi="Tahoma" w:cs="Tahoma"/>
-                <w:sz w:val="22"/>
-                <w:szCs w:val="22"/>
-              </w:rPr>
-              <w:t xml:space="preserve">- </w:t>
-            </w:r>
-            <w:r>
-              <w:rPr>
-                <w:rFonts w:ascii="Tahoma" w:hAnsi="Tahoma" w:cs="Tahoma"/>
-                <w:sz w:val="22"/>
-                <w:szCs w:val="22"/>
-              </w:rPr>
-              <w:t xml:space="preserve"> </w:t>
-            </w:r>
-            <w:proofErr w:type="spellStart"/>
+            <w:r>
+              <w:rPr>
+                <w:rFonts w:ascii="Tahoma" w:hAnsi="Tahoma" w:cs="Tahoma"/>
+                <w:sz w:val="22"/>
+                <w:szCs w:val="22"/>
+              </w:rPr>
+              <w:t>Aqrar İnnovasiya Mərkəzi</w:t>
+            </w:r>
+            <w:r>
+              <w:rPr>
+                <w:rFonts w:ascii="Tahoma" w:hAnsi="Tahoma" w:cs="Tahoma"/>
+                <w:sz w:val="22"/>
+                <w:szCs w:val="22"/>
+              </w:rPr>
+              <w:t xml:space="preserve">nin </w:t>
+            </w:r>
             <w:r>
               <w:rPr>
                 <w:rFonts w:ascii="Tahoma" w:hAnsi="Tahoma" w:cs="Tahoma"/>
@@ -2235,8 +1326,14 @@
               </w:rPr>
               <w:t>rəhbər</w:t>
             </w:r>
-            <w:proofErr w:type="spellEnd"/>
-            <w:proofErr w:type="gramEnd"/>
+            <w:r>
+              <w:rPr>
+                <w:rFonts w:ascii="Tahoma" w:hAnsi="Tahoma" w:cs="Tahoma"/>
+                <w:sz w:val="22"/>
+                <w:szCs w:val="22"/>
+              </w:rPr>
+              <w:t>i</w:t>
+            </w:r>
           </w:p>
         </w:tc>
         <w:tc>
@@ -2311,6 +1408,14 @@
                 <w:szCs w:val="22"/>
               </w:rPr>
             </w:pPr>
+            <w:r>
+              <w:rPr>
+                <w:rFonts w:ascii="Tahoma" w:hAnsi="Tahoma" w:cs="Tahoma"/>
+                <w:sz w:val="22"/>
+                <w:szCs w:val="22"/>
+              </w:rPr>
+              <w:t>Murad Abdullayev</w:t>
+            </w:r>
           </w:p>
         </w:tc>
         <w:tc>
@@ -2338,7 +1443,7 @@
                 <w:sz w:val="22"/>
                 <w:szCs w:val="22"/>
               </w:rPr>
-              <w:t>KTN</w:t>
+              <w:t>Azərbaycan Biznesinin İnkişafı Fondunun İdarə Heyəti sədrinin müavini</w:t>
             </w:r>
           </w:p>
         </w:tc>
@@ -2414,6 +1519,14 @@
                 <w:szCs w:val="22"/>
               </w:rPr>
             </w:pPr>
+            <w:r>
+              <w:rPr>
+                <w:rFonts w:ascii="Tahoma" w:hAnsi="Tahoma" w:cs="Tahoma"/>
+                <w:sz w:val="22"/>
+                <w:szCs w:val="22"/>
+              </w:rPr>
+              <w:t>Elnur Musayev</w:t>
+            </w:r>
           </w:p>
         </w:tc>
         <w:tc>
@@ -2438,10 +1551,28 @@
             <w:r>
               <w:rPr>
                 <w:rFonts w:ascii="Tahoma" w:hAnsi="Tahoma" w:cs="Tahoma"/>
-                <w:sz w:val="22"/>
-                <w:szCs w:val="22"/>
-              </w:rPr>
-              <w:t>KTN</w:t>
+                <w:iCs/>
+                <w:sz w:val="22"/>
+                <w:szCs w:val="22"/>
+              </w:rPr>
+              <w:t>Aqrar Kred</w:t>
+            </w:r>
+            <w:r>
+              <w:rPr>
+                <w:rFonts w:ascii="Tahoma" w:hAnsi="Tahoma" w:cs="Tahoma"/>
+                <w:iCs/>
+                <w:sz w:val="22"/>
+                <w:szCs w:val="22"/>
+              </w:rPr>
+              <w:t xml:space="preserve">it və İnkişaf Agentliyinin </w:t>
+            </w:r>
+            <w:r>
+              <w:rPr>
+                <w:rFonts w:ascii="Tahoma" w:hAnsi="Tahoma" w:cs="Tahoma"/>
+                <w:sz w:val="22"/>
+                <w:szCs w:val="22"/>
+              </w:rPr>
+              <w:t xml:space="preserve">sədr müavini </w:t>
             </w:r>
           </w:p>
         </w:tc>
@@ -2517,23 +1648,21 @@
                 <w:szCs w:val="22"/>
               </w:rPr>
             </w:pPr>
-            <w:proofErr w:type="spellStart"/>
-            <w:r>
-              <w:rPr>
-                <w:rFonts w:ascii="Tahoma" w:hAnsi="Tahoma" w:cs="Tahoma"/>
-                <w:sz w:val="22"/>
-                <w:szCs w:val="22"/>
-              </w:rPr>
-              <w:t>Elxan</w:t>
-            </w:r>
-            <w:proofErr w:type="spellEnd"/>
-            <w:r>
-              <w:rPr>
-                <w:rFonts w:ascii="Tahoma" w:hAnsi="Tahoma" w:cs="Tahoma"/>
-                <w:sz w:val="22"/>
-                <w:szCs w:val="22"/>
-              </w:rPr>
-              <w:t xml:space="preserve"> Mixayılov</w:t>
+            <w:r>
+              <w:rPr>
+                <w:rFonts w:ascii="Tahoma" w:hAnsi="Tahoma" w:cs="Tahoma"/>
+                <w:sz w:val="22"/>
+                <w:szCs w:val="22"/>
+              </w:rPr>
+              <w:t>Elxan Mik</w:t>
+            </w:r>
+            <w:r>
+              <w:rPr>
+                <w:rFonts w:ascii="Tahoma" w:hAnsi="Tahoma" w:cs="Tahoma"/>
+                <w:sz w:val="22"/>
+                <w:szCs w:val="22"/>
+              </w:rPr>
+              <w:t>ayılov</w:t>
             </w:r>
           </w:p>
         </w:tc>
@@ -2562,80 +1691,25 @@
                 <w:sz w:val="22"/>
                 <w:szCs w:val="22"/>
               </w:rPr>
-              <w:t>AmCham</w:t>
-            </w:r>
-            <w:r>
-              <w:rPr>
-                <w:rFonts w:ascii="Tahoma" w:hAnsi="Tahoma" w:cs="Tahoma"/>
-                <w:sz w:val="22"/>
-                <w:szCs w:val="22"/>
-              </w:rPr>
-              <w:t xml:space="preserve"> - </w:t>
-            </w:r>
-            <w:proofErr w:type="spellStart"/>
-            <w:r>
-              <w:rPr>
-                <w:rFonts w:ascii="Tahoma" w:hAnsi="Tahoma" w:cs="Tahoma"/>
-                <w:sz w:val="22"/>
-                <w:szCs w:val="22"/>
-              </w:rPr>
-              <w:t>kənd</w:t>
-            </w:r>
-            <w:proofErr w:type="spellEnd"/>
-            <w:r>
-              <w:rPr>
-                <w:rFonts w:ascii="Tahoma" w:hAnsi="Tahoma" w:cs="Tahoma"/>
-                <w:sz w:val="22"/>
-                <w:szCs w:val="22"/>
-              </w:rPr>
-              <w:t xml:space="preserve"> </w:t>
-            </w:r>
-            <w:proofErr w:type="spellStart"/>
-            <w:r>
-              <w:rPr>
-                <w:rFonts w:ascii="Tahoma" w:hAnsi="Tahoma" w:cs="Tahoma"/>
-                <w:sz w:val="22"/>
-                <w:szCs w:val="22"/>
-              </w:rPr>
-              <w:t>təsərrüfatı</w:t>
-            </w:r>
-            <w:proofErr w:type="spellEnd"/>
-            <w:r>
-              <w:rPr>
-                <w:rFonts w:ascii="Tahoma" w:hAnsi="Tahoma" w:cs="Tahoma"/>
-                <w:sz w:val="22"/>
-                <w:szCs w:val="22"/>
-              </w:rPr>
-              <w:t xml:space="preserve"> </w:t>
-            </w:r>
-            <w:proofErr w:type="spellStart"/>
-            <w:r>
-              <w:rPr>
-                <w:rFonts w:ascii="Tahoma" w:hAnsi="Tahoma" w:cs="Tahoma"/>
-                <w:sz w:val="22"/>
-                <w:szCs w:val="22"/>
-              </w:rPr>
-              <w:t>komitəsinin</w:t>
-            </w:r>
-            <w:proofErr w:type="spellEnd"/>
-            <w:r>
-              <w:rPr>
-                <w:rFonts w:ascii="Tahoma" w:hAnsi="Tahoma" w:cs="Tahoma"/>
-                <w:sz w:val="22"/>
-                <w:szCs w:val="22"/>
-              </w:rPr>
-              <w:t xml:space="preserve"> </w:t>
-            </w:r>
-            <w:proofErr w:type="spellStart"/>
-            <w:r>
-              <w:rPr>
-                <w:rFonts w:ascii="Tahoma" w:hAnsi="Tahoma" w:cs="Tahoma"/>
-                <w:sz w:val="22"/>
-                <w:szCs w:val="22"/>
-              </w:rPr>
-              <w:t>sədri</w:t>
-            </w:r>
-            <w:proofErr w:type="spellEnd"/>
+              <w:t>AmCham Azerbaijan Qida və Kənd</w:t>
+            </w:r>
+          </w:p>
+          <w:p>
+            <w:pPr>
+              <w:rPr>
+                <w:rFonts w:ascii="Tahoma" w:hAnsi="Tahoma" w:cs="Tahoma"/>
+                <w:sz w:val="22"/>
+                <w:szCs w:val="22"/>
+              </w:rPr>
+            </w:pPr>
+            <w:r>
+              <w:rPr>
+                <w:rFonts w:ascii="Tahoma" w:hAnsi="Tahoma" w:cs="Tahoma"/>
+                <w:sz w:val="22"/>
+                <w:szCs w:val="22"/>
+              </w:rPr>
+              <w:t>Təsərrüfatı İşçi Qrupunun sədri</w:t>
+            </w:r>
           </w:p>
         </w:tc>
         <w:tc>
@@ -2663,15 +1737,8 @@
     </w:tbl>
     <w:p>
       <w:pPr>
-        <w:pStyle w:val="Balk1"/>
+        <w:pStyle w:val="1"/>
         <w:spacing w:before="400" w:after="200"/>
-        <w:rPr>
-          <w:rFonts w:ascii="Tahoma" w:hAnsi="Tahoma" w:cs="Tahoma"/>
-          <w:sz w:val="22"/>
-          <w:szCs w:val="22"/>
-        </w:rPr>
-      </w:pPr>
-      <w:r>
         <w:rPr>
           <w:rFonts w:ascii="Tahoma" w:hAnsi="Tahoma" w:cs="Tahoma"/>
           <w:b/>
@@ -2679,8 +1746,76 @@
           <w:sz w:val="22"/>
           <w:szCs w:val="22"/>
         </w:rPr>
+      </w:pPr>
+      <w:r>
+        <w:rPr>
+          <w:rFonts w:ascii="Tahoma" w:hAnsi="Tahoma" w:cs="Tahoma"/>
+          <w:b/>
+          <w:bCs/>
+          <w:sz w:val="22"/>
+          <w:szCs w:val="22"/>
+        </w:rPr>
         <w:t>2-ci PANEL</w:t>
       </w:r>
+    </w:p>
+    <w:p>
+      <w:pPr>
+        <w:pStyle w:val="a3"/>
+        <w:spacing w:after="100"/>
+        <w:ind w:left="426"/>
+        <w:rPr>
+          <w:rFonts w:ascii="Tahoma" w:hAnsi="Tahoma" w:cs="Tahoma"/>
+          <w:i/>
+          <w:iCs/>
+          <w:sz w:val="22"/>
+          <w:szCs w:val="22"/>
+        </w:rPr>
+      </w:pPr>
+      <w:r>
+        <w:rPr>
+          <w:rFonts w:ascii="Tahoma" w:hAnsi="Tahoma" w:cs="Tahoma"/>
+          <w:i/>
+          <w:iCs/>
+          <w:sz w:val="22"/>
+          <w:szCs w:val="22"/>
+        </w:rPr>
+        <w:lastRenderedPageBreak/>
+        <w:t>Dəstəkçilərin mükaf</w:t>
+      </w:r>
+      <w:r>
+        <w:rPr>
+          <w:rFonts w:ascii="Tahoma" w:hAnsi="Tahoma" w:cs="Tahoma"/>
+          <w:i/>
+          <w:iCs/>
+          <w:sz w:val="22"/>
+          <w:szCs w:val="22"/>
+        </w:rPr>
+        <w:t xml:space="preserve">atlandırılması. </w:t>
+      </w:r>
+    </w:p>
+    <w:p>
+      <w:pPr>
+        <w:pStyle w:val="1"/>
+        <w:spacing w:before="400" w:after="200"/>
+        <w:rPr>
+          <w:rFonts w:ascii="Tahoma" w:hAnsi="Tahoma" w:cs="Tahoma"/>
+          <w:b/>
+          <w:bCs/>
+          <w:sz w:val="22"/>
+          <w:szCs w:val="22"/>
+        </w:rPr>
+      </w:pPr>
+    </w:p>
+    <w:p>
+      <w:pPr>
+        <w:pStyle w:val="1"/>
+        <w:spacing w:before="400" w:after="200"/>
+        <w:rPr>
+          <w:rFonts w:ascii="Tahoma" w:hAnsi="Tahoma" w:cs="Tahoma"/>
+          <w:sz w:val="22"/>
+          <w:szCs w:val="22"/>
+        </w:rPr>
+      </w:pPr>
     </w:p>
     <w:tbl>
       <w:tblPr>
@@ -2723,7 +1858,6 @@
                 <w:szCs w:val="22"/>
               </w:rPr>
             </w:pPr>
-            <w:proofErr w:type="spellStart"/>
             <w:r>
               <w:rPr>
                 <w:rFonts w:ascii="Tahoma" w:hAnsi="Tahoma" w:cs="Tahoma"/>
@@ -2732,40 +1866,7 @@
                 <w:sz w:val="22"/>
                 <w:szCs w:val="22"/>
               </w:rPr>
-              <w:t>Panelin</w:t>
-            </w:r>
-            <w:proofErr w:type="spellEnd"/>
-            <w:r>
-              <w:rPr>
-                <w:rFonts w:ascii="Tahoma" w:hAnsi="Tahoma" w:cs="Tahoma"/>
-                <w:b/>
-                <w:bCs/>
-                <w:sz w:val="22"/>
-                <w:szCs w:val="22"/>
-              </w:rPr>
-              <w:t xml:space="preserve"> </w:t>
-            </w:r>
-            <w:proofErr w:type="spellStart"/>
-            <w:r>
-              <w:rPr>
-                <w:rFonts w:ascii="Tahoma" w:hAnsi="Tahoma" w:cs="Tahoma"/>
-                <w:b/>
-                <w:bCs/>
-                <w:sz w:val="22"/>
-                <w:szCs w:val="22"/>
-              </w:rPr>
-              <w:t>mövzusu</w:t>
-            </w:r>
-            <w:proofErr w:type="spellEnd"/>
-            <w:r>
-              <w:rPr>
-                <w:rFonts w:ascii="Tahoma" w:hAnsi="Tahoma" w:cs="Tahoma"/>
-                <w:b/>
-                <w:bCs/>
-                <w:sz w:val="22"/>
-                <w:szCs w:val="22"/>
-              </w:rPr>
-              <w:t>:</w:t>
+              <w:t>Panelin mövzusu:</w:t>
             </w:r>
           </w:p>
         </w:tc>
@@ -2795,88 +1896,30 @@
               </w:rPr>
               <w:t>``</w:t>
             </w:r>
-            <w:proofErr w:type="spellStart"/>
-            <w:r>
-              <w:rPr>
-                <w:rFonts w:ascii="Tahoma" w:hAnsi="Tahoma" w:cs="Tahoma"/>
-                <w:sz w:val="22"/>
-                <w:szCs w:val="22"/>
-              </w:rPr>
-              <w:t>Aqrar</w:t>
-            </w:r>
-            <w:proofErr w:type="spellEnd"/>
-            <w:r>
-              <w:rPr>
-                <w:rFonts w:ascii="Tahoma" w:hAnsi="Tahoma" w:cs="Tahoma"/>
-                <w:sz w:val="22"/>
-                <w:szCs w:val="22"/>
-              </w:rPr>
-              <w:t xml:space="preserve"> </w:t>
-            </w:r>
-            <w:proofErr w:type="spellStart"/>
-            <w:r>
-              <w:rPr>
-                <w:rFonts w:ascii="Tahoma" w:hAnsi="Tahoma" w:cs="Tahoma"/>
-                <w:sz w:val="22"/>
-                <w:szCs w:val="22"/>
-              </w:rPr>
-              <w:t>istehsal</w:t>
-            </w:r>
-            <w:proofErr w:type="spellEnd"/>
-            <w:r>
-              <w:rPr>
-                <w:rFonts w:ascii="Tahoma" w:hAnsi="Tahoma" w:cs="Tahoma"/>
-                <w:sz w:val="22"/>
-                <w:szCs w:val="22"/>
-              </w:rPr>
-              <w:t xml:space="preserve"> </w:t>
-            </w:r>
-            <w:proofErr w:type="spellStart"/>
-            <w:r>
-              <w:rPr>
-                <w:rFonts w:ascii="Tahoma" w:hAnsi="Tahoma" w:cs="Tahoma"/>
-                <w:sz w:val="22"/>
-                <w:szCs w:val="22"/>
-              </w:rPr>
-              <w:t>vasitəri</w:t>
-            </w:r>
-            <w:proofErr w:type="spellEnd"/>
-            <w:r>
-              <w:rPr>
-                <w:rFonts w:ascii="Tahoma" w:hAnsi="Tahoma" w:cs="Tahoma"/>
-                <w:sz w:val="22"/>
-                <w:szCs w:val="22"/>
-              </w:rPr>
-              <w:t xml:space="preserve"> </w:t>
-            </w:r>
-            <w:proofErr w:type="spellStart"/>
-            <w:r>
-              <w:rPr>
-                <w:rFonts w:ascii="Tahoma" w:hAnsi="Tahoma" w:cs="Tahoma"/>
-                <w:sz w:val="22"/>
-                <w:szCs w:val="22"/>
-              </w:rPr>
-              <w:t>ilə</w:t>
-            </w:r>
-            <w:proofErr w:type="spellEnd"/>
-            <w:r>
-              <w:rPr>
-                <w:rFonts w:ascii="Tahoma" w:hAnsi="Tahoma" w:cs="Tahoma"/>
-                <w:sz w:val="22"/>
-                <w:szCs w:val="22"/>
-              </w:rPr>
-              <w:t xml:space="preserve"> </w:t>
-            </w:r>
-            <w:proofErr w:type="spellStart"/>
-            <w:r>
-              <w:rPr>
-                <w:rFonts w:ascii="Tahoma" w:hAnsi="Tahoma" w:cs="Tahoma"/>
-                <w:sz w:val="22"/>
-                <w:szCs w:val="22"/>
-              </w:rPr>
-              <w:t>təminat</w:t>
-            </w:r>
-            <w:proofErr w:type="spellEnd"/>
+            <w:r>
+              <w:rPr>
+                <w:rFonts w:ascii="Tahoma" w:hAnsi="Tahoma" w:cs="Tahoma"/>
+                <w:sz w:val="22"/>
+                <w:szCs w:val="22"/>
+              </w:rPr>
+              <w:t>Aqrar istehsal vasitə</w:t>
+            </w:r>
+            <w:r>
+              <w:rPr>
+                <w:rFonts w:ascii="Tahoma" w:hAnsi="Tahoma" w:cs="Tahoma"/>
+                <w:sz w:val="22"/>
+                <w:szCs w:val="22"/>
+              </w:rPr>
+              <w:t>lə</w:t>
+            </w:r>
+            <w:r>
+              <w:rPr>
+                <w:rFonts w:ascii="Tahoma" w:hAnsi="Tahoma" w:cs="Tahoma"/>
+                <w:sz w:val="22"/>
+                <w:szCs w:val="22"/>
+              </w:rPr>
+              <w:t>ri ilə təminat</w:t>
+            </w:r>
             <w:r>
               <w:rPr>
                 <w:rFonts w:ascii="Tahoma" w:hAnsi="Tahoma" w:cs="Tahoma"/>
@@ -2900,151 +1943,7 @@
                 <w:sz w:val="22"/>
                 <w:szCs w:val="22"/>
               </w:rPr>
-              <w:t xml:space="preserve"> (</w:t>
-            </w:r>
-            <w:proofErr w:type="spellStart"/>
-            <w:r>
-              <w:rPr>
-                <w:rFonts w:ascii="Tahoma" w:hAnsi="Tahoma" w:cs="Tahoma"/>
-                <w:sz w:val="22"/>
-                <w:szCs w:val="22"/>
-              </w:rPr>
-              <w:t>toxum</w:t>
-            </w:r>
-            <w:proofErr w:type="spellEnd"/>
-            <w:r>
-              <w:rPr>
-                <w:rFonts w:ascii="Tahoma" w:hAnsi="Tahoma" w:cs="Tahoma"/>
-                <w:sz w:val="22"/>
-                <w:szCs w:val="22"/>
-              </w:rPr>
-              <w:t xml:space="preserve">, </w:t>
-            </w:r>
-            <w:proofErr w:type="spellStart"/>
-            <w:r>
-              <w:rPr>
-                <w:rFonts w:ascii="Tahoma" w:hAnsi="Tahoma" w:cs="Tahoma"/>
-                <w:sz w:val="22"/>
-                <w:szCs w:val="22"/>
-              </w:rPr>
-              <w:t>su</w:t>
-            </w:r>
-            <w:proofErr w:type="spellEnd"/>
-            <w:r>
-              <w:rPr>
-                <w:rFonts w:ascii="Tahoma" w:hAnsi="Tahoma" w:cs="Tahoma"/>
-                <w:sz w:val="22"/>
-                <w:szCs w:val="22"/>
-              </w:rPr>
-              <w:t xml:space="preserve">, </w:t>
-            </w:r>
-            <w:proofErr w:type="spellStart"/>
-            <w:r>
-              <w:rPr>
-                <w:rFonts w:ascii="Tahoma" w:hAnsi="Tahoma" w:cs="Tahoma"/>
-                <w:sz w:val="22"/>
-                <w:szCs w:val="22"/>
-              </w:rPr>
-              <w:t>gübrə</w:t>
-            </w:r>
-            <w:proofErr w:type="spellEnd"/>
-            <w:r>
-              <w:rPr>
-                <w:rFonts w:ascii="Tahoma" w:hAnsi="Tahoma" w:cs="Tahoma"/>
-                <w:sz w:val="22"/>
-                <w:szCs w:val="22"/>
-              </w:rPr>
-              <w:t xml:space="preserve">, </w:t>
-            </w:r>
-            <w:proofErr w:type="spellStart"/>
-            <w:r>
-              <w:rPr>
-                <w:rFonts w:ascii="Tahoma" w:hAnsi="Tahoma" w:cs="Tahoma"/>
-                <w:sz w:val="22"/>
-                <w:szCs w:val="22"/>
-              </w:rPr>
-              <w:t>yem</w:t>
-            </w:r>
-            <w:proofErr w:type="spellEnd"/>
-            <w:r>
-              <w:rPr>
-                <w:rFonts w:ascii="Tahoma" w:hAnsi="Tahoma" w:cs="Tahoma"/>
-                <w:sz w:val="22"/>
-                <w:szCs w:val="22"/>
-              </w:rPr>
-              <w:t xml:space="preserve">, </w:t>
-            </w:r>
-            <w:proofErr w:type="spellStart"/>
-            <w:r>
-              <w:rPr>
-                <w:rFonts w:ascii="Tahoma" w:hAnsi="Tahoma" w:cs="Tahoma"/>
-                <w:sz w:val="22"/>
-                <w:szCs w:val="22"/>
-              </w:rPr>
-              <w:t>baytarlıq</w:t>
-            </w:r>
-            <w:proofErr w:type="spellEnd"/>
-            <w:r>
-              <w:rPr>
-                <w:rFonts w:ascii="Tahoma" w:hAnsi="Tahoma" w:cs="Tahoma"/>
-                <w:sz w:val="22"/>
-                <w:szCs w:val="22"/>
-              </w:rPr>
-              <w:t xml:space="preserve">, </w:t>
-            </w:r>
-            <w:proofErr w:type="spellStart"/>
-            <w:r>
-              <w:rPr>
-                <w:rFonts w:ascii="Tahoma" w:hAnsi="Tahoma" w:cs="Tahoma"/>
-                <w:sz w:val="22"/>
-                <w:szCs w:val="22"/>
-              </w:rPr>
-              <w:t>pestisid</w:t>
-            </w:r>
-            <w:proofErr w:type="spellEnd"/>
-            <w:r>
-              <w:rPr>
-                <w:rFonts w:ascii="Tahoma" w:hAnsi="Tahoma" w:cs="Tahoma"/>
-                <w:sz w:val="22"/>
-                <w:szCs w:val="22"/>
-              </w:rPr>
-              <w:t xml:space="preserve">, </w:t>
-            </w:r>
-            <w:proofErr w:type="spellStart"/>
-            <w:r>
-              <w:rPr>
-                <w:rFonts w:ascii="Tahoma" w:hAnsi="Tahoma" w:cs="Tahoma"/>
-                <w:sz w:val="22"/>
-                <w:szCs w:val="22"/>
-              </w:rPr>
-              <w:t>aqrar</w:t>
-            </w:r>
-            <w:proofErr w:type="spellEnd"/>
-            <w:r>
-              <w:rPr>
-                <w:rFonts w:ascii="Tahoma" w:hAnsi="Tahoma" w:cs="Tahoma"/>
-                <w:sz w:val="22"/>
-                <w:szCs w:val="22"/>
-              </w:rPr>
-              <w:t xml:space="preserve"> </w:t>
-            </w:r>
-            <w:proofErr w:type="spellStart"/>
-            <w:r>
-              <w:rPr>
-                <w:rFonts w:ascii="Tahoma" w:hAnsi="Tahoma" w:cs="Tahoma"/>
-                <w:sz w:val="22"/>
-                <w:szCs w:val="22"/>
-              </w:rPr>
-              <w:t>texnika</w:t>
-            </w:r>
-            <w:proofErr w:type="spellEnd"/>
-            <w:r>
-              <w:rPr>
-                <w:rFonts w:ascii="Tahoma" w:hAnsi="Tahoma" w:cs="Tahoma"/>
-                <w:sz w:val="22"/>
-                <w:szCs w:val="22"/>
-              </w:rPr>
-              <w:t>)</w:t>
+              <w:t xml:space="preserve"> (toxum, su, gübrə, yem, baytarlıq, pestisid, aqrar texnika)</w:t>
             </w:r>
           </w:p>
         </w:tc>
@@ -3105,79 +2004,7 @@
                 <w:sz w:val="22"/>
                 <w:szCs w:val="22"/>
               </w:rPr>
-              <w:t xml:space="preserve">Sakit Səmədov – Fayda </w:t>
-            </w:r>
-            <w:proofErr w:type="spellStart"/>
-            <w:r>
-              <w:rPr>
-                <w:rFonts w:ascii="Tahoma" w:hAnsi="Tahoma" w:cs="Tahoma"/>
-                <w:sz w:val="22"/>
-                <w:szCs w:val="22"/>
-              </w:rPr>
-              <w:t>İş</w:t>
-            </w:r>
-            <w:proofErr w:type="spellEnd"/>
-            <w:r>
-              <w:rPr>
-                <w:rFonts w:ascii="Tahoma" w:hAnsi="Tahoma" w:cs="Tahoma"/>
-                <w:sz w:val="22"/>
-                <w:szCs w:val="22"/>
-              </w:rPr>
-              <w:t xml:space="preserve"> </w:t>
-            </w:r>
-            <w:proofErr w:type="spellStart"/>
-            <w:r>
-              <w:rPr>
-                <w:rFonts w:ascii="Tahoma" w:hAnsi="Tahoma" w:cs="Tahoma"/>
-                <w:sz w:val="22"/>
-                <w:szCs w:val="22"/>
-              </w:rPr>
-              <w:t>Adamları</w:t>
-            </w:r>
-            <w:proofErr w:type="spellEnd"/>
-            <w:r>
-              <w:rPr>
-                <w:rFonts w:ascii="Tahoma" w:hAnsi="Tahoma" w:cs="Tahoma"/>
-                <w:sz w:val="22"/>
-                <w:szCs w:val="22"/>
-              </w:rPr>
-              <w:t xml:space="preserve"> </w:t>
-            </w:r>
-            <w:proofErr w:type="spellStart"/>
-            <w:r>
-              <w:rPr>
-                <w:rFonts w:ascii="Tahoma" w:hAnsi="Tahoma" w:cs="Tahoma"/>
-                <w:sz w:val="22"/>
-                <w:szCs w:val="22"/>
-              </w:rPr>
-              <w:t>Platformasının</w:t>
-            </w:r>
-            <w:proofErr w:type="spellEnd"/>
-            <w:r>
-              <w:rPr>
-                <w:rFonts w:ascii="Tahoma" w:hAnsi="Tahoma" w:cs="Tahoma"/>
-                <w:sz w:val="22"/>
-                <w:szCs w:val="22"/>
-              </w:rPr>
-              <w:t xml:space="preserve"> </w:t>
-            </w:r>
-            <w:proofErr w:type="spellStart"/>
-            <w:r>
-              <w:rPr>
-                <w:rFonts w:ascii="Tahoma" w:hAnsi="Tahoma" w:cs="Tahoma"/>
-                <w:sz w:val="22"/>
-                <w:szCs w:val="22"/>
-              </w:rPr>
-              <w:t>rəhbəri</w:t>
-            </w:r>
-            <w:proofErr w:type="spellEnd"/>
-            <w:r>
-              <w:rPr>
-                <w:rFonts w:ascii="Tahoma" w:hAnsi="Tahoma" w:cs="Tahoma"/>
-                <w:sz w:val="22"/>
-                <w:szCs w:val="22"/>
-              </w:rPr>
-              <w:t xml:space="preserve"> </w:t>
+              <w:t xml:space="preserve">Sakit Səmədov – Fayda İş Adamları Platformasının rəhbəri </w:t>
             </w:r>
           </w:p>
         </w:tc>
@@ -3202,7 +2029,6 @@
                 <w:szCs w:val="22"/>
               </w:rPr>
             </w:pPr>
-            <w:proofErr w:type="spellStart"/>
             <w:r>
               <w:rPr>
                 <w:rFonts w:ascii="Tahoma" w:hAnsi="Tahoma" w:cs="Tahoma"/>
@@ -3211,18 +2037,7 @@
                 <w:sz w:val="22"/>
                 <w:szCs w:val="22"/>
               </w:rPr>
-              <w:t>Vaxt</w:t>
-            </w:r>
-            <w:proofErr w:type="spellEnd"/>
-            <w:r>
-              <w:rPr>
-                <w:rFonts w:ascii="Tahoma" w:hAnsi="Tahoma" w:cs="Tahoma"/>
-                <w:b/>
-                <w:bCs/>
-                <w:sz w:val="22"/>
-                <w:szCs w:val="22"/>
-              </w:rPr>
-              <w:t>:</w:t>
+              <w:t>Vaxt:</w:t>
             </w:r>
             <w:r>
               <w:rPr>
@@ -3275,7 +2090,6 @@
           <w:szCs w:val="22"/>
         </w:rPr>
       </w:pPr>
-      <w:proofErr w:type="spellStart"/>
       <w:r>
         <w:rPr>
           <w:rFonts w:ascii="Tahoma" w:hAnsi="Tahoma" w:cs="Tahoma"/>
@@ -3284,24 +2098,12 @@
           <w:sz w:val="22"/>
           <w:szCs w:val="22"/>
         </w:rPr>
-        <w:lastRenderedPageBreak/>
-        <w:t>Spikerlər</w:t>
-      </w:r>
-      <w:proofErr w:type="spellEnd"/>
-      <w:r>
-        <w:rPr>
-          <w:rFonts w:ascii="Tahoma" w:hAnsi="Tahoma" w:cs="Tahoma"/>
-          <w:b/>
-          <w:bCs/>
-          <w:sz w:val="22"/>
-          <w:szCs w:val="22"/>
-        </w:rPr>
-        <w:t>:</w:t>
+        <w:t>Spikerlər:</w:t>
       </w:r>
     </w:p>
     <w:tbl>
       <w:tblPr>
-        <w:tblStyle w:val="TabloKlavuzu"/>
+        <w:tblStyle w:val="af0"/>
         <w:tblW w:w="0" w:type="auto"/>
         <w:tblLook w:val="04A0" w:firstRow="1" w:lastRow="0" w:firstColumn="1" w:lastColumn="0" w:noHBand="0" w:noVBand="1"/>
       </w:tblPr>
@@ -3377,21 +2179,8 @@
                 <w:sz w:val="22"/>
                 <w:szCs w:val="22"/>
               </w:rPr>
-              <w:t xml:space="preserve">Ad </w:t>
-            </w:r>
-            <w:proofErr w:type="spellStart"/>
-            <w:r>
-              <w:rPr>
-                <w:rFonts w:ascii="Tahoma" w:hAnsi="Tahoma" w:cs="Tahoma"/>
-                <w:b/>
-                <w:bCs/>
-                <w:color w:val="FFFFFF"/>
-                <w:sz w:val="22"/>
-                <w:szCs w:val="22"/>
-              </w:rPr>
-              <w:t>Soyad</w:t>
-            </w:r>
-            <w:proofErr w:type="spellEnd"/>
+              <w:t>Ad Soyad</w:t>
+            </w:r>
           </w:p>
         </w:tc>
         <w:tc>
@@ -3412,7 +2201,6 @@
                 <w:szCs w:val="22"/>
               </w:rPr>
             </w:pPr>
-            <w:proofErr w:type="spellStart"/>
             <w:r>
               <w:rPr>
                 <w:rFonts w:ascii="Tahoma" w:hAnsi="Tahoma" w:cs="Tahoma"/>
@@ -3422,33 +2210,8 @@
                 <w:sz w:val="22"/>
                 <w:szCs w:val="22"/>
               </w:rPr>
-              <w:t>Şirkət</w:t>
-            </w:r>
-            <w:proofErr w:type="spellEnd"/>
-            <w:r>
-              <w:rPr>
-                <w:rFonts w:ascii="Tahoma" w:hAnsi="Tahoma" w:cs="Tahoma"/>
-                <w:b/>
-                <w:bCs/>
-                <w:color w:val="FFFFFF"/>
-                <w:sz w:val="22"/>
-                <w:szCs w:val="22"/>
-              </w:rPr>
-              <w:t xml:space="preserve"> / </w:t>
-            </w:r>
-            <w:proofErr w:type="spellStart"/>
-            <w:r>
-              <w:rPr>
-                <w:rFonts w:ascii="Tahoma" w:hAnsi="Tahoma" w:cs="Tahoma"/>
-                <w:b/>
-                <w:bCs/>
-                <w:color w:val="FFFFFF"/>
-                <w:sz w:val="22"/>
-                <w:szCs w:val="22"/>
-              </w:rPr>
-              <w:t>Təşkilat</w:t>
-            </w:r>
-            <w:proofErr w:type="spellEnd"/>
+              <w:t>Şirkət / Təşkilat</w:t>
+            </w:r>
           </w:p>
         </w:tc>
         <w:tc>
@@ -3469,7 +2232,6 @@
                 <w:szCs w:val="22"/>
               </w:rPr>
             </w:pPr>
-            <w:proofErr w:type="spellStart"/>
             <w:r>
               <w:rPr>
                 <w:rFonts w:ascii="Tahoma" w:hAnsi="Tahoma" w:cs="Tahoma"/>
@@ -3479,33 +2241,8 @@
                 <w:sz w:val="22"/>
                 <w:szCs w:val="22"/>
               </w:rPr>
-              <w:t>Spikerin</w:t>
-            </w:r>
-            <w:proofErr w:type="spellEnd"/>
-            <w:r>
-              <w:rPr>
-                <w:rFonts w:ascii="Tahoma" w:hAnsi="Tahoma" w:cs="Tahoma"/>
-                <w:b/>
-                <w:bCs/>
-                <w:color w:val="FFFFFF"/>
-                <w:sz w:val="22"/>
-                <w:szCs w:val="22"/>
-              </w:rPr>
-              <w:t xml:space="preserve"> </w:t>
-            </w:r>
-            <w:proofErr w:type="spellStart"/>
-            <w:r>
-              <w:rPr>
-                <w:rFonts w:ascii="Tahoma" w:hAnsi="Tahoma" w:cs="Tahoma"/>
-                <w:b/>
-                <w:bCs/>
-                <w:color w:val="FFFFFF"/>
-                <w:sz w:val="22"/>
-                <w:szCs w:val="22"/>
-              </w:rPr>
-              <w:t>mövzusu</w:t>
-            </w:r>
-            <w:proofErr w:type="spellEnd"/>
+              <w:t>Spikerin mövzusu</w:t>
+            </w:r>
           </w:p>
         </w:tc>
       </w:tr>
@@ -3588,18 +2325,50 @@
                 <w:sz w:val="22"/>
                 <w:szCs w:val="22"/>
               </w:rPr>
-              <w:t xml:space="preserve">Elba Chem-in </w:t>
-            </w:r>
-            <w:proofErr w:type="spellStart"/>
-            <w:r>
-              <w:rPr>
-                <w:rFonts w:ascii="Tahoma" w:hAnsi="Tahoma" w:cs="Tahoma"/>
-                <w:sz w:val="22"/>
-                <w:szCs w:val="22"/>
-              </w:rPr>
-              <w:t>direktoru</w:t>
-            </w:r>
-            <w:proofErr w:type="spellEnd"/>
+              <w:t>“</w:t>
+            </w:r>
+            <w:r>
+              <w:rPr>
+                <w:rFonts w:ascii="Tahoma" w:hAnsi="Tahoma" w:cs="Tahoma"/>
+                <w:sz w:val="22"/>
+                <w:szCs w:val="22"/>
+              </w:rPr>
+              <w:t>Elba Chem</w:t>
+            </w:r>
+            <w:r>
+              <w:rPr>
+                <w:rFonts w:ascii="Tahoma" w:hAnsi="Tahoma" w:cs="Tahoma"/>
+                <w:sz w:val="22"/>
+                <w:szCs w:val="22"/>
+              </w:rPr>
+              <w:t>” QSC</w:t>
+            </w:r>
+            <w:r>
+              <w:rPr>
+                <w:rFonts w:ascii="Tahoma" w:hAnsi="Tahoma" w:cs="Tahoma"/>
+                <w:sz w:val="22"/>
+                <w:szCs w:val="22"/>
+              </w:rPr>
+              <w:t>-</w:t>
+            </w:r>
+            <w:r>
+              <w:rPr>
+                <w:rFonts w:ascii="Tahoma" w:hAnsi="Tahoma" w:cs="Tahoma"/>
+                <w:sz w:val="22"/>
+                <w:szCs w:val="22"/>
+              </w:rPr>
+              <w:t xml:space="preserve"> n</w:t>
+            </w:r>
+            <w:bookmarkStart w:id="0" w:name="_GoBack"/>
+            <w:bookmarkEnd w:id="0"/>
+            <w:r>
+              <w:rPr>
+                <w:rFonts w:ascii="Tahoma" w:hAnsi="Tahoma" w:cs="Tahoma"/>
+                <w:sz w:val="22"/>
+                <w:szCs w:val="22"/>
+              </w:rPr>
+              <w:t>in direktoru</w:t>
+            </w:r>
           </w:p>
         </w:tc>
         <w:tc>
@@ -3619,69 +2388,21 @@
                 <w:szCs w:val="22"/>
               </w:rPr>
             </w:pPr>
-            <w:proofErr w:type="spellStart"/>
-            <w:proofErr w:type="gramStart"/>
-            <w:r>
-              <w:rPr>
-                <w:rFonts w:ascii="Tahoma" w:hAnsi="Tahoma" w:cs="Tahoma"/>
-                <w:sz w:val="22"/>
-                <w:szCs w:val="22"/>
-              </w:rPr>
-              <w:t>Gübrə</w:t>
-            </w:r>
-            <w:proofErr w:type="spellEnd"/>
-            <w:r>
-              <w:rPr>
-                <w:rFonts w:ascii="Tahoma" w:hAnsi="Tahoma" w:cs="Tahoma"/>
-                <w:sz w:val="22"/>
-                <w:szCs w:val="22"/>
-              </w:rPr>
-              <w:t>(</w:t>
-            </w:r>
-            <w:proofErr w:type="gramEnd"/>
-            <w:r>
-              <w:rPr>
-                <w:rFonts w:ascii="Tahoma" w:hAnsi="Tahoma" w:cs="Tahoma"/>
-                <w:sz w:val="22"/>
-                <w:szCs w:val="22"/>
-              </w:rPr>
-              <w:t xml:space="preserve">tam ad </w:t>
-            </w:r>
-            <w:proofErr w:type="spellStart"/>
-            <w:r>
-              <w:rPr>
-                <w:rFonts w:ascii="Tahoma" w:hAnsi="Tahoma" w:cs="Tahoma"/>
-                <w:sz w:val="22"/>
-                <w:szCs w:val="22"/>
-              </w:rPr>
-              <w:t>qeyd</w:t>
-            </w:r>
-            <w:proofErr w:type="spellEnd"/>
-            <w:r>
-              <w:rPr>
-                <w:rFonts w:ascii="Tahoma" w:hAnsi="Tahoma" w:cs="Tahoma"/>
-                <w:sz w:val="22"/>
-                <w:szCs w:val="22"/>
-              </w:rPr>
-              <w:t xml:space="preserve"> </w:t>
-            </w:r>
-            <w:proofErr w:type="spellStart"/>
-            <w:r>
-              <w:rPr>
-                <w:rFonts w:ascii="Tahoma" w:hAnsi="Tahoma" w:cs="Tahoma"/>
-                <w:sz w:val="22"/>
-                <w:szCs w:val="22"/>
-              </w:rPr>
-              <w:t>olunacaq</w:t>
-            </w:r>
-            <w:proofErr w:type="spellEnd"/>
-            <w:r>
-              <w:rPr>
-                <w:rFonts w:ascii="Tahoma" w:hAnsi="Tahoma" w:cs="Tahoma"/>
-                <w:sz w:val="22"/>
-                <w:szCs w:val="22"/>
-              </w:rPr>
-              <w:t>)</w:t>
+            <w:r>
+              <w:rPr>
+                <w:rFonts w:ascii="Tahoma" w:hAnsi="Tahoma" w:cs="Tahoma"/>
+                <w:sz w:val="22"/>
+                <w:szCs w:val="22"/>
+              </w:rPr>
+              <w:t xml:space="preserve">Rəqabət sahədən əvvəl başlayır: </w:t>
+            </w:r>
+            <w:r>
+              <w:rPr>
+                <w:rFonts w:ascii="Tahoma" w:hAnsi="Tahoma" w:cs="Tahoma"/>
+                <w:sz w:val="22"/>
+                <w:szCs w:val="22"/>
+              </w:rPr>
+              <w:t>gübrə təchizatı və regionda istehsal imkanı</w:t>
             </w:r>
           </w:p>
         </w:tc>
@@ -3756,36 +2477,8 @@
                 <w:sz w:val="22"/>
                 <w:szCs w:val="22"/>
               </w:rPr>
-              <w:t>“</w:t>
-            </w:r>
-            <w:proofErr w:type="spellStart"/>
-            <w:r>
-              <w:rPr>
-                <w:rFonts w:ascii="Tahoma" w:hAnsi="Tahoma" w:cs="Tahoma"/>
-                <w:sz w:val="22"/>
-                <w:szCs w:val="22"/>
-              </w:rPr>
-              <w:t>Aqromarket</w:t>
-            </w:r>
-            <w:proofErr w:type="spellEnd"/>
-            <w:r>
-              <w:rPr>
-                <w:rFonts w:ascii="Tahoma" w:hAnsi="Tahoma" w:cs="Tahoma"/>
-                <w:sz w:val="22"/>
-                <w:szCs w:val="22"/>
-              </w:rPr>
-              <w:t xml:space="preserve"> Servis”-in </w:t>
-            </w:r>
-            <w:proofErr w:type="spellStart"/>
-            <w:r>
-              <w:rPr>
-                <w:rFonts w:ascii="Tahoma" w:hAnsi="Tahoma" w:cs="Tahoma"/>
-                <w:sz w:val="22"/>
-                <w:szCs w:val="22"/>
-              </w:rPr>
-              <w:t>rəhbəri</w:t>
-            </w:r>
-            <w:proofErr w:type="spellEnd"/>
+              <w:t>“Aqromarket Servis”-in rəhbəri</w:t>
+            </w:r>
           </w:p>
         </w:tc>
         <w:tc>
@@ -3808,18 +2501,24 @@
                 <w:sz w:val="22"/>
                 <w:szCs w:val="22"/>
               </w:rPr>
-              <w:t xml:space="preserve">Pivot </w:t>
-            </w:r>
-            <w:proofErr w:type="spellStart"/>
-            <w:r>
-              <w:rPr>
-                <w:rFonts w:ascii="Tahoma" w:hAnsi="Tahoma" w:cs="Tahoma"/>
-                <w:sz w:val="22"/>
-                <w:szCs w:val="22"/>
-              </w:rPr>
-              <w:t>suvarma</w:t>
-            </w:r>
-            <w:proofErr w:type="spellEnd"/>
+              <w:t xml:space="preserve">Azərbaycanda </w:t>
+            </w:r>
+            <w:r>
+              <w:rPr>
+                <w:rFonts w:ascii="Tahoma" w:hAnsi="Tahoma" w:cs="Tahoma"/>
+                <w:sz w:val="22"/>
+                <w:szCs w:val="22"/>
+              </w:rPr>
+              <w:t>Pivot suvarma</w:t>
+            </w:r>
+            <w:r>
+              <w:rPr>
+                <w:rFonts w:ascii="Tahoma" w:hAnsi="Tahoma" w:cs="Tahoma"/>
+                <w:sz w:val="22"/>
+                <w:szCs w:val="22"/>
+              </w:rPr>
+              <w:t xml:space="preserve"> sistemləri</w:t>
+            </w:r>
           </w:p>
         </w:tc>
       </w:tr>
@@ -3861,6 +2560,14 @@
                 <w:szCs w:val="22"/>
               </w:rPr>
             </w:pPr>
+            <w:r>
+              <w:rPr>
+                <w:rFonts w:ascii="Tahoma" w:hAnsi="Tahoma" w:cs="Tahoma"/>
+                <w:sz w:val="22"/>
+                <w:szCs w:val="22"/>
+              </w:rPr>
+              <w:t>Ramil Məmmədov</w:t>
+            </w:r>
           </w:p>
         </w:tc>
         <w:tc>
@@ -3876,6 +2583,19 @@
                 <w:szCs w:val="22"/>
               </w:rPr>
             </w:pPr>
+            <w:r>
+              <w:rPr>
+                <w:rStyle w:val="af1"/>
+                <w:rFonts w:ascii="Tahoma" w:hAnsi="Tahoma" w:cs="Tahoma"/>
+                <w:bCs/>
+                <w:i w:val="0"/>
+                <w:iCs w:val="0"/>
+                <w:sz w:val="22"/>
+                <w:szCs w:val="22"/>
+                <w:shd w:val="clear" w:color="auto" w:fill="FFFFFF"/>
+              </w:rPr>
+              <w:t>Agro Dairy Qrupunda Bitkiçilik Bölməsi üzrə İdarəedici Direktor</w:t>
+            </w:r>
           </w:p>
         </w:tc>
         <w:tc>
@@ -3891,6 +2611,14 @@
                 <w:szCs w:val="22"/>
               </w:rPr>
             </w:pPr>
+            <w:r>
+              <w:rPr>
+                <w:rFonts w:ascii="Tahoma" w:hAnsi="Tahoma" w:cs="Tahoma"/>
+                <w:sz w:val="22"/>
+                <w:szCs w:val="22"/>
+              </w:rPr>
+              <w:t>Dəqiq əkinçilik</w:t>
+            </w:r>
           </w:p>
         </w:tc>
       </w:tr>
@@ -3932,6 +2660,14 @@
                 <w:szCs w:val="22"/>
               </w:rPr>
             </w:pPr>
+            <w:r>
+              <w:rPr>
+                <w:rFonts w:ascii="Tahoma" w:hAnsi="Tahoma" w:cs="Tahoma"/>
+                <w:sz w:val="22"/>
+                <w:szCs w:val="22"/>
+              </w:rPr>
+              <w:t>Mansur Məhsulov</w:t>
+            </w:r>
           </w:p>
         </w:tc>
         <w:tc>
@@ -3947,6 +2683,38 @@
                 <w:szCs w:val="22"/>
               </w:rPr>
             </w:pPr>
+            <w:r>
+              <w:rPr>
+                <w:rFonts w:ascii="Tahoma" w:hAnsi="Tahoma" w:cs="Tahoma"/>
+                <w:sz w:val="22"/>
+                <w:szCs w:val="22"/>
+              </w:rPr>
+              <w:t>“</w:t>
+            </w:r>
+            <w:r>
+              <w:rPr>
+                <w:rFonts w:ascii="Tahoma" w:hAnsi="Tahoma" w:cs="Tahoma"/>
+                <w:sz w:val="22"/>
+                <w:szCs w:val="22"/>
+              </w:rPr>
+              <w:t>Zirvə Agro</w:t>
+            </w:r>
+            <w:r>
+              <w:rPr>
+                <w:rFonts w:ascii="Tahoma" w:hAnsi="Tahoma" w:cs="Tahoma"/>
+                <w:sz w:val="22"/>
+                <w:szCs w:val="22"/>
+              </w:rPr>
+              <w:t>” MMC – ni</w:t>
+            </w:r>
+            <w:r>
+              <w:rPr>
+                <w:rFonts w:ascii="Tahoma" w:hAnsi="Tahoma" w:cs="Tahoma"/>
+                <w:sz w:val="22"/>
+                <w:szCs w:val="22"/>
+              </w:rPr>
+              <w:t>n direktoru</w:t>
+            </w:r>
           </w:p>
         </w:tc>
         <w:tc>
@@ -3962,13 +2730,21 @@
                 <w:szCs w:val="22"/>
               </w:rPr>
             </w:pPr>
+            <w:r>
+              <w:rPr>
+                <w:rFonts w:ascii="Tahoma" w:hAnsi="Tahoma" w:cs="Tahoma"/>
+                <w:sz w:val="22"/>
+                <w:szCs w:val="22"/>
+              </w:rPr>
+              <w:t>Toxum, gübrə, pestisid</w:t>
+            </w:r>
           </w:p>
         </w:tc>
       </w:tr>
     </w:tbl>
     <w:p>
       <w:pPr>
-        <w:pStyle w:val="KonuBal"/>
+        <w:pStyle w:val="a3"/>
         <w:spacing w:after="100"/>
         <w:rPr>
           <w:rFonts w:ascii="Tahoma" w:hAnsi="Tahoma" w:cs="Tahoma"/>
@@ -3982,7 +2758,7 @@
     </w:p>
     <w:p>
       <w:pPr>
-        <w:pStyle w:val="KonuBal"/>
+        <w:pStyle w:val="a3"/>
         <w:numPr>
           <w:ilvl w:val="0"/>
           <w:numId w:val="7"/>
@@ -4072,9 +2848,8 @@
           <w:sz w:val="22"/>
           <w:szCs w:val="22"/>
         </w:rPr>
-        <w:t xml:space="preserve">0- </w:t>
-      </w:r>
-      <w:proofErr w:type="spellStart"/>
+        <w:t>0</w:t>
+      </w:r>
       <w:r>
         <w:rPr>
           <w:rFonts w:ascii="Tahoma" w:hAnsi="Tahoma" w:cs="Tahoma"/>
@@ -4084,9 +2859,8 @@
           <w:sz w:val="22"/>
           <w:szCs w:val="22"/>
         </w:rPr>
-        <w:t>Nahar</w:t>
-      </w:r>
-      <w:proofErr w:type="spellEnd"/>
+        <w:t xml:space="preserve"> </w:t>
+      </w:r>
       <w:r>
         <w:rPr>
           <w:rFonts w:ascii="Tahoma" w:hAnsi="Tahoma" w:cs="Tahoma"/>
@@ -4096,9 +2870,8 @@
           <w:sz w:val="22"/>
           <w:szCs w:val="22"/>
         </w:rPr>
-        <w:t xml:space="preserve"> </w:t>
-      </w:r>
-      <w:proofErr w:type="spellStart"/>
+        <w:t xml:space="preserve">- </w:t>
+      </w:r>
       <w:r>
         <w:rPr>
           <w:rFonts w:ascii="Tahoma" w:hAnsi="Tahoma" w:cs="Tahoma"/>
@@ -4108,24 +2881,12 @@
           <w:sz w:val="22"/>
           <w:szCs w:val="22"/>
         </w:rPr>
-        <w:t>Fasiləsi</w:t>
-      </w:r>
-      <w:proofErr w:type="spellEnd"/>
-      <w:r>
-        <w:rPr>
-          <w:rFonts w:ascii="Tahoma" w:hAnsi="Tahoma" w:cs="Tahoma"/>
-          <w:b/>
-          <w:bCs/>
-          <w:color w:val="538135" w:themeColor="accent6" w:themeShade="BF"/>
-          <w:sz w:val="22"/>
-          <w:szCs w:val="22"/>
-        </w:rPr>
-        <w:t xml:space="preserve"> </w:t>
+        <w:t xml:space="preserve">Nahar Fasiləsi </w:t>
       </w:r>
     </w:p>
     <w:p>
       <w:pPr>
-        <w:pStyle w:val="Balk1"/>
+        <w:pStyle w:val="1"/>
         <w:spacing w:before="400" w:after="200"/>
         <w:rPr>
           <w:rFonts w:ascii="Tahoma" w:hAnsi="Tahoma" w:cs="Tahoma"/>
@@ -4195,7 +2956,6 @@
                 <w:szCs w:val="22"/>
               </w:rPr>
             </w:pPr>
-            <w:proofErr w:type="spellStart"/>
             <w:r>
               <w:rPr>
                 <w:rFonts w:ascii="Tahoma" w:hAnsi="Tahoma" w:cs="Tahoma"/>
@@ -4204,40 +2964,7 @@
                 <w:sz w:val="22"/>
                 <w:szCs w:val="22"/>
               </w:rPr>
-              <w:t>Panelin</w:t>
-            </w:r>
-            <w:proofErr w:type="spellEnd"/>
-            <w:r>
-              <w:rPr>
-                <w:rFonts w:ascii="Tahoma" w:hAnsi="Tahoma" w:cs="Tahoma"/>
-                <w:b/>
-                <w:bCs/>
-                <w:sz w:val="22"/>
-                <w:szCs w:val="22"/>
-              </w:rPr>
-              <w:t xml:space="preserve"> </w:t>
-            </w:r>
-            <w:proofErr w:type="spellStart"/>
-            <w:r>
-              <w:rPr>
-                <w:rFonts w:ascii="Tahoma" w:hAnsi="Tahoma" w:cs="Tahoma"/>
-                <w:b/>
-                <w:bCs/>
-                <w:sz w:val="22"/>
-                <w:szCs w:val="22"/>
-              </w:rPr>
-              <w:t>mövzusu</w:t>
-            </w:r>
-            <w:proofErr w:type="spellEnd"/>
-            <w:r>
-              <w:rPr>
-                <w:rFonts w:ascii="Tahoma" w:hAnsi="Tahoma" w:cs="Tahoma"/>
-                <w:b/>
-                <w:bCs/>
-                <w:sz w:val="22"/>
-                <w:szCs w:val="22"/>
-              </w:rPr>
-              <w:t>:</w:t>
+              <w:t>Panelin mövzusu:</w:t>
             </w:r>
           </w:p>
         </w:tc>
@@ -4267,142 +2994,14 @@
               </w:rPr>
               <w:t>``</w:t>
             </w:r>
-            <w:proofErr w:type="spellStart"/>
-            <w:r>
-              <w:rPr>
-                <w:rFonts w:ascii="Tahoma" w:hAnsi="Tahoma" w:cs="Tahoma"/>
-                <w:sz w:val="22"/>
-                <w:szCs w:val="22"/>
-              </w:rPr>
-              <w:t>Aqrar</w:t>
-            </w:r>
-            <w:proofErr w:type="spellEnd"/>
-            <w:r>
-              <w:rPr>
-                <w:rFonts w:ascii="Tahoma" w:hAnsi="Tahoma" w:cs="Tahoma"/>
-                <w:sz w:val="22"/>
-                <w:szCs w:val="22"/>
-              </w:rPr>
-              <w:t xml:space="preserve"> </w:t>
-            </w:r>
-            <w:proofErr w:type="spellStart"/>
-            <w:r>
-              <w:rPr>
-                <w:rFonts w:ascii="Tahoma" w:hAnsi="Tahoma" w:cs="Tahoma"/>
-                <w:sz w:val="22"/>
-                <w:szCs w:val="22"/>
-              </w:rPr>
-              <w:t>sahədə</w:t>
-            </w:r>
-            <w:proofErr w:type="spellEnd"/>
-            <w:r>
-              <w:rPr>
-                <w:rFonts w:ascii="Tahoma" w:hAnsi="Tahoma" w:cs="Tahoma"/>
-                <w:sz w:val="22"/>
-                <w:szCs w:val="22"/>
-              </w:rPr>
-              <w:t xml:space="preserve"> </w:t>
-            </w:r>
-            <w:proofErr w:type="spellStart"/>
-            <w:r>
-              <w:rPr>
-                <w:rFonts w:ascii="Tahoma" w:hAnsi="Tahoma" w:cs="Tahoma"/>
-                <w:sz w:val="22"/>
-                <w:szCs w:val="22"/>
-              </w:rPr>
-              <w:t>daxili</w:t>
-            </w:r>
-            <w:proofErr w:type="spellEnd"/>
-            <w:r>
-              <w:rPr>
-                <w:rFonts w:ascii="Tahoma" w:hAnsi="Tahoma" w:cs="Tahoma"/>
-                <w:sz w:val="22"/>
-                <w:szCs w:val="22"/>
-              </w:rPr>
-              <w:t xml:space="preserve"> </w:t>
-            </w:r>
-            <w:proofErr w:type="spellStart"/>
-            <w:r>
-              <w:rPr>
-                <w:rFonts w:ascii="Tahoma" w:hAnsi="Tahoma" w:cs="Tahoma"/>
-                <w:sz w:val="22"/>
-                <w:szCs w:val="22"/>
-              </w:rPr>
-              <w:t>və</w:t>
-            </w:r>
-            <w:proofErr w:type="spellEnd"/>
-            <w:r>
-              <w:rPr>
-                <w:rFonts w:ascii="Tahoma" w:hAnsi="Tahoma" w:cs="Tahoma"/>
-                <w:sz w:val="22"/>
-                <w:szCs w:val="22"/>
-              </w:rPr>
-              <w:t xml:space="preserve"> </w:t>
-            </w:r>
-            <w:proofErr w:type="spellStart"/>
-            <w:r>
-              <w:rPr>
-                <w:rFonts w:ascii="Tahoma" w:hAnsi="Tahoma" w:cs="Tahoma"/>
-                <w:sz w:val="22"/>
-                <w:szCs w:val="22"/>
-              </w:rPr>
-              <w:t>xarici</w:t>
-            </w:r>
-            <w:proofErr w:type="spellEnd"/>
-            <w:r>
-              <w:rPr>
-                <w:rFonts w:ascii="Tahoma" w:hAnsi="Tahoma" w:cs="Tahoma"/>
-                <w:sz w:val="22"/>
-                <w:szCs w:val="22"/>
-              </w:rPr>
-              <w:t xml:space="preserve"> </w:t>
-            </w:r>
-            <w:proofErr w:type="spellStart"/>
-            <w:r>
-              <w:rPr>
-                <w:rFonts w:ascii="Tahoma" w:hAnsi="Tahoma" w:cs="Tahoma"/>
-                <w:sz w:val="22"/>
-                <w:szCs w:val="22"/>
-              </w:rPr>
-              <w:t>bazarlara</w:t>
-            </w:r>
-            <w:proofErr w:type="spellEnd"/>
-            <w:r>
-              <w:rPr>
-                <w:rFonts w:ascii="Tahoma" w:hAnsi="Tahoma" w:cs="Tahoma"/>
-                <w:sz w:val="22"/>
-                <w:szCs w:val="22"/>
-              </w:rPr>
-              <w:t xml:space="preserve"> </w:t>
-            </w:r>
-            <w:proofErr w:type="spellStart"/>
-            <w:r>
-              <w:rPr>
-                <w:rFonts w:ascii="Tahoma" w:hAnsi="Tahoma" w:cs="Tahoma"/>
-                <w:sz w:val="22"/>
-                <w:szCs w:val="22"/>
-              </w:rPr>
-              <w:t>çıxışın</w:t>
-            </w:r>
-            <w:proofErr w:type="spellEnd"/>
-            <w:r>
-              <w:rPr>
-                <w:rFonts w:ascii="Tahoma" w:hAnsi="Tahoma" w:cs="Tahoma"/>
-                <w:sz w:val="22"/>
-                <w:szCs w:val="22"/>
-              </w:rPr>
-              <w:t xml:space="preserve"> </w:t>
-            </w:r>
-            <w:proofErr w:type="spellStart"/>
-            <w:r>
-              <w:rPr>
-                <w:rFonts w:ascii="Tahoma" w:hAnsi="Tahoma" w:cs="Tahoma"/>
-                <w:sz w:val="22"/>
-                <w:szCs w:val="22"/>
-              </w:rPr>
-              <w:t>asanlaşdırılması</w:t>
-            </w:r>
-            <w:proofErr w:type="spellEnd"/>
+            <w:r>
+              <w:rPr>
+                <w:rFonts w:ascii="Tahoma" w:hAnsi="Tahoma" w:cs="Tahoma"/>
+                <w:sz w:val="22"/>
+                <w:szCs w:val="22"/>
+              </w:rPr>
+              <w:t>Aqrar sahədə daxili və xarici bazarlara çıxışın asanlaşdırılması</w:t>
+            </w:r>
             <w:r>
               <w:rPr>
                 <w:rFonts w:ascii="Tahoma" w:hAnsi="Tahoma" w:cs="Tahoma"/>
@@ -4464,6 +3063,22 @@
                 <w:szCs w:val="22"/>
               </w:rPr>
             </w:pPr>
+            <w:r>
+              <w:rPr>
+                <w:rFonts w:ascii="Tahoma" w:hAnsi="Tahoma" w:cs="Tahoma"/>
+                <w:sz w:val="22"/>
+                <w:szCs w:val="22"/>
+              </w:rPr>
+              <w:t xml:space="preserve"> Ziya Hacılı - </w:t>
+            </w:r>
+            <w:r>
+              <w:rPr>
+                <w:rFonts w:ascii="Tahoma" w:hAnsi="Tahoma" w:cs="Tahoma"/>
+                <w:sz w:val="22"/>
+                <w:szCs w:val="22"/>
+              </w:rPr>
+              <w:t>Azərbaycan Sahibkarlar Konfederasiyasının (ASK) Baş katibi</w:t>
+            </w:r>
           </w:p>
         </w:tc>
       </w:tr>
@@ -4487,7 +3102,6 @@
                 <w:szCs w:val="22"/>
               </w:rPr>
             </w:pPr>
-            <w:proofErr w:type="spellStart"/>
             <w:r>
               <w:rPr>
                 <w:rFonts w:ascii="Tahoma" w:hAnsi="Tahoma" w:cs="Tahoma"/>
@@ -4496,18 +3110,7 @@
                 <w:sz w:val="22"/>
                 <w:szCs w:val="22"/>
               </w:rPr>
-              <w:t>Vaxt</w:t>
-            </w:r>
-            <w:proofErr w:type="spellEnd"/>
-            <w:r>
-              <w:rPr>
-                <w:rFonts w:ascii="Tahoma" w:hAnsi="Tahoma" w:cs="Tahoma"/>
-                <w:b/>
-                <w:bCs/>
-                <w:sz w:val="22"/>
-                <w:szCs w:val="22"/>
-              </w:rPr>
-              <w:t>:</w:t>
+              <w:t>Vaxt:</w:t>
             </w:r>
           </w:p>
         </w:tc>
@@ -4550,7 +3153,6 @@
           <w:szCs w:val="22"/>
         </w:rPr>
       </w:pPr>
-      <w:proofErr w:type="spellStart"/>
       <w:r>
         <w:rPr>
           <w:rFonts w:ascii="Tahoma" w:hAnsi="Tahoma" w:cs="Tahoma"/>
@@ -4559,18 +3161,7 @@
           <w:sz w:val="22"/>
           <w:szCs w:val="22"/>
         </w:rPr>
-        <w:t>Spikerlər</w:t>
-      </w:r>
-      <w:proofErr w:type="spellEnd"/>
-      <w:r>
-        <w:rPr>
-          <w:rFonts w:ascii="Tahoma" w:hAnsi="Tahoma" w:cs="Tahoma"/>
-          <w:b/>
-          <w:bCs/>
-          <w:sz w:val="22"/>
-          <w:szCs w:val="22"/>
-        </w:rPr>
-        <w:t>:</w:t>
+        <w:t>Spikerlər:</w:t>
       </w:r>
     </w:p>
     <w:tbl>
@@ -4664,21 +3255,8 @@
                 <w:sz w:val="22"/>
                 <w:szCs w:val="22"/>
               </w:rPr>
-              <w:t xml:space="preserve">Ad </w:t>
-            </w:r>
-            <w:proofErr w:type="spellStart"/>
-            <w:r>
-              <w:rPr>
-                <w:rFonts w:ascii="Tahoma" w:hAnsi="Tahoma" w:cs="Tahoma"/>
-                <w:b/>
-                <w:bCs/>
-                <w:color w:val="FFFFFF"/>
-                <w:sz w:val="22"/>
-                <w:szCs w:val="22"/>
-              </w:rPr>
-              <w:t>Soyad</w:t>
-            </w:r>
-            <w:proofErr w:type="spellEnd"/>
+              <w:t>Ad Soyad</w:t>
+            </w:r>
           </w:p>
         </w:tc>
         <w:tc>
@@ -4702,7 +3280,6 @@
                 <w:szCs w:val="22"/>
               </w:rPr>
             </w:pPr>
-            <w:proofErr w:type="spellStart"/>
             <w:r>
               <w:rPr>
                 <w:rFonts w:ascii="Tahoma" w:hAnsi="Tahoma" w:cs="Tahoma"/>
@@ -4712,33 +3289,8 @@
                 <w:sz w:val="22"/>
                 <w:szCs w:val="22"/>
               </w:rPr>
-              <w:t>Şirkət</w:t>
-            </w:r>
-            <w:proofErr w:type="spellEnd"/>
-            <w:r>
-              <w:rPr>
-                <w:rFonts w:ascii="Tahoma" w:hAnsi="Tahoma" w:cs="Tahoma"/>
-                <w:b/>
-                <w:bCs/>
-                <w:color w:val="FFFFFF"/>
-                <w:sz w:val="22"/>
-                <w:szCs w:val="22"/>
-              </w:rPr>
-              <w:t xml:space="preserve"> / </w:t>
-            </w:r>
-            <w:proofErr w:type="spellStart"/>
-            <w:r>
-              <w:rPr>
-                <w:rFonts w:ascii="Tahoma" w:hAnsi="Tahoma" w:cs="Tahoma"/>
-                <w:b/>
-                <w:bCs/>
-                <w:color w:val="FFFFFF"/>
-                <w:sz w:val="22"/>
-                <w:szCs w:val="22"/>
-              </w:rPr>
-              <w:t>Təşkilat</w:t>
-            </w:r>
-            <w:proofErr w:type="spellEnd"/>
+              <w:t>Şirkət / Təşkilat</w:t>
+            </w:r>
           </w:p>
         </w:tc>
         <w:tc>
@@ -4762,7 +3314,6 @@
                 <w:szCs w:val="22"/>
               </w:rPr>
             </w:pPr>
-            <w:proofErr w:type="spellStart"/>
             <w:r>
               <w:rPr>
                 <w:rFonts w:ascii="Tahoma" w:hAnsi="Tahoma" w:cs="Tahoma"/>
@@ -4772,33 +3323,8 @@
                 <w:sz w:val="22"/>
                 <w:szCs w:val="22"/>
               </w:rPr>
-              <w:t>Spikerin</w:t>
-            </w:r>
-            <w:proofErr w:type="spellEnd"/>
-            <w:r>
-              <w:rPr>
-                <w:rFonts w:ascii="Tahoma" w:hAnsi="Tahoma" w:cs="Tahoma"/>
-                <w:b/>
-                <w:bCs/>
-                <w:color w:val="FFFFFF"/>
-                <w:sz w:val="22"/>
-                <w:szCs w:val="22"/>
-              </w:rPr>
-              <w:t xml:space="preserve"> </w:t>
-            </w:r>
-            <w:proofErr w:type="spellStart"/>
-            <w:r>
-              <w:rPr>
-                <w:rFonts w:ascii="Tahoma" w:hAnsi="Tahoma" w:cs="Tahoma"/>
-                <w:b/>
-                <w:bCs/>
-                <w:color w:val="FFFFFF"/>
-                <w:sz w:val="22"/>
-                <w:szCs w:val="22"/>
-              </w:rPr>
-              <w:t>mövzusu</w:t>
-            </w:r>
-            <w:proofErr w:type="spellEnd"/>
+              <w:t>Spikerin mövzusu</w:t>
+            </w:r>
           </w:p>
         </w:tc>
       </w:tr>
@@ -4852,23 +3378,13 @@
                 <w:szCs w:val="22"/>
               </w:rPr>
             </w:pPr>
-            <w:proofErr w:type="spellStart"/>
-            <w:r>
-              <w:rPr>
-                <w:rFonts w:ascii="Tahoma" w:hAnsi="Tahoma" w:cs="Tahoma"/>
-                <w:sz w:val="22"/>
-                <w:szCs w:val="22"/>
-              </w:rPr>
-              <w:t>Vidadi</w:t>
-            </w:r>
-            <w:proofErr w:type="spellEnd"/>
-            <w:r>
-              <w:rPr>
-                <w:rFonts w:ascii="Tahoma" w:hAnsi="Tahoma" w:cs="Tahoma"/>
-                <w:sz w:val="22"/>
-                <w:szCs w:val="22"/>
-              </w:rPr>
-              <w:t xml:space="preserve"> Məmmədov</w:t>
+            <w:r>
+              <w:rPr>
+                <w:rFonts w:ascii="Tahoma" w:hAnsi="Tahoma" w:cs="Tahoma"/>
+                <w:sz w:val="22"/>
+                <w:szCs w:val="22"/>
+              </w:rPr>
+              <w:t>Vidadi Məmmədov</w:t>
             </w:r>
           </w:p>
         </w:tc>
@@ -4891,34 +3407,38 @@
                 <w:szCs w:val="22"/>
               </w:rPr>
             </w:pPr>
-            <w:proofErr w:type="spellStart"/>
-            <w:r>
-              <w:rPr>
-                <w:rFonts w:ascii="Tahoma" w:hAnsi="Tahoma" w:cs="Tahoma"/>
-                <w:sz w:val="22"/>
-                <w:szCs w:val="22"/>
-              </w:rPr>
-              <w:t>Agrounion</w:t>
-            </w:r>
-            <w:proofErr w:type="spellEnd"/>
-            <w:r>
-              <w:rPr>
-                <w:rFonts w:ascii="Tahoma" w:hAnsi="Tahoma" w:cs="Tahoma"/>
-                <w:sz w:val="22"/>
-                <w:szCs w:val="22"/>
-              </w:rPr>
-              <w:t xml:space="preserve">-un </w:t>
-            </w:r>
-            <w:proofErr w:type="spellStart"/>
-            <w:r>
-              <w:rPr>
-                <w:rFonts w:ascii="Tahoma" w:hAnsi="Tahoma" w:cs="Tahoma"/>
-                <w:sz w:val="22"/>
-                <w:szCs w:val="22"/>
-              </w:rPr>
-              <w:t>direktoru</w:t>
-            </w:r>
-            <w:proofErr w:type="spellEnd"/>
+            <w:r>
+              <w:rPr>
+                <w:rFonts w:ascii="Tahoma" w:hAnsi="Tahoma" w:cs="Tahoma"/>
+                <w:sz w:val="22"/>
+                <w:szCs w:val="22"/>
+              </w:rPr>
+              <w:t>“Agro U</w:t>
+            </w:r>
+            <w:r>
+              <w:rPr>
+                <w:rFonts w:ascii="Tahoma" w:hAnsi="Tahoma" w:cs="Tahoma"/>
+                <w:sz w:val="22"/>
+                <w:szCs w:val="22"/>
+              </w:rPr>
+              <w:t>nion</w:t>
+            </w:r>
+            <w:r>
+              <w:rPr>
+                <w:rFonts w:ascii="Tahoma" w:hAnsi="Tahoma" w:cs="Tahoma"/>
+                <w:sz w:val="22"/>
+                <w:szCs w:val="22"/>
+              </w:rPr>
+              <w:t>” MMC-nin</w:t>
+            </w:r>
+            <w:r>
+              <w:rPr>
+                <w:rFonts w:ascii="Tahoma" w:hAnsi="Tahoma" w:cs="Tahoma"/>
+                <w:sz w:val="22"/>
+                <w:szCs w:val="22"/>
+              </w:rPr>
+              <w:t xml:space="preserve"> direktoru</w:t>
+            </w:r>
           </w:p>
         </w:tc>
         <w:tc>
@@ -4940,142 +3460,14 @@
                 <w:szCs w:val="22"/>
               </w:rPr>
             </w:pPr>
-            <w:proofErr w:type="spellStart"/>
-            <w:r>
-              <w:rPr>
-                <w:rFonts w:ascii="Tahoma" w:hAnsi="Tahoma" w:cs="Tahoma"/>
-                <w:sz w:val="22"/>
-                <w:szCs w:val="22"/>
-              </w:rPr>
-              <w:t>Kənd</w:t>
-            </w:r>
-            <w:proofErr w:type="spellEnd"/>
-            <w:r>
-              <w:rPr>
-                <w:rFonts w:ascii="Tahoma" w:hAnsi="Tahoma" w:cs="Tahoma"/>
-                <w:sz w:val="22"/>
-                <w:szCs w:val="22"/>
-              </w:rPr>
-              <w:t xml:space="preserve"> </w:t>
-            </w:r>
-            <w:proofErr w:type="spellStart"/>
-            <w:r>
-              <w:rPr>
-                <w:rFonts w:ascii="Tahoma" w:hAnsi="Tahoma" w:cs="Tahoma"/>
-                <w:sz w:val="22"/>
-                <w:szCs w:val="22"/>
-              </w:rPr>
-              <w:t>təsərrüfatı</w:t>
-            </w:r>
-            <w:proofErr w:type="spellEnd"/>
-            <w:r>
-              <w:rPr>
-                <w:rFonts w:ascii="Tahoma" w:hAnsi="Tahoma" w:cs="Tahoma"/>
-                <w:sz w:val="22"/>
-                <w:szCs w:val="22"/>
-              </w:rPr>
-              <w:t xml:space="preserve"> </w:t>
-            </w:r>
-            <w:proofErr w:type="spellStart"/>
-            <w:r>
-              <w:rPr>
-                <w:rFonts w:ascii="Tahoma" w:hAnsi="Tahoma" w:cs="Tahoma"/>
-                <w:sz w:val="22"/>
-                <w:szCs w:val="22"/>
-              </w:rPr>
-              <w:t>istehsalçılarından</w:t>
-            </w:r>
-            <w:proofErr w:type="spellEnd"/>
-            <w:r>
-              <w:rPr>
-                <w:rFonts w:ascii="Tahoma" w:hAnsi="Tahoma" w:cs="Tahoma"/>
-                <w:sz w:val="22"/>
-                <w:szCs w:val="22"/>
-              </w:rPr>
-              <w:t xml:space="preserve"> </w:t>
-            </w:r>
-            <w:proofErr w:type="spellStart"/>
-            <w:r>
-              <w:rPr>
-                <w:rFonts w:ascii="Tahoma" w:hAnsi="Tahoma" w:cs="Tahoma"/>
-                <w:sz w:val="22"/>
-                <w:szCs w:val="22"/>
-              </w:rPr>
-              <w:t>istehlakçılara</w:t>
-            </w:r>
-            <w:proofErr w:type="spellEnd"/>
-            <w:r>
-              <w:rPr>
-                <w:rFonts w:ascii="Tahoma" w:hAnsi="Tahoma" w:cs="Tahoma"/>
-                <w:sz w:val="22"/>
-                <w:szCs w:val="22"/>
-              </w:rPr>
-              <w:t xml:space="preserve"> </w:t>
-            </w:r>
-            <w:proofErr w:type="spellStart"/>
-            <w:r>
-              <w:rPr>
-                <w:rFonts w:ascii="Tahoma" w:hAnsi="Tahoma" w:cs="Tahoma"/>
-                <w:sz w:val="22"/>
-                <w:szCs w:val="22"/>
-              </w:rPr>
-              <w:t>birbaşa</w:t>
-            </w:r>
-            <w:proofErr w:type="spellEnd"/>
-            <w:r>
-              <w:rPr>
-                <w:rFonts w:ascii="Tahoma" w:hAnsi="Tahoma" w:cs="Tahoma"/>
-                <w:sz w:val="22"/>
-                <w:szCs w:val="22"/>
-              </w:rPr>
-              <w:t xml:space="preserve"> </w:t>
-            </w:r>
-            <w:proofErr w:type="spellStart"/>
-            <w:r>
-              <w:rPr>
-                <w:rFonts w:ascii="Tahoma" w:hAnsi="Tahoma" w:cs="Tahoma"/>
-                <w:sz w:val="22"/>
-                <w:szCs w:val="22"/>
-              </w:rPr>
-              <w:t>çıxış</w:t>
-            </w:r>
-            <w:proofErr w:type="spellEnd"/>
-            <w:r>
-              <w:rPr>
-                <w:rFonts w:ascii="Tahoma" w:hAnsi="Tahoma" w:cs="Tahoma"/>
-                <w:sz w:val="22"/>
-                <w:szCs w:val="22"/>
-              </w:rPr>
-              <w:t xml:space="preserve"> </w:t>
-            </w:r>
-            <w:proofErr w:type="spellStart"/>
-            <w:r>
-              <w:rPr>
-                <w:rFonts w:ascii="Tahoma" w:hAnsi="Tahoma" w:cs="Tahoma"/>
-                <w:sz w:val="22"/>
-                <w:szCs w:val="22"/>
-              </w:rPr>
-              <w:t>mexanizmlərinin</w:t>
-            </w:r>
-            <w:proofErr w:type="spellEnd"/>
-            <w:r>
-              <w:rPr>
-                <w:rFonts w:ascii="Tahoma" w:hAnsi="Tahoma" w:cs="Tahoma"/>
-                <w:sz w:val="22"/>
-                <w:szCs w:val="22"/>
-              </w:rPr>
-              <w:t xml:space="preserve"> </w:t>
-            </w:r>
-            <w:proofErr w:type="spellStart"/>
-            <w:r>
-              <w:rPr>
-                <w:rFonts w:ascii="Tahoma" w:hAnsi="Tahoma" w:cs="Tahoma"/>
-                <w:sz w:val="22"/>
-                <w:szCs w:val="22"/>
-              </w:rPr>
-              <w:t>inkişafi</w:t>
-            </w:r>
-            <w:proofErr w:type="spellEnd"/>
+            <w:r>
+              <w:rPr>
+                <w:rFonts w:ascii="Tahoma" w:hAnsi="Tahoma" w:cs="Tahoma"/>
+                <w:sz w:val="22"/>
+                <w:szCs w:val="22"/>
+              </w:rPr>
+              <w:t>Kənd təsərrüfatı istehsalçılarından istehlakçılara birbaşa çıxış mexanizmlərinin inkişafi</w:t>
+            </w:r>
           </w:p>
         </w:tc>
       </w:tr>
@@ -5106,6 +3498,7 @@
                 <w:sz w:val="22"/>
                 <w:szCs w:val="22"/>
               </w:rPr>
+              <w:lastRenderedPageBreak/>
               <w:t>2</w:t>
             </w:r>
           </w:p>
@@ -5129,6 +3522,14 @@
                 <w:szCs w:val="22"/>
               </w:rPr>
             </w:pPr>
+            <w:r>
+              <w:rPr>
+                <w:rFonts w:ascii="Tahoma" w:hAnsi="Tahoma" w:cs="Tahoma"/>
+                <w:sz w:val="22"/>
+                <w:szCs w:val="22"/>
+              </w:rPr>
+              <w:t xml:space="preserve">Kağan Hişim </w:t>
+            </w:r>
           </w:p>
         </w:tc>
         <w:tc>
@@ -5150,6 +3551,22 @@
                 <w:szCs w:val="22"/>
               </w:rPr>
             </w:pPr>
+            <w:r>
+              <w:rPr>
+                <w:rFonts w:ascii="Tahoma" w:hAnsi="Tahoma" w:cs="Tahoma"/>
+                <w:sz w:val="22"/>
+                <w:szCs w:val="22"/>
+              </w:rPr>
+              <w:t>Sezer tarım ve sağım t</w:t>
+            </w:r>
+            <w:r>
+              <w:rPr>
+                <w:rFonts w:ascii="Tahoma" w:hAnsi="Tahoma" w:cs="Tahoma"/>
+                <w:sz w:val="22"/>
+                <w:szCs w:val="22"/>
+              </w:rPr>
+              <w:t>eknolojileri yöneticisi</w:t>
+            </w:r>
           </w:p>
         </w:tc>
         <w:tc>
@@ -5171,6 +3588,14 @@
                 <w:szCs w:val="22"/>
               </w:rPr>
             </w:pPr>
+            <w:r>
+              <w:rPr>
+                <w:rFonts w:ascii="Tahoma" w:hAnsi="Tahoma" w:cs="Tahoma"/>
+                <w:sz w:val="22"/>
+                <w:szCs w:val="22"/>
+              </w:rPr>
+              <w:t>Azerbeycan - Türkiye iş birliği ile gıda güvenliği için ortak üretim modeli</w:t>
+            </w:r>
           </w:p>
         </w:tc>
       </w:tr>
@@ -5224,6 +3649,22 @@
                 <w:szCs w:val="22"/>
               </w:rPr>
             </w:pPr>
+            <w:r>
+              <w:rPr>
+                <w:rFonts w:ascii="Tahoma" w:hAnsi="Tahoma" w:cs="Tahoma"/>
+                <w:sz w:val="22"/>
+                <w:szCs w:val="22"/>
+              </w:rPr>
+              <w:t>Younus Sandeela</w:t>
+            </w:r>
+            <w:r>
+              <w:rPr>
+                <w:rFonts w:ascii="Tahoma" w:hAnsi="Tahoma" w:cs="Tahoma"/>
+                <w:sz w:val="22"/>
+                <w:szCs w:val="22"/>
+              </w:rPr>
+              <w:t xml:space="preserve"> </w:t>
+            </w:r>
           </w:p>
         </w:tc>
         <w:tc>
@@ -5245,6 +3686,14 @@
                 <w:szCs w:val="22"/>
               </w:rPr>
             </w:pPr>
+            <w:r>
+              <w:rPr>
+                <w:rFonts w:ascii="Tahoma" w:hAnsi="Tahoma" w:cs="Tahoma"/>
+                <w:sz w:val="22"/>
+                <w:szCs w:val="22"/>
+              </w:rPr>
+              <w:t>Farmwell CEO</w:t>
+            </w:r>
           </w:p>
         </w:tc>
         <w:tc>
@@ -5266,6 +3715,14 @@
                 <w:szCs w:val="22"/>
               </w:rPr>
             </w:pPr>
+            <w:r>
+              <w:rPr>
+                <w:rFonts w:ascii="Tahoma" w:hAnsi="Tahoma" w:cs="Tahoma"/>
+                <w:sz w:val="22"/>
+                <w:szCs w:val="22"/>
+              </w:rPr>
+              <w:t>Farmers’ Cooperatives: A Pathway to Stronger Market Access for Farmers</w:t>
+            </w:r>
           </w:p>
         </w:tc>
       </w:tr>
@@ -5319,6 +3776,14 @@
                 <w:szCs w:val="22"/>
               </w:rPr>
             </w:pPr>
+            <w:r>
+              <w:rPr>
+                <w:rFonts w:ascii="Tahoma" w:hAnsi="Tahoma" w:cs="Tahoma"/>
+                <w:sz w:val="22"/>
+                <w:szCs w:val="22"/>
+              </w:rPr>
+              <w:t>Ülvi Ocaqlı</w:t>
+            </w:r>
           </w:p>
         </w:tc>
         <w:tc>
@@ -5340,6 +3805,41 @@
                 <w:szCs w:val="22"/>
               </w:rPr>
             </w:pPr>
+            <w:r>
+              <w:rPr>
+                <w:rStyle w:val="inqyif"/>
+                <w:rFonts w:ascii="Tahoma" w:hAnsi="Tahoma" w:cs="Tahoma"/>
+                <w:sz w:val="22"/>
+                <w:szCs w:val="22"/>
+              </w:rPr>
+              <w:t>“</w:t>
+            </w:r>
+            <w:r>
+              <w:rPr>
+                <w:rStyle w:val="inqyif"/>
+                <w:rFonts w:ascii="Tahoma" w:hAnsi="Tahoma" w:cs="Tahoma"/>
+                <w:sz w:val="22"/>
+                <w:szCs w:val="22"/>
+              </w:rPr>
+              <w:t>Sara Logistics</w:t>
+            </w:r>
+            <w:r>
+              <w:rPr>
+                <w:rStyle w:val="inqyif"/>
+                <w:rFonts w:ascii="Tahoma" w:hAnsi="Tahoma" w:cs="Tahoma"/>
+                <w:sz w:val="22"/>
+                <w:szCs w:val="22"/>
+              </w:rPr>
+              <w:t>”</w:t>
+            </w:r>
+            <w:r>
+              <w:rPr>
+                <w:rFonts w:ascii="Tahoma" w:hAnsi="Tahoma" w:cs="Tahoma"/>
+                <w:sz w:val="22"/>
+                <w:szCs w:val="22"/>
+              </w:rPr>
+              <w:t xml:space="preserve"> şirkətinin rəhbəri</w:t>
+            </w:r>
           </w:p>
         </w:tc>
         <w:tc>
@@ -5361,13 +3861,21 @@
                 <w:szCs w:val="22"/>
               </w:rPr>
             </w:pPr>
+            <w:r>
+              <w:rPr>
+                <w:rFonts w:ascii="Tahoma" w:hAnsi="Tahoma" w:cs="Tahoma"/>
+                <w:sz w:val="22"/>
+                <w:szCs w:val="22"/>
+              </w:rPr>
+              <w:t>Aqrar Sahədə Bazarlara Çıxış: Müasir Loqistika və Tədarük Zənciri Həlləri</w:t>
+            </w:r>
           </w:p>
         </w:tc>
       </w:tr>
     </w:tbl>
     <w:p>
       <w:pPr>
-        <w:pStyle w:val="KonuBal"/>
+        <w:pStyle w:val="a3"/>
         <w:spacing w:after="100"/>
         <w:ind w:left="720"/>
         <w:rPr>
@@ -5382,7 +3890,7 @@
     </w:p>
     <w:p>
       <w:pPr>
-        <w:pStyle w:val="KonuBal"/>
+        <w:pStyle w:val="a3"/>
         <w:numPr>
           <w:ilvl w:val="0"/>
           <w:numId w:val="7"/>
@@ -5403,7 +3911,7 @@
           <w:sz w:val="22"/>
           <w:szCs w:val="22"/>
         </w:rPr>
-        <w:t>1</w:t>
+        <w:t xml:space="preserve">15`30-17`00- </w:t>
       </w:r>
       <w:r>
         <w:rPr>
@@ -5414,167 +3922,7 @@
           <w:sz w:val="22"/>
           <w:szCs w:val="22"/>
         </w:rPr>
-        <w:t>5</w:t>
-      </w:r>
-      <w:r>
-        <w:rPr>
-          <w:rFonts w:ascii="Tahoma" w:hAnsi="Tahoma" w:cs="Tahoma"/>
-          <w:b/>
-          <w:bCs/>
-          <w:color w:val="538135" w:themeColor="accent6" w:themeShade="BF"/>
-          <w:sz w:val="22"/>
-          <w:szCs w:val="22"/>
-        </w:rPr>
-        <w:t>`</w:t>
-      </w:r>
-      <w:r>
-        <w:rPr>
-          <w:rFonts w:ascii="Tahoma" w:hAnsi="Tahoma" w:cs="Tahoma"/>
-          <w:b/>
-          <w:bCs/>
-          <w:color w:val="538135" w:themeColor="accent6" w:themeShade="BF"/>
-          <w:sz w:val="22"/>
-          <w:szCs w:val="22"/>
-        </w:rPr>
-        <w:t>3</w:t>
-      </w:r>
-      <w:r>
-        <w:rPr>
-          <w:rFonts w:ascii="Tahoma" w:hAnsi="Tahoma" w:cs="Tahoma"/>
-          <w:b/>
-          <w:bCs/>
-          <w:color w:val="538135" w:themeColor="accent6" w:themeShade="BF"/>
-          <w:sz w:val="22"/>
-          <w:szCs w:val="22"/>
-        </w:rPr>
-        <w:t>0-1</w:t>
-      </w:r>
-      <w:r>
-        <w:rPr>
-          <w:rFonts w:ascii="Tahoma" w:hAnsi="Tahoma" w:cs="Tahoma"/>
-          <w:b/>
-          <w:bCs/>
-          <w:color w:val="538135" w:themeColor="accent6" w:themeShade="BF"/>
-          <w:sz w:val="22"/>
-          <w:szCs w:val="22"/>
-        </w:rPr>
-        <w:t>7</w:t>
-      </w:r>
-      <w:r>
-        <w:rPr>
-          <w:rFonts w:ascii="Tahoma" w:hAnsi="Tahoma" w:cs="Tahoma"/>
-          <w:b/>
-          <w:bCs/>
-          <w:color w:val="538135" w:themeColor="accent6" w:themeShade="BF"/>
-          <w:sz w:val="22"/>
-          <w:szCs w:val="22"/>
-        </w:rPr>
-        <w:t>`</w:t>
-      </w:r>
-      <w:r>
-        <w:rPr>
-          <w:rFonts w:ascii="Tahoma" w:hAnsi="Tahoma" w:cs="Tahoma"/>
-          <w:b/>
-          <w:bCs/>
-          <w:color w:val="538135" w:themeColor="accent6" w:themeShade="BF"/>
-          <w:sz w:val="22"/>
-          <w:szCs w:val="22"/>
-        </w:rPr>
-        <w:t>0</w:t>
-      </w:r>
-      <w:r>
-        <w:rPr>
-          <w:rFonts w:ascii="Tahoma" w:hAnsi="Tahoma" w:cs="Tahoma"/>
-          <w:b/>
-          <w:bCs/>
-          <w:color w:val="538135" w:themeColor="accent6" w:themeShade="BF"/>
-          <w:sz w:val="22"/>
-          <w:szCs w:val="22"/>
-        </w:rPr>
-        <w:t xml:space="preserve">0- </w:t>
-      </w:r>
-      <w:r>
-        <w:rPr>
-          <w:rFonts w:ascii="Tahoma" w:hAnsi="Tahoma" w:cs="Tahoma"/>
-          <w:b/>
-          <w:bCs/>
-          <w:color w:val="538135" w:themeColor="accent6" w:themeShade="BF"/>
-          <w:sz w:val="22"/>
-          <w:szCs w:val="22"/>
-        </w:rPr>
-        <w:t>Çay-</w:t>
-      </w:r>
-      <w:proofErr w:type="spellStart"/>
-      <w:r>
-        <w:rPr>
-          <w:rFonts w:ascii="Tahoma" w:hAnsi="Tahoma" w:cs="Tahoma"/>
-          <w:b/>
-          <w:bCs/>
-          <w:color w:val="538135" w:themeColor="accent6" w:themeShade="BF"/>
-          <w:sz w:val="22"/>
-          <w:szCs w:val="22"/>
-        </w:rPr>
-        <w:t>kofe</w:t>
-      </w:r>
-      <w:proofErr w:type="spellEnd"/>
-      <w:r>
-        <w:rPr>
-          <w:rFonts w:ascii="Tahoma" w:hAnsi="Tahoma" w:cs="Tahoma"/>
-          <w:b/>
-          <w:bCs/>
-          <w:color w:val="538135" w:themeColor="accent6" w:themeShade="BF"/>
-          <w:sz w:val="22"/>
-          <w:szCs w:val="22"/>
-        </w:rPr>
-        <w:t xml:space="preserve"> </w:t>
-      </w:r>
-      <w:proofErr w:type="spellStart"/>
-      <w:r>
-        <w:rPr>
-          <w:rFonts w:ascii="Tahoma" w:hAnsi="Tahoma" w:cs="Tahoma"/>
-          <w:b/>
-          <w:bCs/>
-          <w:color w:val="538135" w:themeColor="accent6" w:themeShade="BF"/>
-          <w:sz w:val="22"/>
-          <w:szCs w:val="22"/>
-        </w:rPr>
-        <w:t>fasiləsi</w:t>
-      </w:r>
-      <w:proofErr w:type="spellEnd"/>
-      <w:r>
-        <w:rPr>
-          <w:rFonts w:ascii="Tahoma" w:hAnsi="Tahoma" w:cs="Tahoma"/>
-          <w:b/>
-          <w:bCs/>
-          <w:color w:val="538135" w:themeColor="accent6" w:themeShade="BF"/>
-          <w:sz w:val="22"/>
-          <w:szCs w:val="22"/>
-        </w:rPr>
-        <w:t xml:space="preserve">, B2B </w:t>
-      </w:r>
-      <w:proofErr w:type="spellStart"/>
-      <w:r>
-        <w:rPr>
-          <w:rFonts w:ascii="Tahoma" w:hAnsi="Tahoma" w:cs="Tahoma"/>
-          <w:b/>
-          <w:bCs/>
-          <w:color w:val="538135" w:themeColor="accent6" w:themeShade="BF"/>
-          <w:sz w:val="22"/>
-          <w:szCs w:val="22"/>
-        </w:rPr>
-        <w:t>görüşlər</w:t>
-      </w:r>
-      <w:proofErr w:type="spellEnd"/>
-      <w:r>
-        <w:rPr>
-          <w:rFonts w:ascii="Tahoma" w:hAnsi="Tahoma" w:cs="Tahoma"/>
-          <w:b/>
-          <w:bCs/>
-          <w:color w:val="538135" w:themeColor="accent6" w:themeShade="BF"/>
-          <w:sz w:val="22"/>
-          <w:szCs w:val="22"/>
-        </w:rPr>
-        <w:t xml:space="preserve"> </w:t>
+        <w:t xml:space="preserve">Çay-kofe fasiləsi, B2B görüşlər </w:t>
       </w:r>
     </w:p>
     <w:sectPr>
@@ -5588,7 +3936,7 @@
 </file>
 
 <file path=word/endnotes.xml><?xml version="1.0" encoding="utf-8"?>
-<w:endnotes xmlns:wpc="http://schemas.microsoft.com/office/word/2010/wordprocessingCanvas" xmlns:cx="http://schemas.microsoft.com/office/drawing/2014/chartex" xmlns:cx1="http://schemas.microsoft.com/office/drawing/2015/9/8/chartex" xmlns:cx2="http://schemas.microsoft.com/office/drawing/2015/10/21/chartex" xmlns:cx3="http://schemas.microsoft.com/office/drawing/2016/5/9/chartex" xmlns:cx4="http://schemas.microsoft.com/office/drawing/2016/5/10/chartex" xmlns:cx5="http://schemas.microsoft.com/office/drawing/2016/5/11/chartex" xmlns:cx6="http://schemas.microsoft.com/office/drawing/2016/5/12/chartex" xmlns:cx7="http://schemas.microsoft.com/office/drawing/2016/5/13/chartex" xmlns:cx8="http://schemas.microsoft.com/office/drawing/2016/5/14/chartex" xmlns:mc="http://schemas.openxmlformats.org/markup-compatibility/2006" xmlns:m="http://schemas.openxmlformats.org/officeDocument/2006/math" xmlns:aink="http://schemas.microsoft.com/office/drawing/2016/ink" xmlns:am3d="http://schemas.microsoft.com/office/drawing/2017/model3d" xmlns:oel="http://schemas.microsoft.com/office/2019/extlst" xmlns:r="http://schemas.openxmlformats.org/officeDocument/2006/relationships" xmlns:wp14="http://schemas.microsoft.com/office/word/2010/wordprocessingDrawing" xmlns:wp="http://schemas.openxmlformats.org/drawingml/2006/wordprocessingDrawing" xmlns:wpg="http://schemas.microsoft.com/office/word/2010/wordprocessingGroup" xmlns:wpi="http://schemas.microsoft.com/office/word/2010/wordprocessingInk" xmlns:wps="http://schemas.microsoft.com/office/word/2010/wordprocessingShape" xmlns:o="urn:schemas-microsoft-com:office:office" xmlns:v="urn:schemas-microsoft-com:vml" xmlns:w10="urn:schemas-microsoft-com:office:word" xmlns:w="http://schemas.openxmlformats.org/wordprocessingml/2006/main" xmlns:w14="http://schemas.microsoft.com/office/word/2010/wordml" xmlns:w15="http://schemas.microsoft.com/office/word/2012/wordml" xmlns:w16cex="http://schemas.microsoft.com/office/word/2018/wordml/cex" xmlns:w16cid="http://schemas.microsoft.com/office/word/2016/wordml/cid" xmlns:w16="http://schemas.microsoft.com/office/word/2018/wordml" xmlns:w16sdtdh="http://schemas.microsoft.com/office/word/2020/wordml/sdtdatahash" xmlns:w16sdtfl="http://schemas.microsoft.com/office/word/2024/wordml/sdtformatlock" xmlns:w16se="http://schemas.microsoft.com/office/word/2015/wordml/symex" xmlns:w16du="http://schemas.microsoft.com/office/word/2023/wordml/word16du" xmlns:wne="http://schemas.microsoft.com/office/word/2006/wordml" mc:Ignorable="w14 w15 w16se w16cid w16 w16cex w16sdtdh w16sdtfl w16du wp14">
+<w:endnotes xmlns:wpc="http://schemas.microsoft.com/office/word/2010/wordprocessingCanvas" xmlns:cx="http://schemas.microsoft.com/office/drawing/2014/chartex" xmlns:mc="http://schemas.openxmlformats.org/markup-compatibility/2006" xmlns:o="urn:schemas-microsoft-com:office:office" xmlns:r="http://schemas.openxmlformats.org/officeDocument/2006/relationships" xmlns:m="http://schemas.openxmlformats.org/officeDocument/2006/math" xmlns:v="urn:schemas-microsoft-com:vml" xmlns:wp14="http://schemas.microsoft.com/office/word/2010/wordprocessingDrawing" xmlns:wp="http://schemas.openxmlformats.org/drawingml/2006/wordprocessingDrawing" xmlns:w10="urn:schemas-microsoft-com:office:word" xmlns:w="http://schemas.openxmlformats.org/wordprocessingml/2006/main" xmlns:w14="http://schemas.microsoft.com/office/word/2010/wordml" xmlns:w15="http://schemas.microsoft.com/office/word/2012/wordml" xmlns:w16se="http://schemas.microsoft.com/office/word/2015/wordml/symex" xmlns:wpg="http://schemas.microsoft.com/office/word/2010/wordprocessingGroup" xmlns:wpi="http://schemas.microsoft.com/office/word/2010/wordprocessingInk" xmlns:wne="http://schemas.microsoft.com/office/word/2006/wordml" xmlns:wps="http://schemas.microsoft.com/office/word/2010/wordprocessingShape" mc:Ignorable="w14 w15 w16se wp14">
   <w:endnote w:type="separator" w:id="-1">
     <w:p>
       <w:r>
@@ -5607,7 +3955,7 @@
 </file>
 
 <file path=word/footnotes.xml><?xml version="1.0" encoding="utf-8"?>
-<w:footnotes xmlns:wpc="http://schemas.microsoft.com/office/word/2010/wordprocessingCanvas" xmlns:cx="http://schemas.microsoft.com/office/drawing/2014/chartex" xmlns:cx1="http://schemas.microsoft.com/office/drawing/2015/9/8/chartex" xmlns:cx2="http://schemas.microsoft.com/office/drawing/2015/10/21/chartex" xmlns:cx3="http://schemas.microsoft.com/office/drawing/2016/5/9/chartex" xmlns:cx4="http://schemas.microsoft.com/office/drawing/2016/5/10/chartex" xmlns:cx5="http://schemas.microsoft.com/office/drawing/2016/5/11/chartex" xmlns:cx6="http://schemas.microsoft.com/office/drawing/2016/5/12/chartex" xmlns:cx7="http://schemas.microsoft.com/office/drawing/2016/5/13/chartex" xmlns:cx8="http://schemas.microsoft.com/office/drawing/2016/5/14/chartex" xmlns:mc="http://schemas.openxmlformats.org/markup-compatibility/2006" xmlns:m="http://schemas.openxmlformats.org/officeDocument/2006/math" xmlns:aink="http://schemas.microsoft.com/office/drawing/2016/ink" xmlns:am3d="http://schemas.microsoft.com/office/drawing/2017/model3d" xmlns:oel="http://schemas.microsoft.com/office/2019/extlst" xmlns:r="http://schemas.openxmlformats.org/officeDocument/2006/relationships" xmlns:wp14="http://schemas.microsoft.com/office/word/2010/wordprocessingDrawing" xmlns:wp="http://schemas.openxmlformats.org/drawingml/2006/wordprocessingDrawing" xmlns:wpg="http://schemas.microsoft.com/office/word/2010/wordprocessingGroup" xmlns:wpi="http://schemas.microsoft.com/office/word/2010/wordprocessingInk" xmlns:wps="http://schemas.microsoft.com/office/word/2010/wordprocessingShape" xmlns:o="urn:schemas-microsoft-com:office:office" xmlns:v="urn:schemas-microsoft-com:vml" xmlns:w10="urn:schemas-microsoft-com:office:word" xmlns:w="http://schemas.openxmlformats.org/wordprocessingml/2006/main" xmlns:w14="http://schemas.microsoft.com/office/word/2010/wordml" xmlns:w15="http://schemas.microsoft.com/office/word/2012/wordml" xmlns:w16cex="http://schemas.microsoft.com/office/word/2018/wordml/cex" xmlns:w16cid="http://schemas.microsoft.com/office/word/2016/wordml/cid" xmlns:w16="http://schemas.microsoft.com/office/word/2018/wordml" xmlns:w16sdtdh="http://schemas.microsoft.com/office/word/2020/wordml/sdtdatahash" xmlns:w16sdtfl="http://schemas.microsoft.com/office/word/2024/wordml/sdtformatlock" xmlns:w16se="http://schemas.microsoft.com/office/word/2015/wordml/symex" xmlns:w16du="http://schemas.microsoft.com/office/word/2023/wordml/word16du" xmlns:wne="http://schemas.microsoft.com/office/word/2006/wordml" mc:Ignorable="w14 w15 w16se w16cid w16 w16cex w16sdtdh w16sdtfl w16du wp14">
+<w:footnotes xmlns:wpc="http://schemas.microsoft.com/office/word/2010/wordprocessingCanvas" xmlns:cx="http://schemas.microsoft.com/office/drawing/2014/chartex" xmlns:mc="http://schemas.openxmlformats.org/markup-compatibility/2006" xmlns:o="urn:schemas-microsoft-com:office:office" xmlns:r="http://schemas.openxmlformats.org/officeDocument/2006/relationships" xmlns:m="http://schemas.openxmlformats.org/officeDocument/2006/math" xmlns:v="urn:schemas-microsoft-com:vml" xmlns:wp14="http://schemas.microsoft.com/office/word/2010/wordprocessingDrawing" xmlns:wp="http://schemas.openxmlformats.org/drawingml/2006/wordprocessingDrawing" xmlns:w10="urn:schemas-microsoft-com:office:word" xmlns:w="http://schemas.openxmlformats.org/wordprocessingml/2006/main" xmlns:w14="http://schemas.microsoft.com/office/word/2010/wordml" xmlns:w15="http://schemas.microsoft.com/office/word/2012/wordml" xmlns:w16se="http://schemas.microsoft.com/office/word/2015/wordml/symex" xmlns:wpg="http://schemas.microsoft.com/office/word/2010/wordprocessingGroup" xmlns:wpi="http://schemas.microsoft.com/office/word/2010/wordprocessingInk" xmlns:wne="http://schemas.microsoft.com/office/word/2006/wordml" xmlns:wps="http://schemas.microsoft.com/office/word/2010/wordprocessingShape" mc:Ignorable="w14 w15 w16se wp14">
   <w:footnote w:type="separator" w:id="-1">
     <w:p>
       <w:r>
@@ -5626,10 +3974,10 @@
 </file>
 
 <file path=word/numbering.xml><?xml version="1.0" encoding="utf-8"?>
-<w:numbering xmlns:wpc="http://schemas.microsoft.com/office/word/2010/wordprocessingCanvas" xmlns:cx="http://schemas.microsoft.com/office/drawing/2014/chartex" xmlns:cx1="http://schemas.microsoft.com/office/drawing/2015/9/8/chartex" xmlns:cx2="http://schemas.microsoft.com/office/drawing/2015/10/21/chartex" xmlns:cx3="http://schemas.microsoft.com/office/drawing/2016/5/9/chartex" xmlns:cx4="http://schemas.microsoft.com/office/drawing/2016/5/10/chartex" xmlns:cx5="http://schemas.microsoft.com/office/drawing/2016/5/11/chartex" xmlns:cx6="http://schemas.microsoft.com/office/drawing/2016/5/12/chartex" xmlns:cx7="http://schemas.microsoft.com/office/drawing/2016/5/13/chartex" xmlns:cx8="http://schemas.microsoft.com/office/drawing/2016/5/14/chartex" xmlns:mc="http://schemas.openxmlformats.org/markup-compatibility/2006" xmlns:m="http://schemas.openxmlformats.org/officeDocument/2006/math" xmlns:aink="http://schemas.microsoft.com/office/drawing/2016/ink" xmlns:am3d="http://schemas.microsoft.com/office/drawing/2017/model3d" xmlns:oel="http://schemas.microsoft.com/office/2019/extlst" xmlns:r="http://schemas.openxmlformats.org/officeDocument/2006/relationships" xmlns:wp14="http://schemas.microsoft.com/office/word/2010/wordprocessingDrawing" xmlns:wp="http://schemas.openxmlformats.org/drawingml/2006/wordprocessingDrawing" xmlns:wpg="http://schemas.microsoft.com/office/word/2010/wordprocessingGroup" xmlns:wpi="http://schemas.microsoft.com/office/word/2010/wordprocessingInk" xmlns:wps="http://schemas.microsoft.com/office/word/2010/wordprocessingShape" xmlns:o="urn:schemas-microsoft-com:office:office" xmlns:v="urn:schemas-microsoft-com:vml" xmlns:w10="urn:schemas-microsoft-com:office:word" xmlns:w="http://schemas.openxmlformats.org/wordprocessingml/2006/main" xmlns:w14="http://schemas.microsoft.com/office/word/2010/wordml" xmlns:w15="http://schemas.microsoft.com/office/word/2012/wordml" xmlns:w16cex="http://schemas.microsoft.com/office/word/2018/wordml/cex" xmlns:w16cid="http://schemas.microsoft.com/office/word/2016/wordml/cid" xmlns:w16="http://schemas.microsoft.com/office/word/2018/wordml" xmlns:w16sdtdh="http://schemas.microsoft.com/office/word/2020/wordml/sdtdatahash" xmlns:w16sdtfl="http://schemas.microsoft.com/office/word/2024/wordml/sdtformatlock" xmlns:w16se="http://schemas.microsoft.com/office/word/2015/wordml/symex" xmlns:w16du="http://schemas.microsoft.com/office/word/2023/wordml/word16du" xmlns:wne="http://schemas.microsoft.com/office/word/2006/wordml" mc:Ignorable="w14 w15 w16se w16cid w16 w16cex w16sdtdh w16sdtfl w16du wp14">
+<w:numbering xmlns:wpc="http://schemas.microsoft.com/office/word/2010/wordprocessingCanvas" xmlns:cx="http://schemas.microsoft.com/office/drawing/2014/chartex" xmlns:mc="http://schemas.openxmlformats.org/markup-compatibility/2006" xmlns:o="urn:schemas-microsoft-com:office:office" xmlns:r="http://schemas.openxmlformats.org/officeDocument/2006/relationships" xmlns:m="http://schemas.openxmlformats.org/officeDocument/2006/math" xmlns:v="urn:schemas-microsoft-com:vml" xmlns:wp14="http://schemas.microsoft.com/office/word/2010/wordprocessingDrawing" xmlns:wp="http://schemas.openxmlformats.org/drawingml/2006/wordprocessingDrawing" xmlns:w10="urn:schemas-microsoft-com:office:word" xmlns:w="http://schemas.openxmlformats.org/wordprocessingml/2006/main" xmlns:w14="http://schemas.microsoft.com/office/word/2010/wordml" xmlns:w15="http://schemas.microsoft.com/office/word/2012/wordml" xmlns:w16se="http://schemas.microsoft.com/office/word/2015/wordml/symex" xmlns:wpg="http://schemas.microsoft.com/office/word/2010/wordprocessingGroup" xmlns:wpi="http://schemas.microsoft.com/office/word/2010/wordprocessingInk" xmlns:wne="http://schemas.microsoft.com/office/word/2006/wordml" xmlns:wps="http://schemas.microsoft.com/office/word/2010/wordprocessingShape" mc:Ignorable="w14 w15 w16se wp14">
   <w:numPicBullet w:numPicBulletId="0">
     <w:pict>
-      <v:shapetype w14:anchorId="2EEC8DD8" id="_x0000_t75" coordsize="21600,21600" o:spt="75" o:preferrelative="t" path="m@4@5l@4@11@9@11@9@5xe" filled="f" stroked="f">
+      <v:shapetype id="_x0000_t75" coordsize="21600,21600" o:spt="75" o:preferrelative="t" path="m@4@5l@4@11@9@11@9@5xe" filled="f" stroked="f">
         <v:stroke joinstyle="miter"/>
         <v:formulas>
           <v:f eqn="if lineDrawn pixelLineWidth 0"/>
@@ -5648,7 +3996,7 @@
         <v:path o:extrusionok="f" gradientshapeok="t" o:connecttype="rect"/>
         <o:lock v:ext="edit" aspectratio="t"/>
       </v:shapetype>
-      <v:shape id="_x0000_i1025" type="#_x0000_t75" style="width:467.35pt;height:467.35pt" o:bullet="t">
+      <v:shape id="_x0000_i1057" type="#_x0000_t75" style="width:467.25pt;height:467.25pt" o:bullet="t">
         <v:imagedata r:id="rId1" o:title="749433142_18137243233552522_3169494085000426316_n"/>
       </v:shape>
     </w:pict>
@@ -6419,35 +4767,35 @@
       </w:rPr>
     </w:lvl>
   </w:abstractNum>
-  <w:num w:numId="1" w16cid:durableId="701436825">
+  <w:num w:numId="1">
     <w:abstractNumId w:val="4"/>
     <w:lvlOverride w:ilvl="0">
       <w:startOverride w:val="1"/>
     </w:lvlOverride>
   </w:num>
-  <w:num w:numId="2" w16cid:durableId="24062967">
+  <w:num w:numId="2">
     <w:abstractNumId w:val="0"/>
   </w:num>
-  <w:num w:numId="3" w16cid:durableId="1728339145">
+  <w:num w:numId="3">
     <w:abstractNumId w:val="6"/>
   </w:num>
-  <w:num w:numId="4" w16cid:durableId="5209513">
+  <w:num w:numId="4">
     <w:abstractNumId w:val="1"/>
   </w:num>
-  <w:num w:numId="5" w16cid:durableId="196283953">
+  <w:num w:numId="5">
     <w:abstractNumId w:val="2"/>
   </w:num>
-  <w:num w:numId="6" w16cid:durableId="1008093681">
+  <w:num w:numId="6">
     <w:abstractNumId w:val="5"/>
   </w:num>
-  <w:num w:numId="7" w16cid:durableId="319770303">
+  <w:num w:numId="7">
     <w:abstractNumId w:val="3"/>
   </w:num>
 </w:numbering>
 </file>
 
 <file path=word/styles.xml><?xml version="1.0" encoding="utf-8"?>
-<w:styles xmlns:mc="http://schemas.openxmlformats.org/markup-compatibility/2006" xmlns:r="http://schemas.openxmlformats.org/officeDocument/2006/relationships" xmlns:w="http://schemas.openxmlformats.org/wordprocessingml/2006/main" xmlns:w14="http://schemas.microsoft.com/office/word/2010/wordml" xmlns:w15="http://schemas.microsoft.com/office/word/2012/wordml" xmlns:w16cex="http://schemas.microsoft.com/office/word/2018/wordml/cex" xmlns:w16cid="http://schemas.microsoft.com/office/word/2016/wordml/cid" xmlns:w16="http://schemas.microsoft.com/office/word/2018/wordml" xmlns:w16sdtdh="http://schemas.microsoft.com/office/word/2020/wordml/sdtdatahash" xmlns:w16sdtfl="http://schemas.microsoft.com/office/word/2024/wordml/sdtformatlock" xmlns:w16se="http://schemas.microsoft.com/office/word/2015/wordml/symex" xmlns:w16du="http://schemas.microsoft.com/office/word/2023/wordml/word16du" mc:Ignorable="w14 w15 w16se w16cid w16 w16cex w16sdtdh w16sdtfl w16du">
+<w:styles xmlns:mc="http://schemas.openxmlformats.org/markup-compatibility/2006" xmlns:r="http://schemas.openxmlformats.org/officeDocument/2006/relationships" xmlns:w="http://schemas.openxmlformats.org/wordprocessingml/2006/main" xmlns:w14="http://schemas.microsoft.com/office/word/2010/wordml" xmlns:w15="http://schemas.microsoft.com/office/word/2012/wordml" xmlns:w16se="http://schemas.microsoft.com/office/word/2015/wordml/symex" mc:Ignorable="w14 w15 w16se">
   <w:docDefaults>
     <w:rPrDefault>
       <w:rPr>
@@ -6457,7 +4805,7 @@
     </w:rPrDefault>
     <w:pPrDefault/>
   </w:docDefaults>
-  <w:latentStyles w:defLockedState="0" w:defUIPriority="99" w:defSemiHidden="0" w:defUnhideWhenUsed="0" w:defQFormat="0" w:count="376">
+  <w:latentStyles w:defLockedState="0" w:defUIPriority="99" w:defSemiHidden="0" w:defUnhideWhenUsed="0" w:defQFormat="0" w:count="371">
     <w:lsdException w:name="Normal" w:uiPriority="0" w:qFormat="1"/>
     <w:lsdException w:name="heading 1" w:uiPriority="9" w:qFormat="1"/>
     <w:lsdException w:name="heading 2" w:semiHidden="1" w:uiPriority="9" w:unhideWhenUsed="1" w:qFormat="1"/>
@@ -6829,17 +5177,12 @@
     <w:lsdException w:name="List Table 5 Dark Accent 6" w:uiPriority="50"/>
     <w:lsdException w:name="List Table 6 Colorful Accent 6" w:uiPriority="51"/>
     <w:lsdException w:name="List Table 7 Colorful Accent 6" w:uiPriority="52"/>
-    <w:lsdException w:name="Mention" w:semiHidden="1" w:unhideWhenUsed="1"/>
-    <w:lsdException w:name="Smart Hyperlink" w:semiHidden="1" w:unhideWhenUsed="1"/>
-    <w:lsdException w:name="Hashtag" w:semiHidden="1" w:unhideWhenUsed="1"/>
-    <w:lsdException w:name="Unresolved Mention" w:semiHidden="1" w:unhideWhenUsed="1"/>
-    <w:lsdException w:name="Smart Link" w:semiHidden="1" w:unhideWhenUsed="1"/>
   </w:latentStyles>
-  <w:style w:type="paragraph" w:default="1" w:styleId="Normal">
+  <w:style w:type="paragraph" w:default="1" w:styleId="a">
     <w:name w:val="Normal"/>
     <w:qFormat/>
   </w:style>
-  <w:style w:type="paragraph" w:styleId="Balk1">
+  <w:style w:type="paragraph" w:styleId="1">
     <w:name w:val="heading 1"/>
     <w:qFormat/>
     <w:pPr>
@@ -6851,7 +5194,7 @@
       <w:szCs w:val="32"/>
     </w:rPr>
   </w:style>
-  <w:style w:type="paragraph" w:styleId="Balk2">
+  <w:style w:type="paragraph" w:styleId="2">
     <w:name w:val="heading 2"/>
     <w:qFormat/>
     <w:pPr>
@@ -6863,7 +5206,7 @@
       <w:szCs w:val="26"/>
     </w:rPr>
   </w:style>
-  <w:style w:type="paragraph" w:styleId="Balk3">
+  <w:style w:type="paragraph" w:styleId="3">
     <w:name w:val="heading 3"/>
     <w:qFormat/>
     <w:pPr>
@@ -6875,7 +5218,7 @@
       <w:szCs w:val="24"/>
     </w:rPr>
   </w:style>
-  <w:style w:type="paragraph" w:styleId="Balk4">
+  <w:style w:type="paragraph" w:styleId="4">
     <w:name w:val="heading 4"/>
     <w:qFormat/>
     <w:pPr>
@@ -6887,7 +5230,7 @@
       <w:color w:val="2E74B5"/>
     </w:rPr>
   </w:style>
-  <w:style w:type="paragraph" w:styleId="Balk5">
+  <w:style w:type="paragraph" w:styleId="5">
     <w:name w:val="heading 5"/>
     <w:qFormat/>
     <w:pPr>
@@ -6897,7 +5240,7 @@
       <w:color w:val="2E74B5"/>
     </w:rPr>
   </w:style>
-  <w:style w:type="paragraph" w:styleId="Balk6">
+  <w:style w:type="paragraph" w:styleId="6">
     <w:name w:val="heading 6"/>
     <w:qFormat/>
     <w:pPr>
@@ -6907,13 +5250,13 @@
       <w:color w:val="1F4D78"/>
     </w:rPr>
   </w:style>
-  <w:style w:type="character" w:default="1" w:styleId="VarsaylanParagrafYazTipi">
+  <w:style w:type="character" w:default="1" w:styleId="a0">
     <w:name w:val="Default Paragraph Font"/>
     <w:uiPriority w:val="1"/>
     <w:semiHidden/>
     <w:unhideWhenUsed/>
   </w:style>
-  <w:style w:type="table" w:default="1" w:styleId="NormalTablo">
+  <w:style w:type="table" w:default="1" w:styleId="a1">
     <w:name w:val="Normal Table"/>
     <w:uiPriority w:val="99"/>
     <w:semiHidden/>
@@ -6928,13 +5271,13 @@
       </w:tblCellMar>
     </w:tblPr>
   </w:style>
-  <w:style w:type="numbering" w:default="1" w:styleId="ListeYok">
+  <w:style w:type="numbering" w:default="1" w:styleId="a2">
     <w:name w:val="No List"/>
     <w:uiPriority w:val="99"/>
     <w:semiHidden/>
     <w:unhideWhenUsed/>
   </w:style>
-  <w:style w:type="paragraph" w:styleId="KonuBal">
+  <w:style w:type="paragraph" w:styleId="a3">
     <w:name w:val="Title"/>
     <w:qFormat/>
     <w:rPr>
@@ -6942,7 +5285,7 @@
       <w:szCs w:val="56"/>
     </w:rPr>
   </w:style>
-  <w:style w:type="paragraph" w:customStyle="1" w:styleId="1">
+  <w:style w:type="paragraph" w:customStyle="1" w:styleId="10">
     <w:name w:val="Строгий1"/>
     <w:qFormat/>
     <w:rPr>
@@ -6950,11 +5293,11 @@
       <w:bCs/>
     </w:rPr>
   </w:style>
-  <w:style w:type="paragraph" w:styleId="ListeParagraf">
+  <w:style w:type="paragraph" w:styleId="a4">
     <w:name w:val="List Paragraph"/>
     <w:qFormat/>
   </w:style>
-  <w:style w:type="character" w:styleId="Kpr">
+  <w:style w:type="character" w:styleId="a5">
     <w:name w:val="Hyperlink"/>
     <w:uiPriority w:val="99"/>
     <w:unhideWhenUsed/>
@@ -6963,7 +5306,7 @@
       <w:u w:val="single"/>
     </w:rPr>
   </w:style>
-  <w:style w:type="character" w:styleId="DipnotBavurusu">
+  <w:style w:type="character" w:styleId="a6">
     <w:name w:val="footnote reference"/>
     <w:uiPriority w:val="99"/>
     <w:semiHidden/>
@@ -6972,16 +5315,16 @@
       <w:vertAlign w:val="superscript"/>
     </w:rPr>
   </w:style>
-  <w:style w:type="paragraph" w:styleId="DipnotMetni">
+  <w:style w:type="paragraph" w:styleId="a7">
     <w:name w:val="footnote text"/>
-    <w:link w:val="DipnotMetniChar"/>
+    <w:link w:val="a8"/>
     <w:uiPriority w:val="99"/>
     <w:semiHidden/>
     <w:unhideWhenUsed/>
   </w:style>
-  <w:style w:type="character" w:customStyle="1" w:styleId="DipnotMetniChar">
-    <w:name w:val="Dipnot Metni Char"/>
-    <w:link w:val="DipnotMetni"/>
+  <w:style w:type="character" w:customStyle="1" w:styleId="a8">
+    <w:name w:val="Текст сноски Знак"/>
+    <w:link w:val="a7"/>
     <w:uiPriority w:val="99"/>
     <w:semiHidden/>
     <w:unhideWhenUsed/>
@@ -6990,7 +5333,7 @@
       <w:szCs w:val="20"/>
     </w:rPr>
   </w:style>
-  <w:style w:type="character" w:styleId="SonNotBavurusu">
+  <w:style w:type="character" w:styleId="a9">
     <w:name w:val="endnote reference"/>
     <w:uiPriority w:val="99"/>
     <w:semiHidden/>
@@ -6999,16 +5342,16 @@
       <w:vertAlign w:val="superscript"/>
     </w:rPr>
   </w:style>
-  <w:style w:type="paragraph" w:styleId="SonNotMetni">
+  <w:style w:type="paragraph" w:styleId="aa">
     <w:name w:val="endnote text"/>
-    <w:link w:val="SonNotMetniChar"/>
+    <w:link w:val="ab"/>
     <w:uiPriority w:val="99"/>
     <w:semiHidden/>
     <w:unhideWhenUsed/>
   </w:style>
-  <w:style w:type="character" w:customStyle="1" w:styleId="SonNotMetniChar">
-    <w:name w:val="Son Not Metni Char"/>
-    <w:link w:val="SonNotMetni"/>
+  <w:style w:type="character" w:customStyle="1" w:styleId="ab">
+    <w:name w:val="Текст концевой сноски Знак"/>
+    <w:link w:val="aa"/>
     <w:uiPriority w:val="99"/>
     <w:semiHidden/>
     <w:unhideWhenUsed/>
@@ -7017,10 +5360,10 @@
       <w:szCs w:val="20"/>
     </w:rPr>
   </w:style>
-  <w:style w:type="paragraph" w:styleId="stBilgi">
+  <w:style w:type="paragraph" w:styleId="ac">
     <w:name w:val="header"/>
-    <w:basedOn w:val="Normal"/>
-    <w:link w:val="stBilgiChar"/>
+    <w:basedOn w:val="a"/>
+    <w:link w:val="ad"/>
     <w:uiPriority w:val="99"/>
     <w:unhideWhenUsed/>
     <w:rsid w:val="008E6EBF"/>
@@ -7031,17 +5374,17 @@
       </w:tabs>
     </w:pPr>
   </w:style>
-  <w:style w:type="character" w:customStyle="1" w:styleId="stBilgiChar">
-    <w:name w:val="Üst Bilgi Char"/>
-    <w:basedOn w:val="VarsaylanParagrafYazTipi"/>
-    <w:link w:val="stBilgi"/>
+  <w:style w:type="character" w:customStyle="1" w:styleId="ad">
+    <w:name w:val="Верхний колонтитул Знак"/>
+    <w:basedOn w:val="a0"/>
+    <w:link w:val="ac"/>
     <w:uiPriority w:val="99"/>
     <w:rsid w:val="008E6EBF"/>
   </w:style>
-  <w:style w:type="paragraph" w:styleId="AltBilgi">
+  <w:style w:type="paragraph" w:styleId="ae">
     <w:name w:val="footer"/>
-    <w:basedOn w:val="Normal"/>
-    <w:link w:val="AltBilgiChar"/>
+    <w:basedOn w:val="a"/>
+    <w:link w:val="af"/>
     <w:uiPriority w:val="99"/>
     <w:unhideWhenUsed/>
     <w:rsid w:val="008E6EBF"/>
@@ -7052,16 +5395,16 @@
       </w:tabs>
     </w:pPr>
   </w:style>
-  <w:style w:type="character" w:customStyle="1" w:styleId="AltBilgiChar">
-    <w:name w:val="Alt Bilgi Char"/>
-    <w:basedOn w:val="VarsaylanParagrafYazTipi"/>
-    <w:link w:val="AltBilgi"/>
+  <w:style w:type="character" w:customStyle="1" w:styleId="af">
+    <w:name w:val="Нижний колонтитул Знак"/>
+    <w:basedOn w:val="a0"/>
+    <w:link w:val="ae"/>
     <w:uiPriority w:val="99"/>
     <w:rsid w:val="008E6EBF"/>
   </w:style>
-  <w:style w:type="table" w:styleId="TabloKlavuzu">
+  <w:style w:type="table" w:styleId="af0">
     <w:name w:val="Table Grid"/>
-    <w:basedOn w:val="NormalTablo"/>
+    <w:basedOn w:val="a1"/>
     <w:uiPriority w:val="39"/>
     <w:rsid w:val="008E6EBF"/>
     <w:tblPr>
@@ -7074,6 +5417,22 @@
         <w:insideV w:val="single" w:sz="4" w:space="0" w:color="auto"/>
       </w:tblBorders>
     </w:tblPr>
+  </w:style>
+  <w:style w:type="character" w:styleId="af1">
+    <w:name w:val="Emphasis"/>
+    <w:basedOn w:val="a0"/>
+    <w:uiPriority w:val="20"/>
+    <w:qFormat/>
+    <w:rsid w:val="0059656F"/>
+    <w:rPr>
+      <w:i/>
+      <w:iCs/>
+    </w:rPr>
+  </w:style>
+  <w:style w:type="character" w:customStyle="1" w:styleId="inqyif">
+    <w:name w:val="inqyif"/>
+    <w:basedOn w:val="a0"/>
+    <w:rsid w:val="0066761D"/>
   </w:style>
 </w:styles>
 </file>
@@ -7344,7 +5703,7 @@
 </file>
 
 <file path=customXml/itemProps1.xml><?xml version="1.0" encoding="utf-8"?>
-<ds:datastoreItem xmlns:ds="http://schemas.openxmlformats.org/officeDocument/2006/customXml" ds:itemID="{EDE0F2EE-EF0D-4DDC-8914-1987A2B7874B}">
+<ds:datastoreItem xmlns:ds="http://schemas.openxmlformats.org/officeDocument/2006/customXml" ds:itemID="{4FE1AADC-741D-4C13-BF2D-F546CDE2E88E}">
   <ds:schemaRefs>
     <ds:schemaRef ds:uri="http://schemas.openxmlformats.org/officeDocument/2006/bibliography"/>
   </ds:schemaRefs>

</xml_diff>